<commit_message>
Recentre le rapport sur ce qui est verifiable dans le projet
Retire les developpements sur le deploiement distribue (replication,
topologie, coherence), le decoupage interne de la lecture Cassandra, les
mecanismes internes de la JVM et les encodages internes de Parquet : ces
elements n'ont pas ete mis en oeuvre ni mesures dans le projet.

Reformule en francais courant le vocabulaire Cassandra des sections sur la
cle de partition et les anti-patterns ecartes.

Ajoute un exemple de document JSON produit par la requete de denormalisation,
avec ses totaux verifiables a la main.

Co-Authored-By: Claude Opus 5 <noreply@anthropic.com>
Claude-Session: https://claude.ai/code/session_01BdhnZ8AfEoSHq2Y7betErz
</commit_message>
<xml_diff>
--- a/rapport/rapport.docx
+++ b/rapport/rapport.docx
@@ -4522,7 +4522,7 @@
           <w:sz w:val="20"/>
           <w:szCs w:val="20"/>
         </w:rPr>
-        <w:t xml:space="preserve"> : même clé d'accès, même ordre de tri. La comparaison est instructive, car Cassandra écrira physiquement les lignes dans cet ordre, alors qu'Oracle doit encore remonter de l'index vers la table pour lire les colonnes qui ne s'y trouvent pas. Même besoin métier, deux mises en œuvre : l'une par une structure annexe, l'autre par l'organisation des données sur le disque.</w:t>
+        <w:t xml:space="preserve"> : même clé d'accès, même ordre de tri. La différence est qu'Oracle passe par une structure annexe, l'index, tandis que Cassandra rangera directement les lignes dans cet ordre sur le disque. Même besoin métier, deux mises en œuvre.</w:t>
       </w:r>
     </w:p>
     <w:p>
@@ -6262,6 +6262,567 @@
           <w:szCs w:val="20"/>
         </w:rPr>
         <w:t xml:space="preserve">, un document complet par ligne, et non un unique tableau JSON. La différence est pratique : le fichier se lit en flux sans être chargé en mémoire, il se découpe trivialement puisque l'unité est la ligne, et une interruption ne corrompt que la dernière ligne au lieu d'invalider tout le document. C'est aussi le format que Spark lit nativement en parallèle.</w:t>
+      </w:r>
+    </w:p>
+    <w:p>
+      <w:pPr>
+        <w:spacing w:after="100" w:line="264"/>
+        <w:jc w:val="both"/>
+      </w:pPr>
+      <w:r>
+        <w:rPr>
+          <w:rFonts w:ascii="Cambria" w:cs="Cambria" w:eastAsia="Cambria" w:hAnsi="Cambria"/>
+          <w:b w:val="false"/>
+          <w:bCs w:val="false"/>
+          <w:i w:val="false"/>
+          <w:iCs w:val="false"/>
+          <w:color w:val="000000"/>
+          <w:sz w:val="20"/>
+          <w:szCs w:val="20"/>
+        </w:rPr>
+        <w:t xml:space="preserve">Voici la structure d'un document produit. Les identifiants et les libellés ci-dessous sont des valeurs d'illustration, pas une ligne réelle du fichier :</w:t>
+      </w:r>
+    </w:p>
+    <w:p>
+      <w:pPr>
+        <w:keepNext/>
+        <w:keepLines/>
+        <w:shd w:fill="F4F5F7" w:val="clear"/>
+        <w:spacing w:after="0" w:before="60" w:line="230"/>
+        <w:ind w:left="170" w:right="100"/>
+      </w:pPr>
+      <w:r>
+        <w:rPr>
+          <w:rFonts w:ascii="Consolas" w:cs="Consolas" w:eastAsia="Consolas" w:hAnsi="Consolas"/>
+          <w:color w:val="1A1A1A"/>
+          <w:sz w:val="16"/>
+          <w:szCs w:val="16"/>
+        </w:rPr>
+        <w:t xml:space="preserve">{</w:t>
+      </w:r>
+    </w:p>
+    <w:p>
+      <w:pPr>
+        <w:keepNext/>
+        <w:keepLines/>
+        <w:shd w:fill="F4F5F7" w:val="clear"/>
+        <w:spacing w:after="0" w:before="0" w:line="230"/>
+        <w:ind w:left="170" w:right="100"/>
+      </w:pPr>
+      <w:r>
+        <w:rPr>
+          <w:rFonts w:ascii="Consolas" w:cs="Consolas" w:eastAsia="Consolas" w:hAnsi="Consolas"/>
+          <w:color w:val="1A1A1A"/>
+          <w:sz w:val="16"/>
+          <w:szCs w:val="16"/>
+        </w:rPr>
+        <w:t xml:space="preserve">  "order_id": 20114, "order_ref": "CMD-020114",</w:t>
+      </w:r>
+    </w:p>
+    <w:p>
+      <w:pPr>
+        <w:keepNext/>
+        <w:keepLines/>
+        <w:shd w:fill="F4F5F7" w:val="clear"/>
+        <w:spacing w:after="0" w:before="0" w:line="230"/>
+        <w:ind w:left="170" w:right="100"/>
+      </w:pPr>
+      <w:r>
+        <w:rPr>
+          <w:rFonts w:ascii="Consolas" w:cs="Consolas" w:eastAsia="Consolas" w:hAnsi="Consolas"/>
+          <w:color w:val="1A1A1A"/>
+          <w:sz w:val="16"/>
+          <w:szCs w:val="16"/>
+        </w:rPr>
+        <w:t xml:space="preserve">  "order_date": "2026-04-12T19:24:00", "order_year_month": "2026-04",</w:t>
+      </w:r>
+    </w:p>
+    <w:p>
+      <w:pPr>
+        <w:keepNext/>
+        <w:keepLines/>
+        <w:shd w:fill="F4F5F7" w:val="clear"/>
+        <w:spacing w:after="0" w:before="0" w:line="230"/>
+        <w:ind w:left="170" w:right="100"/>
+      </w:pPr>
+      <w:r>
+        <w:rPr>
+          <w:rFonts w:ascii="Consolas" w:cs="Consolas" w:eastAsia="Consolas" w:hAnsi="Consolas"/>
+          <w:color w:val="1A1A1A"/>
+          <w:sz w:val="16"/>
+          <w:szCs w:val="16"/>
+        </w:rPr>
+        <w:t xml:space="preserve">  "order_status": "DELIVERED",</w:t>
+      </w:r>
+    </w:p>
+    <w:p>
+      <w:pPr>
+        <w:keepNext/>
+        <w:keepLines/>
+        <w:shd w:fill="F4F5F7" w:val="clear"/>
+        <w:spacing w:after="0" w:before="0" w:line="230"/>
+        <w:ind w:left="170" w:right="100"/>
+      </w:pPr>
+      <w:r>
+        <w:rPr>
+          <w:rFonts w:ascii="Consolas" w:cs="Consolas" w:eastAsia="Consolas" w:hAnsi="Consolas"/>
+          <w:color w:val="1A1A1A"/>
+          <w:sz w:val="16"/>
+          <w:szCs w:val="16"/>
+        </w:rPr>
+        <w:t xml:space="preserve">  "payment_method": "CB", "payment_label": "Carte bancaire",</w:t>
+      </w:r>
+    </w:p>
+    <w:p>
+      <w:pPr>
+        <w:keepNext/>
+        <w:keepLines/>
+        <w:shd w:fill="F4F5F7" w:val="clear"/>
+        <w:spacing w:after="0" w:before="0" w:line="230"/>
+        <w:ind w:left="170" w:right="100"/>
+      </w:pPr>
+      <w:r>
+        <w:rPr>
+          <w:rFonts w:ascii="Consolas" w:cs="Consolas" w:eastAsia="Consolas" w:hAnsi="Consolas"/>
+          <w:color w:val="1A1A1A"/>
+          <w:sz w:val="16"/>
+          <w:szCs w:val="16"/>
+        </w:rPr>
+        <w:t xml:space="preserve">  "shipping_amount": 4.90,</w:t>
+      </w:r>
+    </w:p>
+    <w:p>
+      <w:pPr>
+        <w:keepNext/>
+        <w:keepLines/>
+        <w:shd w:fill="F4F5F7" w:val="clear"/>
+        <w:spacing w:after="0" w:before="0" w:line="230"/>
+        <w:ind w:left="170" w:right="100"/>
+      </w:pPr>
+      <w:r>
+        <w:rPr>
+          <w:rFonts w:ascii="Consolas" w:cs="Consolas" w:eastAsia="Consolas" w:hAnsi="Consolas"/>
+          <w:color w:val="1A1A1A"/>
+          <w:sz w:val="16"/>
+          <w:szCs w:val="16"/>
+        </w:rPr>
+        <w:t xml:space="preserve">  "customer": { "customer_id": 2087, "email": "...", "first_name": "...",</w:t>
+      </w:r>
+    </w:p>
+    <w:p>
+      <w:pPr>
+        <w:keepNext/>
+        <w:keepLines/>
+        <w:shd w:fill="F4F5F7" w:val="clear"/>
+        <w:spacing w:after="0" w:before="0" w:line="230"/>
+        <w:ind w:left="170" w:right="100"/>
+      </w:pPr>
+      <w:r>
+        <w:rPr>
+          <w:rFonts w:ascii="Consolas" w:cs="Consolas" w:eastAsia="Consolas" w:hAnsi="Consolas"/>
+          <w:color w:val="1A1A1A"/>
+          <w:sz w:val="16"/>
+          <w:szCs w:val="16"/>
+        </w:rPr>
+        <w:t xml:space="preserve">                "last_name": "...", "loyalty_tier": "SILVER",</w:t>
+      </w:r>
+    </w:p>
+    <w:p>
+      <w:pPr>
+        <w:keepNext/>
+        <w:keepLines/>
+        <w:shd w:fill="F4F5F7" w:val="clear"/>
+        <w:spacing w:after="0" w:before="0" w:line="230"/>
+        <w:ind w:left="170" w:right="100"/>
+      </w:pPr>
+      <w:r>
+        <w:rPr>
+          <w:rFonts w:ascii="Consolas" w:cs="Consolas" w:eastAsia="Consolas" w:hAnsi="Consolas"/>
+          <w:color w:val="1A1A1A"/>
+          <w:sz w:val="16"/>
+          <w:szCs w:val="16"/>
+        </w:rPr>
+        <w:t xml:space="preserve">                "signup_date": "2024-11-03" },</w:t>
+      </w:r>
+    </w:p>
+    <w:p>
+      <w:pPr>
+        <w:keepNext/>
+        <w:keepLines/>
+        <w:shd w:fill="F4F5F7" w:val="clear"/>
+        <w:spacing w:after="0" w:before="0" w:line="230"/>
+        <w:ind w:left="170" w:right="100"/>
+      </w:pPr>
+      <w:r>
+        <w:rPr>
+          <w:rFonts w:ascii="Consolas" w:cs="Consolas" w:eastAsia="Consolas" w:hAnsi="Consolas"/>
+          <w:color w:val="1A1A1A"/>
+          <w:sz w:val="16"/>
+          <w:szCs w:val="16"/>
+        </w:rPr>
+        <w:t xml:space="preserve">  "shipping_address": { "address_id": 4915, "city": "Lyon",</w:t>
+      </w:r>
+    </w:p>
+    <w:p>
+      <w:pPr>
+        <w:keepNext/>
+        <w:keepLines/>
+        <w:shd w:fill="F4F5F7" w:val="clear"/>
+        <w:spacing w:after="0" w:before="0" w:line="230"/>
+        <w:ind w:left="170" w:right="100"/>
+      </w:pPr>
+      <w:r>
+        <w:rPr>
+          <w:rFonts w:ascii="Consolas" w:cs="Consolas" w:eastAsia="Consolas" w:hAnsi="Consolas"/>
+          <w:color w:val="1A1A1A"/>
+          <w:sz w:val="16"/>
+          <w:szCs w:val="16"/>
+        </w:rPr>
+        <w:t xml:space="preserve">                        "postal_code": "69003", "country_code": "FR",</w:t>
+      </w:r>
+    </w:p>
+    <w:p>
+      <w:pPr>
+        <w:keepNext/>
+        <w:keepLines/>
+        <w:shd w:fill="F4F5F7" w:val="clear"/>
+        <w:spacing w:after="0" w:before="0" w:line="230"/>
+        <w:ind w:left="170" w:right="100"/>
+      </w:pPr>
+      <w:r>
+        <w:rPr>
+          <w:rFonts w:ascii="Consolas" w:cs="Consolas" w:eastAsia="Consolas" w:hAnsi="Consolas"/>
+          <w:color w:val="1A1A1A"/>
+          <w:sz w:val="16"/>
+          <w:szCs w:val="16"/>
+        </w:rPr>
+        <w:t xml:space="preserve">                        "country_name": "France", "region": "Europe" },</w:t>
+      </w:r>
+    </w:p>
+    <w:p>
+      <w:pPr>
+        <w:keepNext/>
+        <w:keepLines/>
+        <w:shd w:fill="F4F5F7" w:val="clear"/>
+        <w:spacing w:after="0" w:before="0" w:line="230"/>
+        <w:ind w:left="170" w:right="100"/>
+      </w:pPr>
+      <w:r>
+        <w:rPr>
+          <w:rFonts w:ascii="Consolas" w:cs="Consolas" w:eastAsia="Consolas" w:hAnsi="Consolas"/>
+          <w:color w:val="1A1A1A"/>
+          <w:sz w:val="16"/>
+          <w:szCs w:val="16"/>
+        </w:rPr>
+        <w:t xml:space="preserve">  "items": [</w:t>
+      </w:r>
+    </w:p>
+    <w:p>
+      <w:pPr>
+        <w:keepNext/>
+        <w:keepLines/>
+        <w:shd w:fill="F4F5F7" w:val="clear"/>
+        <w:spacing w:after="0" w:before="0" w:line="230"/>
+        <w:ind w:left="170" w:right="100"/>
+      </w:pPr>
+      <w:r>
+        <w:rPr>
+          <w:rFonts w:ascii="Consolas" w:cs="Consolas" w:eastAsia="Consolas" w:hAnsi="Consolas"/>
+          <w:color w:val="1A1A1A"/>
+          <w:sz w:val="16"/>
+          <w:szCs w:val="16"/>
+        </w:rPr>
+        <w:t xml:space="preserve">    { "line_no": 1, "product_id": 517, "sku": "SKU-000517",</w:t>
+      </w:r>
+    </w:p>
+    <w:p>
+      <w:pPr>
+        <w:keepNext/>
+        <w:keepLines/>
+        <w:shd w:fill="F4F5F7" w:val="clear"/>
+        <w:spacing w:after="0" w:before="0" w:line="230"/>
+        <w:ind w:left="170" w:right="100"/>
+      </w:pPr>
+      <w:r>
+        <w:rPr>
+          <w:rFonts w:ascii="Consolas" w:cs="Consolas" w:eastAsia="Consolas" w:hAnsi="Consolas"/>
+          <w:color w:val="1A1A1A"/>
+          <w:sz w:val="16"/>
+          <w:szCs w:val="16"/>
+        </w:rPr>
+        <w:t xml:space="preserve">      "product_name": "Casque bluetooth", "brand": "...",</w:t>
+      </w:r>
+    </w:p>
+    <w:p>
+      <w:pPr>
+        <w:keepNext/>
+        <w:keepLines/>
+        <w:shd w:fill="F4F5F7" w:val="clear"/>
+        <w:spacing w:after="0" w:before="0" w:line="230"/>
+        <w:ind w:left="170" w:right="100"/>
+      </w:pPr>
+      <w:r>
+        <w:rPr>
+          <w:rFonts w:ascii="Consolas" w:cs="Consolas" w:eastAsia="Consolas" w:hAnsi="Consolas"/>
+          <w:color w:val="1A1A1A"/>
+          <w:sz w:val="16"/>
+          <w:szCs w:val="16"/>
+        </w:rPr>
+        <w:t xml:space="preserve">      "category_id": 202, "category_name": "Casques audio",</w:t>
+      </w:r>
+    </w:p>
+    <w:p>
+      <w:pPr>
+        <w:keepNext/>
+        <w:keepLines/>
+        <w:shd w:fill="F4F5F7" w:val="clear"/>
+        <w:spacing w:after="0" w:before="0" w:line="230"/>
+        <w:ind w:left="170" w:right="100"/>
+      </w:pPr>
+      <w:r>
+        <w:rPr>
+          <w:rFonts w:ascii="Consolas" w:cs="Consolas" w:eastAsia="Consolas" w:hAnsi="Consolas"/>
+          <w:color w:val="1A1A1A"/>
+          <w:sz w:val="16"/>
+          <w:szCs w:val="16"/>
+        </w:rPr>
+        <w:t xml:space="preserve">      "parent_category_id": 2, "parent_category_name": "Image &amp; Son",</w:t>
+      </w:r>
+    </w:p>
+    <w:p>
+      <w:pPr>
+        <w:keepNext/>
+        <w:keepLines/>
+        <w:shd w:fill="F4F5F7" w:val="clear"/>
+        <w:spacing w:after="0" w:before="0" w:line="230"/>
+        <w:ind w:left="170" w:right="100"/>
+      </w:pPr>
+      <w:r>
+        <w:rPr>
+          <w:rFonts w:ascii="Consolas" w:cs="Consolas" w:eastAsia="Consolas" w:hAnsi="Consolas"/>
+          <w:color w:val="1A1A1A"/>
+          <w:sz w:val="16"/>
+          <w:szCs w:val="16"/>
+        </w:rPr>
+        <w:t xml:space="preserve">      "quantity": 1, "unit_price": 99.00, "discount_pct": 10,</w:t>
+      </w:r>
+    </w:p>
+    <w:p>
+      <w:pPr>
+        <w:keepNext/>
+        <w:keepLines/>
+        <w:shd w:fill="F4F5F7" w:val="clear"/>
+        <w:spacing w:after="0" w:before="0" w:line="230"/>
+        <w:ind w:left="170" w:right="100"/>
+      </w:pPr>
+      <w:r>
+        <w:rPr>
+          <w:rFonts w:ascii="Consolas" w:cs="Consolas" w:eastAsia="Consolas" w:hAnsi="Consolas"/>
+          <w:color w:val="1A1A1A"/>
+          <w:sz w:val="16"/>
+          <w:szCs w:val="16"/>
+        </w:rPr>
+        <w:t xml:space="preserve">      "line_amount": 89.10 },</w:t>
+      </w:r>
+    </w:p>
+    <w:p>
+      <w:pPr>
+        <w:keepNext/>
+        <w:keepLines/>
+        <w:shd w:fill="F4F5F7" w:val="clear"/>
+        <w:spacing w:after="0" w:before="0" w:line="230"/>
+        <w:ind w:left="170" w:right="100"/>
+      </w:pPr>
+      <w:r>
+        <w:rPr>
+          <w:rFonts w:ascii="Consolas" w:cs="Consolas" w:eastAsia="Consolas" w:hAnsi="Consolas"/>
+          <w:color w:val="1A1A1A"/>
+          <w:sz w:val="16"/>
+          <w:szCs w:val="16"/>
+        </w:rPr>
+        <w:t xml:space="preserve">    { "line_no": 2, "product_id": 133, "sku": "SKU-000133",</w:t>
+      </w:r>
+    </w:p>
+    <w:p>
+      <w:pPr>
+        <w:keepNext/>
+        <w:keepLines/>
+        <w:shd w:fill="F4F5F7" w:val="clear"/>
+        <w:spacing w:after="0" w:before="0" w:line="230"/>
+        <w:ind w:left="170" w:right="100"/>
+      </w:pPr>
+      <w:r>
+        <w:rPr>
+          <w:rFonts w:ascii="Consolas" w:cs="Consolas" w:eastAsia="Consolas" w:hAnsi="Consolas"/>
+          <w:color w:val="1A1A1A"/>
+          <w:sz w:val="16"/>
+          <w:szCs w:val="16"/>
+        </w:rPr>
+        <w:t xml:space="preserve">      "product_name": "Cle USB", "brand": "...",</w:t>
+      </w:r>
+    </w:p>
+    <w:p>
+      <w:pPr>
+        <w:keepNext/>
+        <w:keepLines/>
+        <w:shd w:fill="F4F5F7" w:val="clear"/>
+        <w:spacing w:after="0" w:before="0" w:line="230"/>
+        <w:ind w:left="170" w:right="100"/>
+      </w:pPr>
+      <w:r>
+        <w:rPr>
+          <w:rFonts w:ascii="Consolas" w:cs="Consolas" w:eastAsia="Consolas" w:hAnsi="Consolas"/>
+          <w:color w:val="1A1A1A"/>
+          <w:sz w:val="16"/>
+          <w:szCs w:val="16"/>
+        </w:rPr>
+        <w:t xml:space="preserve">      "category_id": 104, "category_name": "Stockage",</w:t>
+      </w:r>
+    </w:p>
+    <w:p>
+      <w:pPr>
+        <w:keepNext/>
+        <w:keepLines/>
+        <w:shd w:fill="F4F5F7" w:val="clear"/>
+        <w:spacing w:after="0" w:before="0" w:line="230"/>
+        <w:ind w:left="170" w:right="100"/>
+      </w:pPr>
+      <w:r>
+        <w:rPr>
+          <w:rFonts w:ascii="Consolas" w:cs="Consolas" w:eastAsia="Consolas" w:hAnsi="Consolas"/>
+          <w:color w:val="1A1A1A"/>
+          <w:sz w:val="16"/>
+          <w:szCs w:val="16"/>
+        </w:rPr>
+        <w:t xml:space="preserve">      "parent_category_id": 1, "parent_category_name": "Informatique",</w:t>
+      </w:r>
+    </w:p>
+    <w:p>
+      <w:pPr>
+        <w:keepNext/>
+        <w:keepLines/>
+        <w:shd w:fill="F4F5F7" w:val="clear"/>
+        <w:spacing w:after="0" w:before="0" w:line="230"/>
+        <w:ind w:left="170" w:right="100"/>
+      </w:pPr>
+      <w:r>
+        <w:rPr>
+          <w:rFonts w:ascii="Consolas" w:cs="Consolas" w:eastAsia="Consolas" w:hAnsi="Consolas"/>
+          <w:color w:val="1A1A1A"/>
+          <w:sz w:val="16"/>
+          <w:szCs w:val="16"/>
+        </w:rPr>
+        <w:t xml:space="preserve">      "quantity": 2, "unit_price": 24.50, "discount_pct": 0,</w:t>
+      </w:r>
+    </w:p>
+    <w:p>
+      <w:pPr>
+        <w:keepNext/>
+        <w:keepLines/>
+        <w:shd w:fill="F4F5F7" w:val="clear"/>
+        <w:spacing w:after="0" w:before="0" w:line="230"/>
+        <w:ind w:left="170" w:right="100"/>
+      </w:pPr>
+      <w:r>
+        <w:rPr>
+          <w:rFonts w:ascii="Consolas" w:cs="Consolas" w:eastAsia="Consolas" w:hAnsi="Consolas"/>
+          <w:color w:val="1A1A1A"/>
+          <w:sz w:val="16"/>
+          <w:szCs w:val="16"/>
+        </w:rPr>
+        <w:t xml:space="preserve">      "line_amount": 49.00 }</w:t>
+      </w:r>
+    </w:p>
+    <w:p>
+      <w:pPr>
+        <w:keepNext/>
+        <w:keepLines/>
+        <w:shd w:fill="F4F5F7" w:val="clear"/>
+        <w:spacing w:after="0" w:before="0" w:line="230"/>
+        <w:ind w:left="170" w:right="100"/>
+      </w:pPr>
+      <w:r>
+        <w:rPr>
+          <w:rFonts w:ascii="Consolas" w:cs="Consolas" w:eastAsia="Consolas" w:hAnsi="Consolas"/>
+          <w:color w:val="1A1A1A"/>
+          <w:sz w:val="16"/>
+          <w:szCs w:val="16"/>
+        </w:rPr>
+        <w:t xml:space="preserve">  ],</w:t>
+      </w:r>
+    </w:p>
+    <w:p>
+      <w:pPr>
+        <w:keepNext/>
+        <w:keepLines/>
+        <w:shd w:fill="F4F5F7" w:val="clear"/>
+        <w:spacing w:after="0" w:before="0" w:line="230"/>
+        <w:ind w:left="170" w:right="100"/>
+      </w:pPr>
+      <w:r>
+        <w:rPr>
+          <w:rFonts w:ascii="Consolas" w:cs="Consolas" w:eastAsia="Consolas" w:hAnsi="Consolas"/>
+          <w:color w:val="1A1A1A"/>
+          <w:sz w:val="16"/>
+          <w:szCs w:val="16"/>
+        </w:rPr>
+        <w:t xml:space="preserve">  "items_count": 2, "total_quantity": 3, "total_amount": 143.00</w:t>
+      </w:r>
+    </w:p>
+    <w:p>
+      <w:pPr>
+        <w:keepNext w:val="false"/>
+        <w:keepLines/>
+        <w:shd w:fill="F4F5F7" w:val="clear"/>
+        <w:spacing w:after="160" w:before="0" w:line="230"/>
+        <w:ind w:left="170" w:right="100"/>
+      </w:pPr>
+      <w:r>
+        <w:rPr>
+          <w:rFonts w:ascii="Consolas" w:cs="Consolas" w:eastAsia="Consolas" w:hAnsi="Consolas"/>
+          <w:color w:val="1A1A1A"/>
+          <w:sz w:val="16"/>
+          <w:szCs w:val="16"/>
+        </w:rPr>
+        <w:t xml:space="preserve">}</w:t>
+      </w:r>
+    </w:p>
+    <w:p>
+      <w:pPr>
+        <w:spacing w:after="100" w:line="264"/>
+        <w:jc w:val="both"/>
+      </w:pPr>
+      <w:r>
+        <w:rPr>
+          <w:rFonts w:ascii="Cambria" w:cs="Cambria" w:eastAsia="Cambria" w:hAnsi="Cambria"/>
+          <w:b w:val="false"/>
+          <w:bCs w:val="false"/>
+          <w:i w:val="false"/>
+          <w:iCs w:val="false"/>
+          <w:color w:val="000000"/>
+          <w:sz w:val="20"/>
+          <w:szCs w:val="20"/>
+        </w:rPr>
+        <w:t xml:space="preserve">Le total se vérifie à la main : 89,10 + 49,00 pour les articles, plus 4,90 de frais de port, soit 143,00 €.</w:t>
+      </w:r>
+    </w:p>
+    <w:p>
+      <w:pPr>
+        <w:spacing w:after="100" w:line="264"/>
+        <w:jc w:val="both"/>
+      </w:pPr>
+      <w:r>
+        <w:rPr>
+          <w:rFonts w:ascii="Cambria" w:cs="Cambria" w:eastAsia="Cambria" w:hAnsi="Cambria"/>
+          <w:b w:val="false"/>
+          <w:bCs w:val="false"/>
+          <w:i w:val="false"/>
+          <w:iCs w:val="false"/>
+          <w:color w:val="000000"/>
+          <w:sz w:val="20"/>
+          <w:szCs w:val="20"/>
+        </w:rPr>
+        <w:t xml:space="preserve">Tout ce dont Cassandra aura besoin pour répondre à ses quatre requêtes est là, dans un seul document : le client, l'adresse, les lignes avec leur produit, leur marque et leur catégorie, et les totaux déjà calculés. Aucune jointure ne sera nécessaire à la lecture.</w:t>
       </w:r>
     </w:p>
     <w:p>
@@ -7179,7 +7740,7 @@
           <w:sz w:val="20"/>
           <w:szCs w:val="20"/>
         </w:rPr>
-        <w:t xml:space="preserve"> en clé de partition pour trois raisons cumulées : sa cardinalité est forte (5 000 valeurs distinctes, donc une répartition uniforme sur l'anneau, sans point chaud) ; la taille de chaque partition est bornée en pratique, un très gros client dépassant rarement quelques centaines de commandes, loin des 100 Mo par partition au-delà desquels les performances se dégradent ; et surtout elle correspond à la question posée, qui connaît toujours le client dont elle veut l'historique.</w:t>
+        <w:t xml:space="preserve"> en clé de partition pour trois raisons cumulées : il prend 5 000 valeurs distinctes, donc les données se répartissent uniformément au lieu de s'entasser au même endroit ; la taille de chaque partition reste petite, un très gros client dépassant rarement quelques centaines de commandes ; et surtout elle correspond à la question posée, qui connaît toujours le client dont elle veut l'historique.</w:t>
       </w:r>
     </w:p>
     <w:p>
@@ -7869,7 +8430,7 @@
                 <w:sz w:val="19"/>
                 <w:szCs w:val="19"/>
               </w:rPr>
-              <w:t xml:space="preserve">toutes les commandes du jour tombent sur le même nœud, qui encaisse la totalité du trafic d'écriture. Point chaud caractérisé.</w:t>
+              <w:t xml:space="preserve">toutes les commandes d'une même journée se retrouvent au même endroit, qui encaisse seul les écritures du jour.</w:t>
             </w:r>
           </w:p>
         </w:tc>
@@ -7944,7 +8505,7 @@
                 <w:sz w:val="19"/>
                 <w:szCs w:val="19"/>
               </w:rPr>
-              <w:t xml:space="preserve">six valeurs distinctes, donc six partitions énormes et un anneau totalement déséquilibré.</w:t>
+              <w:t xml:space="preserve">six valeurs distinctes seulement, donc six partitions énormes et très déséquilibrées.</w:t>
             </w:r>
           </w:p>
         </w:tc>
@@ -8019,33 +8580,7 @@
                 <w:sz w:val="19"/>
                 <w:szCs w:val="19"/>
               </w:rPr>
-              <w:t xml:space="preserve">la requête devient un </w:t>
-            </w:r>
-            <w:r>
-              <w:rPr>
-                <w:rFonts w:ascii="Cambria" w:cs="Cambria" w:eastAsia="Cambria" w:hAnsi="Cambria"/>
-                <w:b w:val="false"/>
-                <w:bCs w:val="false"/>
-                <w:i/>
-                <w:iCs/>
-                <w:color w:val="000000"/>
-                <w:sz w:val="19"/>
-                <w:szCs w:val="19"/>
-              </w:rPr>
-              <w:t xml:space="preserve">scatter-gather</w:t>
-            </w:r>
-            <w:r>
-              <w:rPr>
-                <w:rFonts w:ascii="Cambria" w:cs="Cambria" w:eastAsia="Cambria" w:hAnsi="Cambria"/>
-                <w:b w:val="false"/>
-                <w:bCs w:val="false"/>
-                <w:i w:val="false"/>
-                <w:iCs w:val="false"/>
-                <w:color w:val="000000"/>
-                <w:sz w:val="19"/>
-                <w:szCs w:val="19"/>
-              </w:rPr>
-              <w:t xml:space="preserve"> interrogeant tous les nœuds. Un index secondaire Cassandra n'a pas le comportement d'un index SQL.</w:t>
+              <w:t xml:space="preserve">un index secondaire Cassandra n'a pas le comportement d'un index SQL : la lecture doit parcourir toute la table au lieu de viser une partition.</w:t>
             </w:r>
           </w:p>
         </w:tc>
@@ -8423,7 +8958,7 @@
           <w:sz w:val="20"/>
           <w:szCs w:val="20"/>
         </w:rPr>
-        <w:t xml:space="preserve"> C'est un réflexe venu du SQL, et un anti-pattern dès qu'un lot touche plusieurs partitions : le coordinateur doit attendre tous les nœuds concernés, et le lot devient plus lent que les écritures individuelles qu'il prétend remplacer. Un batch Cassandra garantit l'atomicité à l'intérieur d'une partition, ce n'est pas un outil de performance. J'utilise </w:t>
+        <w:t xml:space="preserve"> C'est un réflexe venu du SQL, et une mauvaise idée ici : un batch Cassandra sert à garantir l'atomicité à l'intérieur d'une partition, ce n'est pas un outil de performance, et il devient plus lent que les écritures individuelles dès qu'il touche plusieurs partitions. J'utilise </w:t>
       </w:r>
       <w:r>
         <w:rPr>
@@ -8449,7 +8984,7 @@
           <w:sz w:val="20"/>
           <w:szCs w:val="20"/>
         </w:rPr>
-        <w:t xml:space="preserve">, qui maintient soixante-quatre requêtes en vol.</w:t>
+        <w:t xml:space="preserve">, qui envoie soixante-quatre requêtes en parallèle.</w:t>
       </w:r>
     </w:p>
     <w:p>
@@ -9413,59 +9948,7 @@
           <w:sz w:val="20"/>
           <w:szCs w:val="20"/>
         </w:rPr>
-        <w:t xml:space="preserve">) plutôt qu'en jar déposé dans le dépôt : la version reste visible dans le code et le livrable reste léger. Le suffixe </w:t>
-      </w:r>
-      <w:r>
-        <w:rPr>
-          <w:rFonts w:ascii="Consolas" w:cs="Consolas" w:eastAsia="Consolas" w:hAnsi="Consolas"/>
-          <w:b w:val="false"/>
-          <w:bCs w:val="false"/>
-          <w:i w:val="false"/>
-          <w:iCs w:val="false"/>
-          <w:color w:val="000000"/>
-          <w:sz w:val="18"/>
-          <w:szCs w:val="18"/>
-        </w:rPr>
-        <w:t xml:space="preserve">_2.12</w:t>
-      </w:r>
-      <w:r>
-        <w:rPr>
-          <w:rFonts w:ascii="Cambria" w:cs="Cambria" w:eastAsia="Cambria" w:hAnsi="Cambria"/>
-          <w:b w:val="false"/>
-          <w:bCs w:val="false"/>
-          <w:i w:val="false"/>
-          <w:iCs w:val="false"/>
-          <w:color w:val="000000"/>
-          <w:sz w:val="20"/>
-          <w:szCs w:val="20"/>
-        </w:rPr>
-        <w:t xml:space="preserve"> est la version de Scala avec laquelle Spark 3.5 est compilé ; une version différente provoque des erreurs de méthode introuvable à l'exécution, difficiles à relier à leur cause. Le connecteur découpe la lecture suivant les </w:t>
-      </w:r>
-      <w:r>
-        <w:rPr>
-          <w:rFonts w:ascii="Cambria" w:cs="Cambria" w:eastAsia="Cambria" w:hAnsi="Cambria"/>
-          <w:b/>
-          <w:bCs/>
-          <w:i w:val="false"/>
-          <w:iCs w:val="false"/>
-          <w:color w:val="000000"/>
-          <w:sz w:val="20"/>
-          <w:szCs w:val="20"/>
-        </w:rPr>
-        <w:t xml:space="preserve">plages de jetons</w:t>
-      </w:r>
-      <w:r>
-        <w:rPr>
-          <w:rFonts w:ascii="Cambria" w:cs="Cambria" w:eastAsia="Cambria" w:hAnsi="Cambria"/>
-          <w:b w:val="false"/>
-          <w:bCs w:val="false"/>
-          <w:i w:val="false"/>
-          <w:iCs w:val="false"/>
-          <w:color w:val="000000"/>
-          <w:sz w:val="20"/>
-          <w:szCs w:val="20"/>
-        </w:rPr>
-        <w:t xml:space="preserve"> de l'anneau, chaque tâche Spark lisant un segment de l'espace des clés de partition ; sur un vrai cluster, chaque exécuteur lirait en priorité les données du nœud dont il est le plus proche.</w:t>
+        <w:t xml:space="preserve">) plutôt qu'en jar déposé dans le dépôt : la version reste visible dans le code et le livrable reste léger. Le connecteur découpe la lecture en plusieurs tâches qui se partagent les partitions de la table, ce qui permet à Spark de lire en parallèle plutôt que ligne à ligne.</w:t>
       </w:r>
     </w:p>
     <w:p>
@@ -10638,33 +11121,7 @@
           <w:sz w:val="20"/>
           <w:szCs w:val="20"/>
         </w:rPr>
-        <w:t xml:space="preserve"> : chaque fichier porte les valeurs minimale et maximale de ses colonnes, ce qui permet d'écarter un fichier entier sans l'ouvrir — le </w:t>
-      </w:r>
-      <w:r>
-        <w:rPr>
-          <w:rFonts w:ascii="Cambria" w:cs="Cambria" w:eastAsia="Cambria" w:hAnsi="Cambria"/>
-          <w:b w:val="false"/>
-          <w:bCs w:val="false"/>
-          <w:i/>
-          <w:iCs/>
-          <w:color w:val="000000"/>
-          <w:sz w:val="20"/>
-          <w:szCs w:val="20"/>
-        </w:rPr>
-        <w:t xml:space="preserve">predicate pushdown</w:t>
-      </w:r>
-      <w:r>
-        <w:rPr>
-          <w:rFonts w:ascii="Cambria" w:cs="Cambria" w:eastAsia="Cambria" w:hAnsi="Cambria"/>
-          <w:b w:val="false"/>
-          <w:bCs w:val="false"/>
-          <w:i w:val="false"/>
-          <w:iCs w:val="false"/>
-          <w:color w:val="000000"/>
-          <w:sz w:val="20"/>
-          <w:szCs w:val="20"/>
-        </w:rPr>
-        <w:t xml:space="preserve">.</w:t>
+        <w:t xml:space="preserve"> : chaque fichier porte les valeurs minimale et maximale de ses colonnes, ce qui permet d'écarter un fichier entier sans même l'ouvrir.</w:t>
       </w:r>
     </w:p>
     <w:p>
@@ -12747,7 +13204,7 @@
           <w:sz w:val="20"/>
           <w:szCs w:val="20"/>
         </w:rPr>
-        <w:t xml:space="preserve"> parce que sur un cluster mono-nœud une réplique ne peut être allouée nulle part et le cluster resterait indéfiniment en état </w:t>
+        <w:t xml:space="preserve"> parce que sur une installation à un seul nœud une réplique ne peut être placée nulle part, et l'index resterait indéfiniment en état </w:t>
       </w:r>
       <w:r>
         <w:rPr>
@@ -12773,7 +13230,7 @@
           <w:sz w:val="20"/>
           <w:szCs w:val="20"/>
         </w:rPr>
-        <w:t xml:space="preserve"> ; en production, ce serait au minimum 1.</w:t>
+        <w:t xml:space="preserve">.</w:t>
       </w:r>
     </w:p>
     <w:p>
@@ -15596,7 +16053,7 @@
           <w:sz w:val="20"/>
           <w:szCs w:val="20"/>
         </w:rPr>
-        <w:t xml:space="preserve"> Spark 3.5 est officiellement supporté sur Java 8, 11 et 17 ; j'ai vérifié que 21 fonctionne également. Au-delà, non : les JVM récentes verrouillent l'accès réflexif à leurs internes, dont Spark dépend pour sa sérialisation, et l'échec se manifeste par des </w:t>
+        <w:t xml:space="preserve"> Spark 3.5 est officiellement supporté sur Java 8, 11 et 17, et j'ai vérifié que 21 fonctionne également. Avec Java 25, que le Codespace fournit par défaut, Spark échoue sur des erreurs internes à la JVM dont le message ne renvoie pas à la cause. Le script de phase 3 détecte donc la version courante, cherche un JDK compatible et force </w:t>
       </w:r>
       <w:r>
         <w:rPr>
@@ -15609,32 +16066,6 @@
           <w:sz w:val="18"/>
           <w:szCs w:val="18"/>
         </w:rPr>
-        <w:t xml:space="preserve">InaccessibleObjectException</w:t>
-      </w:r>
-      <w:r>
-        <w:rPr>
-          <w:rFonts w:ascii="Cambria" w:cs="Cambria" w:eastAsia="Cambria" w:hAnsi="Cambria"/>
-          <w:b w:val="false"/>
-          <w:bCs w:val="false"/>
-          <w:i w:val="false"/>
-          <w:iCs w:val="false"/>
-          <w:color w:val="000000"/>
-          <w:sz w:val="20"/>
-          <w:szCs w:val="20"/>
-        </w:rPr>
-        <w:t xml:space="preserve"> illisibles, très loin de la cause réelle. Le Codespace fournissant Java 25 par défaut, le script de phase 3 détecte la version courante, cherche un JDK compatible et force </w:t>
-      </w:r>
-      <w:r>
-        <w:rPr>
-          <w:rFonts w:ascii="Consolas" w:cs="Consolas" w:eastAsia="Consolas" w:hAnsi="Consolas"/>
-          <w:b w:val="false"/>
-          <w:bCs w:val="false"/>
-          <w:i w:val="false"/>
-          <w:iCs w:val="false"/>
-          <w:color w:val="000000"/>
-          <w:sz w:val="18"/>
-          <w:szCs w:val="18"/>
-        </w:rPr>
         <w:t xml:space="preserve">JAVA_HOME</w:t>
       </w:r>
       <w:r>
@@ -15648,7 +16079,7 @@
           <w:sz w:val="20"/>
           <w:szCs w:val="20"/>
         </w:rPr>
-        <w:t xml:space="preserve"> si nécessaire ; s'il n'en trouve aucun, il s'arrête en affichant la commande d'installation plutôt que de laisser Spark échouer dans le vide.</w:t>
+        <w:t xml:space="preserve"> ; s'il n'en trouve aucun, il s'arrête en affichant la commande d'installation plutôt que de laisser Spark échouer dans le vide.</w:t>
       </w:r>
     </w:p>
     <w:p>
@@ -15706,7 +16137,7 @@
           <w:sz w:val="20"/>
           <w:szCs w:val="20"/>
         </w:rPr>
-        <w:t xml:space="preserve"> par répertoire. La lecture Cassandra créant une partition par plage de jetons, j'obtenais 143 fichiers pour 24 répertoires. Une redistribution sur les colonnes de partitionnement, juste avant l'écriture, ramène le résultat à un fichier par répertoire. Le gain ne se limite pas au nombre de fichiers : la table de faits est passée de 6,6 Mo à 4,9 Mo, soit </w:t>
+        <w:t xml:space="preserve"> par répertoire. Comme la lecture Cassandra est elle-même découpée en plusieurs morceaux, j'obtenais 143 fichiers pour 24 répertoires. Une redistribution sur les colonnes de partitionnement, juste avant l'écriture, ramène le résultat à un fichier par répertoire. Le gain ne se limite pas au nombre de fichiers : la table de faits est passée de 6,6 Mo à 4,9 Mo, soit </w:t>
       </w:r>
       <w:r>
         <w:rPr>
@@ -15732,7 +16163,7 @@
           <w:sz w:val="20"/>
           <w:szCs w:val="20"/>
         </w:rPr>
-        <w:t xml:space="preserve">, parce que les encodages de Parquet opèrent par bloc de colonne. Beaucoup de petits fichiers, c'est autant d'en-têtes dupliqués et de dictionnaires trop courts pour amortir leur propre coût.</w:t>
+        <w:t xml:space="preserve">, la compression de Parquet étant d'autant plus efficace que les fichiers sont gros.</w:t>
       </w:r>
     </w:p>
     <w:p>
@@ -16017,182 +16448,20 @@
           <w:sz w:val="20"/>
           <w:szCs w:val="20"/>
         </w:rPr>
-        <w:t xml:space="preserve">Un seul nœud partout.</w:t>
-      </w:r>
-      <w:r>
-        <w:rPr>
-          <w:rFonts w:ascii="Cambria" w:cs="Cambria" w:eastAsia="Cambria" w:hAnsi="Cambria"/>
-          <w:b w:val="false"/>
-          <w:bCs w:val="false"/>
-          <w:i w:val="false"/>
-          <w:iCs w:val="false"/>
-          <w:color w:val="000000"/>
-          <w:sz w:val="20"/>
-          <w:szCs w:val="20"/>
-        </w:rPr>
-        <w:t xml:space="preserve"> Cassandra tourne en </w:t>
-      </w:r>
-      <w:r>
-        <w:rPr>
-          <w:rFonts w:ascii="Consolas" w:cs="Consolas" w:eastAsia="Consolas" w:hAnsi="Consolas"/>
-          <w:b w:val="false"/>
-          <w:bCs w:val="false"/>
-          <w:i w:val="false"/>
-          <w:iCs w:val="false"/>
-          <w:color w:val="000000"/>
-          <w:sz w:val="18"/>
-          <w:szCs w:val="18"/>
-        </w:rPr>
-        <w:t xml:space="preserve">SimpleStrategy</w:t>
-      </w:r>
-      <w:r>
-        <w:rPr>
-          <w:rFonts w:ascii="Cambria" w:cs="Cambria" w:eastAsia="Cambria" w:hAnsi="Cambria"/>
-          <w:b w:val="false"/>
-          <w:bCs w:val="false"/>
-          <w:i w:val="false"/>
-          <w:iCs w:val="false"/>
-          <w:color w:val="000000"/>
-          <w:sz w:val="20"/>
-          <w:szCs w:val="20"/>
-        </w:rPr>
-        <w:t xml:space="preserve"> avec un facteur de réplication de 1, et Elasticsearch sans réplique. Ce sont des configurations de démonstration : sur un seul nœud il n'y a rien à répliquer, et toute autre valeur produirait un keyspace incapable de satisfaire ses propres exigences de cohérence. En production, on écrirait </w:t>
-      </w:r>
-      <w:r>
-        <w:rPr>
-          <w:rFonts w:ascii="Consolas" w:cs="Consolas" w:eastAsia="Consolas" w:hAnsi="Consolas"/>
-          <w:b w:val="false"/>
-          <w:bCs w:val="false"/>
-          <w:i w:val="false"/>
-          <w:iCs w:val="false"/>
-          <w:color w:val="000000"/>
-          <w:sz w:val="18"/>
-          <w:szCs w:val="18"/>
-        </w:rPr>
-        <w:t xml:space="preserve">NetworkTopologyStrategy</w:t>
-      </w:r>
-      <w:r>
-        <w:rPr>
-          <w:rFonts w:ascii="Cambria" w:cs="Cambria" w:eastAsia="Cambria" w:hAnsi="Cambria"/>
-          <w:b w:val="false"/>
-          <w:bCs w:val="false"/>
-          <w:i w:val="false"/>
-          <w:iCs w:val="false"/>
-          <w:color w:val="000000"/>
-          <w:sz w:val="20"/>
-          <w:szCs w:val="20"/>
-        </w:rPr>
-        <w:t xml:space="preserve"> avec RF = 3 par centre de données, et des lectures comme des écritures en </w:t>
-      </w:r>
-      <w:r>
-        <w:rPr>
-          <w:rFonts w:ascii="Consolas" w:cs="Consolas" w:eastAsia="Consolas" w:hAnsi="Consolas"/>
-          <w:b w:val="false"/>
-          <w:bCs w:val="false"/>
-          <w:i w:val="false"/>
-          <w:iCs w:val="false"/>
-          <w:color w:val="000000"/>
-          <w:sz w:val="18"/>
-          <w:szCs w:val="18"/>
-        </w:rPr>
-        <w:t xml:space="preserve">LOCAL_QUORUM</w:t>
-      </w:r>
-      <w:r>
-        <w:rPr>
-          <w:rFonts w:ascii="Cambria" w:cs="Cambria" w:eastAsia="Cambria" w:hAnsi="Cambria"/>
-          <w:b w:val="false"/>
-          <w:bCs w:val="false"/>
-          <w:i w:val="false"/>
-          <w:iCs w:val="false"/>
-          <w:color w:val="000000"/>
-          <w:sz w:val="20"/>
-          <w:szCs w:val="20"/>
-        </w:rPr>
-        <w:t xml:space="preserve"> : avec RF = 3, QUORUM vaut 2, et la règle </w:t>
-      </w:r>
-      <w:r>
-        <w:rPr>
-          <w:rFonts w:ascii="Cambria" w:cs="Cambria" w:eastAsia="Cambria" w:hAnsi="Cambria"/>
-          <w:b/>
-          <w:bCs/>
-          <w:i w:val="false"/>
-          <w:iCs w:val="false"/>
-          <w:color w:val="000000"/>
-          <w:sz w:val="20"/>
-          <w:szCs w:val="20"/>
-        </w:rPr>
-        <w:t xml:space="preserve">R + W &gt; RF</w:t>
-      </w:r>
-      <w:r>
-        <w:rPr>
-          <w:rFonts w:ascii="Cambria" w:cs="Cambria" w:eastAsia="Cambria" w:hAnsi="Cambria"/>
-          <w:b w:val="false"/>
-          <w:bCs w:val="false"/>
-          <w:i w:val="false"/>
-          <w:iCs w:val="false"/>
-          <w:color w:val="000000"/>
-          <w:sz w:val="20"/>
-          <w:szCs w:val="20"/>
-        </w:rPr>
-        <w:t xml:space="preserve"> (2 + 2 &gt; 3) garantit qu'une lecture voit toujours la dernière écriture tout en tolérant la perte d'un nœud. Le snitch </w:t>
-      </w:r>
-      <w:r>
-        <w:rPr>
-          <w:rFonts w:ascii="Consolas" w:cs="Consolas" w:eastAsia="Consolas" w:hAnsi="Consolas"/>
-          <w:b w:val="false"/>
-          <w:bCs w:val="false"/>
-          <w:i w:val="false"/>
-          <w:iCs w:val="false"/>
-          <w:color w:val="000000"/>
-          <w:sz w:val="18"/>
-          <w:szCs w:val="18"/>
-        </w:rPr>
-        <w:t xml:space="preserve">GossipingPropertyFileSnitch</w:t>
-      </w:r>
-      <w:r>
-        <w:rPr>
-          <w:rFonts w:ascii="Cambria" w:cs="Cambria" w:eastAsia="Cambria" w:hAnsi="Cambria"/>
-          <w:b w:val="false"/>
-          <w:bCs w:val="false"/>
-          <w:i w:val="false"/>
-          <w:iCs w:val="false"/>
-          <w:color w:val="000000"/>
-          <w:sz w:val="20"/>
-          <w:szCs w:val="20"/>
-        </w:rPr>
-        <w:t xml:space="preserve">, déjà configuré, rendrait ce passage possible sans reconfiguration.</w:t>
-      </w:r>
-    </w:p>
-    <w:p>
-      <w:pPr>
-        <w:spacing w:after="100" w:line="264"/>
-        <w:jc w:val="both"/>
-      </w:pPr>
-      <w:r>
-        <w:rPr>
-          <w:rFonts w:ascii="Cambria" w:cs="Cambria" w:eastAsia="Cambria" w:hAnsi="Cambria"/>
-          <w:b/>
-          <w:bCs/>
-          <w:i w:val="false"/>
-          <w:iCs w:val="false"/>
-          <w:color w:val="000000"/>
-          <w:sz w:val="20"/>
-          <w:szCs w:val="20"/>
-        </w:rPr>
-        <w:t xml:space="preserve">Aucun parallélisme réel n'est démontré.</w:t>
-      </w:r>
-      <w:r>
-        <w:rPr>
-          <w:rFonts w:ascii="Cambria" w:cs="Cambria" w:eastAsia="Cambria" w:hAnsi="Cambria"/>
-          <w:b w:val="false"/>
-          <w:bCs w:val="false"/>
-          <w:i w:val="false"/>
-          <w:iCs w:val="false"/>
-          <w:color w:val="000000"/>
-          <w:sz w:val="20"/>
-          <w:szCs w:val="20"/>
-        </w:rPr>
-        <w:t xml:space="preserve"> Spark tourne en local. Le code serait identique sur un cluster, mais je n'ai pas mesuré son comportement à l'échelle et je me garde d'affirmer des performances que je n'ai pas observées.</w:t>
+        <w:t xml:space="preserve">Tout tourne sur une seule machine.</w:t>
+      </w:r>
+      <w:r>
+        <w:rPr>
+          <w:rFonts w:ascii="Cambria" w:cs="Cambria" w:eastAsia="Cambria" w:hAnsi="Cambria"/>
+          <w:b w:val="false"/>
+          <w:bCs w:val="false"/>
+          <w:i w:val="false"/>
+          <w:iCs w:val="false"/>
+          <w:color w:val="000000"/>
+          <w:sz w:val="20"/>
+          <w:szCs w:val="20"/>
+        </w:rPr>
+        <w:t xml:space="preserve"> Cassandra est configuré avec un facteur de réplication de 1 et Elasticsearch sans réplique : sur un nœud unique, il n'y a rien à répliquer. Spark s'exécute en local. Le déploiement distribué n'a pas été testé, et je me garde donc d'affirmer des performances à l'échelle que je n'ai pas observées. Les valeurs de réplication seraient à revoir sur une installation réelle, mais c'est un travail que ce projet n'a pas fait.</w:t>
       </w:r>
     </w:p>
     <w:p>

</xml_diff>

<commit_message>
Ajoute la fiche de defense orale et allege le style du rapport
Fiche de preparation (hors livrable) : 40 questions probables avec leur
reponse, le fichier ou la montrer dans le projet et le chiffre a citer. Elle
sert de filtre : une question sans reponse signale un passage du rapport a
simplifier ou retirer.

Rapport : reformulation en registre courant des passages les plus tournes,
notamment la conclusion, le compromis de duplication Cassandra, le choix de
marquer les lignes plutot que les supprimer et l'execution locale de Spark.

Co-Authored-By: Claude Opus 5 <noreply@anthropic.com>
Claude-Session: https://claude.ai/code/session_01BdhnZ8AfEoSHq2Y7betErz
</commit_message>
<xml_diff>
--- a/rapport/rapport.docx
+++ b/rapport/rapport.docx
@@ -459,7 +459,7 @@
           <w:sz w:val="20"/>
           <w:szCs w:val="20"/>
         </w:rPr>
-        <w:t xml:space="preserve">L'intérêt de cet enchaînement n'est pas d'empiler quatre technologies, mais de faire traverser aux mêmes données quatre modèles de stockage aux objectifs contradictoires : Oracle optimise la cohérence en écriture, Cassandra la lecture ciblée à grande échelle, Parquet l'analyse transverse, Elasticsearch l'exploration libre. Passer de l'un à l'autre suppose à chaque fois d'abandonner quelque chose, et c'est ce que ce rapport s'attache à expliciter.</w:t>
+        <w:t xml:space="preserve">L'enchaînement ne consiste pas seulement à empiler quatre technologies. Les mêmes données traversent quatre modèles de stockage qui n'ont pas le même but : Oracle sert la cohérence en écriture, Cassandra la lecture ciblée, Parquet l'analyse sur l'ensemble des données, Elasticsearch la recherche libre. À chaque passage on gagne quelque chose et on en perd une autre, et c'est ce que j'explique dans ce rapport.</w:t>
       </w:r>
     </w:p>
     <w:p>
@@ -4142,7 +4142,7 @@
           <w:sz w:val="20"/>
           <w:szCs w:val="20"/>
         </w:rPr>
-        <w:t xml:space="preserve"> Il se déduit des lignes. Le stocker introduirait une redondance calculable et donc un risque d'incohérence : il suffirait qu'une ligne soit corrigée sans recalcul du total pour que la base se contredise elle-même. Ce total sera calculé </w:t>
+        <w:t xml:space="preserve"> Il se déduit des lignes. Le stocker introduirait une redondance calculable et donc un risque d'incohérence : il suffirait qu'une ligne soit corrigée sans recalcul du total pour que la base se contredise elle-même. Ce total est calculé </w:t>
       </w:r>
       <w:r>
         <w:rPr>
@@ -4168,7 +4168,7 @@
           <w:sz w:val="20"/>
           <w:szCs w:val="20"/>
         </w:rPr>
-        <w:t xml:space="preserve">, au moment de la dénormalisation vers Cassandra. C'est précisément là que se situe la différence de philosophie entre les deux modèles : le relationnel refuse de stocker ce qu'il peut recalculer, le NoSQL préfère payer une fois à l'écriture ce qu'il ne veut plus payer à chaque lecture.</w:t>
+        <w:t xml:space="preserve">, au moment de la dénormalisation vers Cassandra. C'est là que les deux modèles diffèrent : en relationnel on ne stocke pas ce qu'on peut recalculer, alors qu'en NoSQL on calcule une fois à l'écriture pour ne plus avoir à le faire à chaque lecture.</w:t>
       </w:r>
     </w:p>
     <w:p>
@@ -5738,7 +5738,7 @@
           <w:sz w:val="20"/>
           <w:szCs w:val="20"/>
         </w:rPr>
-        <w:t xml:space="preserve">Le nettoyage est placé </w:t>
+        <w:t xml:space="preserve">Le nettoyage est fait </w:t>
       </w:r>
       <w:r>
         <w:rPr>
@@ -5764,7 +5764,7 @@
           <w:sz w:val="20"/>
           <w:szCs w:val="20"/>
         </w:rPr>
-        <w:t xml:space="preserve"> l'extraction, délibérément : une donnée sale qui franchit la frontière JSON est recopiée dans Cassandra, puis dans Parquet, puis dans Elasticsearch, où plus rien ne permet de la rattacher à son origine.</w:t>
+        <w:t xml:space="preserve"> l'extraction, volontairement. Une donnée sale qui part dans le JSON se retrouve ensuite dans Cassandra, puis dans Parquet, puis dans Elasticsearch, et il devient très difficile de remonter à sa source.</w:t>
       </w:r>
     </w:p>
     <w:p>
@@ -7893,7 +7893,7 @@
           <w:sz w:val="20"/>
           <w:szCs w:val="20"/>
         </w:rPr>
-        <w:t xml:space="preserve"> n'est pas une option, puisqu'une lecture exige la clé de partition : chercher une commande par son seul identifiant dans une table partitionnée par client obligerait à balayer toutes les partitions. Le coût de cette seconde table est un doublement du volume et deux écritures au lieu d'une. C'est le compromis explicite du modèle : le stockage est bon marché, la lecture distribuée ne l'est pas.</w:t>
+        <w:t xml:space="preserve"> n'est pas une option, puisqu'une lecture exige la clé de partition : chercher une commande par son seul identifiant dans une table partitionnée par client obligerait à balayer toutes les partitions. Cette seconde table coûte un doublement du volume stocké et une écriture supplémentaire à chaque commande. C'est le compromis que le modèle assume : on accepte de stocker deux fois pour ne jamais avoir à chercher partout.</w:t>
       </w:r>
     </w:p>
     <w:p>
@@ -9877,7 +9877,7 @@
           <w:sz w:val="20"/>
           <w:szCs w:val="20"/>
         </w:rPr>
-        <w:t xml:space="preserve"> : le pilote et les exécuteurs vivent dans un seul processus JVM qui utilise tous les cœurs disponibles. Pour ce volume de données, l'exécution locale évite un coût de coordination réseau qui dépasserait le gain de parallélisme, et elle sert directement la contrainte mémoire puisqu'il n'y a aucun conteneur Spark à allumer en plus de Cassandra. Le point à retenir est que </w:t>
+        <w:t xml:space="preserve"> : Spark tourne dans un seul processus Java qui utilise tous les cœurs de la machine. Pour un volume de cette taille, faire tourner un cluster coûterait plus en coordination que ce qu'il ferait gagner. Cela sert aussi la contrainte mémoire, puisqu'il n'y a aucun conteneur Spark à allumer en plus de Cassandra. À noter : </w:t>
       </w:r>
       <w:r>
         <w:rPr>
@@ -9890,20 +9890,20 @@
           <w:sz w:val="20"/>
           <w:szCs w:val="20"/>
         </w:rPr>
-        <w:t xml:space="preserve">le code reste identique à celui d'un cluster</w:t>
-      </w:r>
-      <w:r>
-        <w:rPr>
-          <w:rFonts w:ascii="Cambria" w:cs="Cambria" w:eastAsia="Cambria" w:hAnsi="Cambria"/>
-          <w:b w:val="false"/>
-          <w:bCs w:val="false"/>
-          <w:i w:val="false"/>
-          <w:iCs w:val="false"/>
-          <w:color w:val="000000"/>
-          <w:sz w:val="20"/>
-          <w:szCs w:val="20"/>
-        </w:rPr>
-        <w:t xml:space="preserve"> : passer sur un cluster réel ne demanderait que de changer l'URL du maître, sans qu'aucune ligne de transformation ne bouge. C'est tout l'intérêt de l'abstraction DataFrame.</w:t>
+        <w:t xml:space="preserve">le code serait le même sur un cluster</w:t>
+      </w:r>
+      <w:r>
+        <w:rPr>
+          <w:rFonts w:ascii="Cambria" w:cs="Cambria" w:eastAsia="Cambria" w:hAnsi="Cambria"/>
+          <w:b w:val="false"/>
+          <w:bCs w:val="false"/>
+          <w:i w:val="false"/>
+          <w:iCs w:val="false"/>
+          <w:color w:val="000000"/>
+          <w:sz w:val="20"/>
+          <w:szCs w:val="20"/>
+        </w:rPr>
+        <w:t xml:space="preserve">, il faudrait seulement changer l'URL du maître, sans modifier une ligne de transformation.</w:t>
       </w:r>
     </w:p>
     <w:p>
@@ -10138,7 +10138,7 @@
           <w:sz w:val="20"/>
           <w:szCs w:val="20"/>
         </w:rPr>
-        <w:t xml:space="preserve"> à zéro. On peut ainsi analyser le taux d'annulation sans rien recharger. Le principe que j'ai suivi est de </w:t>
+        <w:t xml:space="preserve"> à zéro. On peut donc analyser le taux d'annulation sans rien recharger. J'ai préféré </w:t>
       </w:r>
       <w:r>
         <w:rPr>
@@ -10151,20 +10151,20 @@
           <w:sz w:val="20"/>
           <w:szCs w:val="20"/>
         </w:rPr>
-        <w:t xml:space="preserve">qualifier la donnée plutôt que de la filtrer</w:t>
-      </w:r>
-      <w:r>
-        <w:rPr>
-          <w:rFonts w:ascii="Cambria" w:cs="Cambria" w:eastAsia="Cambria" w:hAnsi="Cambria"/>
-          <w:b w:val="false"/>
-          <w:bCs w:val="false"/>
-          <w:i w:val="false"/>
-          <w:iCs w:val="false"/>
-          <w:color w:val="000000"/>
-          <w:sz w:val="20"/>
-          <w:szCs w:val="20"/>
-        </w:rPr>
-        <w:t xml:space="preserve"> : une donnée supprimée à l'étape trois n'est plus récupérable à l'étape quatre.</w:t>
+        <w:t xml:space="preserve">marquer les lignes plutôt que les supprimer</w:t>
+      </w:r>
+      <w:r>
+        <w:rPr>
+          <w:rFonts w:ascii="Cambria" w:cs="Cambria" w:eastAsia="Cambria" w:hAnsi="Cambria"/>
+          <w:b w:val="false"/>
+          <w:bCs w:val="false"/>
+          <w:i w:val="false"/>
+          <w:iCs w:val="false"/>
+          <w:color w:val="000000"/>
+          <w:sz w:val="20"/>
+          <w:szCs w:val="20"/>
+        </w:rPr>
+        <w:t xml:space="preserve">, parce qu'une donnée supprimée en phase 3 n'existe plus en phase 4.</w:t>
       </w:r>
     </w:p>
     <w:p>
@@ -14481,7 +14481,7 @@
           <w:sz w:val="20"/>
           <w:szCs w:val="20"/>
         </w:rPr>
-        <w:t xml:space="preserve"> est actif, de sorte que la fenêtre relative des vingt-cinq derniers mois est enregistrée avec le tableau de bord : un tableau de bord qui s'ouvre vide parce que la période par défaut est « les quinze dernières minutes » est l'accident classique d'une démonstration Kibana.</w:t>
+        <w:t xml:space="preserve"> est actif, ce qui enregistre la fenêtre des vingt-cinq derniers mois avec le tableau de bord. Sans cela, Kibana l'ouvre sur « les quinze dernières minutes » et tous les panneaux apparaissent vides.</w:t>
       </w:r>
     </w:p>
     <w:p>
@@ -16195,7 +16195,7 @@
           <w:sz w:val="20"/>
           <w:szCs w:val="20"/>
         </w:rPr>
-        <w:t xml:space="preserve"> C'est le test qui l'a trouvé, pas la lecture du code. Le regroupement incluait initialement le pays et le niveau de fidélité en plus de l'identifiant client ; il suffisait qu'un client ait commandé depuis deux pays pour apparaître en deux lignes, chacune segmentée sur une moitié de ses achats. Le total du chiffre d'affaires restait juste, ce qui rendait l'erreur invisible aux contrôles de volumétrie globaux. C'est l'argument le plus concret que je puisse donner en faveur de fonctions de transformation testables une par une.</w:t>
+        <w:t xml:space="preserve"> C'est le test qui l'a trouvé, pas la lecture du code. Le regroupement incluait initialement le pays et le niveau de fidélité en plus de l'identifiant client ; il suffisait qu'un client ait commandé depuis deux pays pour apparaître en deux lignes, chacune segmentée sur une moitié de ses achats. Le total du chiffre d'affaires restait juste, si bien que les contrôles de volumétrie ne voyaient rien. C'est pour ce genre d'erreur que les transformations sont écrites comme des fonctions testables une par une.</w:t>
       </w:r>
     </w:p>
     <w:p>
@@ -16616,7 +16616,7 @@
           <w:sz w:val="20"/>
           <w:szCs w:val="20"/>
         </w:rPr>
-        <w:t xml:space="preserve">Ce que je retiens surtout, c'est que la contrainte de mémoire, subie au départ, a été le meilleur outil de conception du projet. Elle interdisait d'avoir deux bases actives en même temps, ce qui m'a forcé à définir précisément ce qui passe d'une phase à l'autre : le fichier JSON a cessé d'être une formalité imposée par l'énoncé pour devenir un contrat d'interface entre deux systèmes qui ne se parlent jamais.</w:t>
+        <w:t xml:space="preserve">Ce que je retiens surtout, c'est que la contrainte des 16 Go m'a aidé à concevoir le projet. Comme je ne pouvais pas avoir deux bases allumées en même temps, j'ai dû définir précisément ce qui passe d'une phase à l'autre. Le fichier JSON n'est donc pas une formalité imposée par l'énoncé, c'est ce qui permet à Oracle et Cassandra de ne jamais se parler directement.</w:t>
       </w:r>
     </w:p>
     <w:p>
@@ -16635,7 +16635,7 @@
           <w:sz w:val="20"/>
           <w:szCs w:val="20"/>
         </w:rPr>
-        <w:t xml:space="preserve">Le second enseignement est qu'aucun des quatre modèles n'est meilleur que les autres. Chacun est un compromis explicite, et la valeur du travail réside moins dans le fait de les faire fonctionner que dans la capacité à dire ce que chaque passage fait gagner et ce qu'il fait perdre.</w:t>
+        <w:t xml:space="preserve">La seconde chose que je retiens, c'est qu'aucun des quatre modèles n'est meilleur que les autres. Chacun est adapté à un usage, et le vrai travail a été de comprendre ce que chaque passage fait gagner et ce qu'il fait perdre.</w:t>
       </w:r>
     </w:p>
     <w:p>

</xml_diff>

<commit_message>
Corrige le sommaire, les schemas et une contradiction du rapport
Le sommaire etait un champ Word qui s'affichait vide tant qu'il n'etait pas
actualise : il est desormais genere a partir des titres, chapitres et
sous-sections.

Les deux schemas utilisaient des caracteres semi-graphiques dont la largeur
depend de la police de repli, ce qui desalignait le rendu. Ils sont redessines
en ASCII et les lignes sont raccourcies.

Le tableau des sorties Parquet presentait les agregats comme la source des
graphiques du tableau de bord, ce que la section 6.2 contredit : ils servent de
point de comparaison, seuls la table de faits et la segmentation sont indexees.

Simplifie la formulation du type figé de la liste d'articles.

Co-Authored-By: Claude Opus 5 <noreply@anthropic.com>
Claude-Session: https://claude.ai/code/session_01BdhnZ8AfEoSHq2Y7betErz
</commit_message>
<xml_diff>
--- a/rapport/rapport.docx
+++ b/rapport/rapport.docx
@@ -205,25 +205,737 @@
         <w:t xml:space="preserve">Sommaire</w:t>
       </w:r>
     </w:p>
-    <w:sdt>
-      <w:sdtPr>
-        <w:alias w:val="Sommaire"/>
-      </w:sdtPr>
-      <w:sdtContent>
-        <w:p>
-          <w:r>
-            <w:fldChar w:fldCharType="begin" w:dirty="true"/>
-            <w:instrText xml:space="preserve">TOC \o "1-2"</w:instrText>
-            <w:fldChar w:fldCharType="separate"/>
-          </w:r>
-        </w:p>
-        <w:p>
-          <w:r>
-            <w:fldChar w:fldCharType="end"/>
-          </w:r>
-        </w:p>
-      </w:sdtContent>
-    </w:sdt>
+    <w:p>
+      <w:pPr>
+        <w:spacing w:after="40" w:before="160"/>
+      </w:pPr>
+      <w:r>
+        <w:rPr>
+          <w:rFonts w:ascii="Calibri" w:cs="Calibri" w:eastAsia="Calibri" w:hAnsi="Calibri"/>
+          <w:b/>
+          <w:bCs/>
+          <w:color w:val="1F3864"/>
+          <w:sz w:val="22"/>
+          <w:szCs w:val="22"/>
+        </w:rPr>
+        <w:t xml:space="preserve">1. Le sujet et le parti pris</w:t>
+      </w:r>
+    </w:p>
+    <w:p>
+      <w:pPr>
+        <w:spacing w:after="30"/>
+        <w:ind w:left="340"/>
+      </w:pPr>
+      <w:r>
+        <w:rPr>
+          <w:rFonts w:ascii="Calibri" w:cs="Calibri" w:eastAsia="Calibri" w:hAnsi="Calibri"/>
+          <w:color w:val="404040"/>
+          <w:sz w:val="20"/>
+          <w:szCs w:val="20"/>
+        </w:rPr>
+        <w:t xml:space="preserve">1.1 Ce qui était demandé</w:t>
+      </w:r>
+    </w:p>
+    <w:p>
+      <w:pPr>
+        <w:spacing w:after="30"/>
+        <w:ind w:left="340"/>
+      </w:pPr>
+      <w:r>
+        <w:rPr>
+          <w:rFonts w:ascii="Calibri" w:cs="Calibri" w:eastAsia="Calibri" w:hAnsi="Calibri"/>
+          <w:color w:val="404040"/>
+          <w:sz w:val="20"/>
+          <w:szCs w:val="20"/>
+        </w:rPr>
+        <w:t xml:space="preserve">1.2 Le thème retenu</w:t>
+      </w:r>
+    </w:p>
+    <w:p>
+      <w:pPr>
+        <w:spacing w:after="30"/>
+        <w:ind w:left="340"/>
+      </w:pPr>
+      <w:r>
+        <w:rPr>
+          <w:rFonts w:ascii="Calibri" w:cs="Calibri" w:eastAsia="Calibri" w:hAnsi="Calibri"/>
+          <w:color w:val="404040"/>
+          <w:sz w:val="20"/>
+          <w:szCs w:val="20"/>
+        </w:rPr>
+        <w:t xml:space="preserve">1.3 La contrainte d'exécution</w:t>
+      </w:r>
+    </w:p>
+    <w:p>
+      <w:pPr>
+        <w:spacing w:after="40" w:before="160"/>
+      </w:pPr>
+      <w:r>
+        <w:rPr>
+          <w:rFonts w:ascii="Calibri" w:cs="Calibri" w:eastAsia="Calibri" w:hAnsi="Calibri"/>
+          <w:b/>
+          <w:bCs/>
+          <w:color w:val="1F3864"/>
+          <w:sz w:val="22"/>
+          <w:szCs w:val="22"/>
+        </w:rPr>
+        <w:t xml:space="preserve">2. Architecture générale</w:t>
+      </w:r>
+    </w:p>
+    <w:p>
+      <w:pPr>
+        <w:spacing w:after="30"/>
+        <w:ind w:left="340"/>
+      </w:pPr>
+      <w:r>
+        <w:rPr>
+          <w:rFonts w:ascii="Calibri" w:cs="Calibri" w:eastAsia="Calibri" w:hAnsi="Calibri"/>
+          <w:color w:val="404040"/>
+          <w:sz w:val="20"/>
+          <w:szCs w:val="20"/>
+        </w:rPr>
+        <w:t xml:space="preserve">2.1 La chaîne</w:t>
+      </w:r>
+    </w:p>
+    <w:p>
+      <w:pPr>
+        <w:spacing w:after="30"/>
+        <w:ind w:left="340"/>
+      </w:pPr>
+      <w:r>
+        <w:rPr>
+          <w:rFonts w:ascii="Calibri" w:cs="Calibri" w:eastAsia="Calibri" w:hAnsi="Calibri"/>
+          <w:color w:val="404040"/>
+          <w:sz w:val="20"/>
+          <w:szCs w:val="20"/>
+        </w:rPr>
+        <w:t xml:space="preserve">2.2 Comment on passe d'une phase à la suivante</w:t>
+      </w:r>
+    </w:p>
+    <w:p>
+      <w:pPr>
+        <w:spacing w:after="30"/>
+        <w:ind w:left="340"/>
+      </w:pPr>
+      <w:r>
+        <w:rPr>
+          <w:rFonts w:ascii="Calibri" w:cs="Calibri" w:eastAsia="Calibri" w:hAnsi="Calibri"/>
+          <w:color w:val="404040"/>
+          <w:sz w:val="20"/>
+          <w:szCs w:val="20"/>
+        </w:rPr>
+        <w:t xml:space="preserve">2.3 Ce qui garantit réellement la séquentialité</w:t>
+      </w:r>
+    </w:p>
+    <w:p>
+      <w:pPr>
+        <w:spacing w:after="30"/>
+        <w:ind w:left="340"/>
+      </w:pPr>
+      <w:r>
+        <w:rPr>
+          <w:rFonts w:ascii="Calibri" w:cs="Calibri" w:eastAsia="Calibri" w:hAnsi="Calibri"/>
+          <w:color w:val="404040"/>
+          <w:sz w:val="20"/>
+          <w:szCs w:val="20"/>
+        </w:rPr>
+        <w:t xml:space="preserve">2.4 Budget mémoire</w:t>
+      </w:r>
+    </w:p>
+    <w:p>
+      <w:pPr>
+        <w:spacing w:after="30"/>
+        <w:ind w:left="340"/>
+      </w:pPr>
+      <w:r>
+        <w:rPr>
+          <w:rFonts w:ascii="Calibri" w:cs="Calibri" w:eastAsia="Calibri" w:hAnsi="Calibri"/>
+          <w:color w:val="404040"/>
+          <w:sz w:val="20"/>
+          <w:szCs w:val="20"/>
+        </w:rPr>
+        <w:t xml:space="preserve">2.5 Organisation du dépôt</w:t>
+      </w:r>
+    </w:p>
+    <w:p>
+      <w:pPr>
+        <w:spacing w:after="40" w:before="160"/>
+      </w:pPr>
+      <w:r>
+        <w:rPr>
+          <w:rFonts w:ascii="Calibri" w:cs="Calibri" w:eastAsia="Calibri" w:hAnsi="Calibri"/>
+          <w:b/>
+          <w:bCs/>
+          <w:color w:val="1F3864"/>
+          <w:sz w:val="22"/>
+          <w:szCs w:val="22"/>
+        </w:rPr>
+        <w:t xml:space="preserve">3. Phase 1 — la source relationnelle Oracle</w:t>
+      </w:r>
+    </w:p>
+    <w:p>
+      <w:pPr>
+        <w:spacing w:after="30"/>
+        <w:ind w:left="340"/>
+      </w:pPr>
+      <w:r>
+        <w:rPr>
+          <w:rFonts w:ascii="Calibri" w:cs="Calibri" w:eastAsia="Calibri" w:hAnsi="Calibri"/>
+          <w:color w:val="404040"/>
+          <w:sz w:val="20"/>
+          <w:szCs w:val="20"/>
+        </w:rPr>
+        <w:t xml:space="preserve">3.1 Le modèle</w:t>
+      </w:r>
+    </w:p>
+    <w:p>
+      <w:pPr>
+        <w:spacing w:after="30"/>
+        <w:ind w:left="340"/>
+      </w:pPr>
+      <w:r>
+        <w:rPr>
+          <w:rFonts w:ascii="Calibri" w:cs="Calibri" w:eastAsia="Calibri" w:hAnsi="Calibri"/>
+          <w:color w:val="404040"/>
+          <w:sz w:val="20"/>
+          <w:szCs w:val="20"/>
+        </w:rPr>
+        <w:t xml:space="preserve">3.2 La normalisation, forme par forme</w:t>
+      </w:r>
+    </w:p>
+    <w:p>
+      <w:pPr>
+        <w:spacing w:after="30"/>
+        <w:ind w:left="340"/>
+      </w:pPr>
+      <w:r>
+        <w:rPr>
+          <w:rFonts w:ascii="Calibri" w:cs="Calibri" w:eastAsia="Calibri" w:hAnsi="Calibri"/>
+          <w:color w:val="404040"/>
+          <w:sz w:val="20"/>
+          <w:szCs w:val="20"/>
+        </w:rPr>
+        <w:t xml:space="preserve">3.3 Trois choix qui méritent discussion</w:t>
+      </w:r>
+    </w:p>
+    <w:p>
+      <w:pPr>
+        <w:spacing w:after="30"/>
+        <w:ind w:left="340"/>
+      </w:pPr>
+      <w:r>
+        <w:rPr>
+          <w:rFonts w:ascii="Calibri" w:cs="Calibri" w:eastAsia="Calibri" w:hAnsi="Calibri"/>
+          <w:color w:val="404040"/>
+          <w:sz w:val="20"/>
+          <w:szCs w:val="20"/>
+        </w:rPr>
+        <w:t xml:space="preserve">3.4 Les index</w:t>
+      </w:r>
+    </w:p>
+    <w:p>
+      <w:pPr>
+        <w:spacing w:after="30"/>
+        <w:ind w:left="340"/>
+      </w:pPr>
+      <w:r>
+        <w:rPr>
+          <w:rFonts w:ascii="Calibri" w:cs="Calibri" w:eastAsia="Calibri" w:hAnsi="Calibri"/>
+          <w:color w:val="404040"/>
+          <w:sz w:val="20"/>
+          <w:szCs w:val="20"/>
+        </w:rPr>
+        <w:t xml:space="preserve">3.5 Le jeu de données : pourquoi le générer</w:t>
+      </w:r>
+    </w:p>
+    <w:p>
+      <w:pPr>
+        <w:spacing w:after="30"/>
+        <w:ind w:left="340"/>
+      </w:pPr>
+      <w:r>
+        <w:rPr>
+          <w:rFonts w:ascii="Calibri" w:cs="Calibri" w:eastAsia="Calibri" w:hAnsi="Calibri"/>
+          <w:color w:val="404040"/>
+          <w:sz w:val="20"/>
+          <w:szCs w:val="20"/>
+        </w:rPr>
+        <w:t xml:space="preserve">3.6 Le nettoyage et les contrôles</w:t>
+      </w:r>
+    </w:p>
+    <w:p>
+      <w:pPr>
+        <w:spacing w:after="30"/>
+        <w:ind w:left="340"/>
+      </w:pPr>
+      <w:r>
+        <w:rPr>
+          <w:rFonts w:ascii="Calibri" w:cs="Calibri" w:eastAsia="Calibri" w:hAnsi="Calibri"/>
+          <w:color w:val="404040"/>
+          <w:sz w:val="20"/>
+          <w:szCs w:val="20"/>
+        </w:rPr>
+        <w:t xml:space="preserve">3.7 La requête de dénormalisation</w:t>
+      </w:r>
+    </w:p>
+    <w:p>
+      <w:pPr>
+        <w:spacing w:after="40" w:before="160"/>
+      </w:pPr>
+      <w:r>
+        <w:rPr>
+          <w:rFonts w:ascii="Calibri" w:cs="Calibri" w:eastAsia="Calibri" w:hAnsi="Calibri"/>
+          <w:b/>
+          <w:bCs/>
+          <w:color w:val="1F3864"/>
+          <w:sz w:val="22"/>
+          <w:szCs w:val="22"/>
+        </w:rPr>
+        <w:t xml:space="preserve">4. Phase 2 — dénormalisation et modèle Cassandra</w:t>
+      </w:r>
+    </w:p>
+    <w:p>
+      <w:pPr>
+        <w:spacing w:after="30"/>
+        <w:ind w:left="340"/>
+      </w:pPr>
+      <w:r>
+        <w:rPr>
+          <w:rFonts w:ascii="Calibri" w:cs="Calibri" w:eastAsia="Calibri" w:hAnsi="Calibri"/>
+          <w:color w:val="404040"/>
+          <w:sz w:val="20"/>
+          <w:szCs w:val="20"/>
+        </w:rPr>
+        <w:t xml:space="preserve">4.1 Un renversement complet de méthode</w:t>
+      </w:r>
+    </w:p>
+    <w:p>
+      <w:pPr>
+        <w:spacing w:after="30"/>
+        <w:ind w:left="340"/>
+      </w:pPr>
+      <w:r>
+        <w:rPr>
+          <w:rFonts w:ascii="Calibri" w:cs="Calibri" w:eastAsia="Calibri" w:hAnsi="Calibri"/>
+          <w:color w:val="404040"/>
+          <w:sz w:val="20"/>
+          <w:szCs w:val="20"/>
+        </w:rPr>
+        <w:t xml:space="preserve">4.2 Le mécanisme de la clé primaire</w:t>
+      </w:r>
+    </w:p>
+    <w:p>
+      <w:pPr>
+        <w:spacing w:after="30"/>
+        <w:ind w:left="340"/>
+      </w:pPr>
+      <w:r>
+        <w:rPr>
+          <w:rFonts w:ascii="Calibri" w:cs="Calibri" w:eastAsia="Calibri" w:hAnsi="Calibri"/>
+          <w:color w:val="404040"/>
+          <w:sz w:val="20"/>
+          <w:szCs w:val="20"/>
+        </w:rPr>
+        <w:t xml:space="preserve">4.3 Les quatre tables</w:t>
+      </w:r>
+    </w:p>
+    <w:p>
+      <w:pPr>
+        <w:spacing w:after="30"/>
+        <w:ind w:left="340"/>
+      </w:pPr>
+      <w:r>
+        <w:rPr>
+          <w:rFonts w:ascii="Calibri" w:cs="Calibri" w:eastAsia="Calibri" w:hAnsi="Calibri"/>
+          <w:color w:val="404040"/>
+          <w:sz w:val="20"/>
+          <w:szCs w:val="20"/>
+        </w:rPr>
+        <w:t xml:space="preserve">4.4 Les anti-patterns écartés</w:t>
+      </w:r>
+    </w:p>
+    <w:p>
+      <w:pPr>
+        <w:spacing w:after="30"/>
+        <w:ind w:left="340"/>
+      </w:pPr>
+      <w:r>
+        <w:rPr>
+          <w:rFonts w:ascii="Calibri" w:cs="Calibri" w:eastAsia="Calibri" w:hAnsi="Calibri"/>
+          <w:color w:val="404040"/>
+          <w:sz w:val="20"/>
+          <w:szCs w:val="20"/>
+        </w:rPr>
+        <w:t xml:space="preserve">4.5 Le type utilisateur order_item</w:t>
+      </w:r>
+    </w:p>
+    <w:p>
+      <w:pPr>
+        <w:spacing w:after="30"/>
+        <w:ind w:left="340"/>
+      </w:pPr>
+      <w:r>
+        <w:rPr>
+          <w:rFonts w:ascii="Calibri" w:cs="Calibri" w:eastAsia="Calibri" w:hAnsi="Calibri"/>
+          <w:color w:val="404040"/>
+          <w:sz w:val="20"/>
+          <w:szCs w:val="20"/>
+        </w:rPr>
+        <w:t xml:space="preserve">4.6 Le chargement</w:t>
+      </w:r>
+    </w:p>
+    <w:p>
+      <w:pPr>
+        <w:spacing w:after="30"/>
+        <w:ind w:left="340"/>
+      </w:pPr>
+      <w:r>
+        <w:rPr>
+          <w:rFonts w:ascii="Calibri" w:cs="Calibri" w:eastAsia="Calibri" w:hAnsi="Calibri"/>
+          <w:color w:val="404040"/>
+          <w:sz w:val="20"/>
+          <w:szCs w:val="20"/>
+        </w:rPr>
+        <w:t xml:space="preserve">4.7 Ce que le modèle fait perdre</w:t>
+      </w:r>
+    </w:p>
+    <w:p>
+      <w:pPr>
+        <w:spacing w:after="40" w:before="160"/>
+      </w:pPr>
+      <w:r>
+        <w:rPr>
+          <w:rFonts w:ascii="Calibri" w:cs="Calibri" w:eastAsia="Calibri" w:hAnsi="Calibri"/>
+          <w:b/>
+          <w:bCs/>
+          <w:color w:val="1F3864"/>
+          <w:sz w:val="22"/>
+          <w:szCs w:val="22"/>
+        </w:rPr>
+        <w:t xml:space="preserve">5. Phase 3 — formatage Spark et Parquet</w:t>
+      </w:r>
+    </w:p>
+    <w:p>
+      <w:pPr>
+        <w:spacing w:after="30"/>
+        <w:ind w:left="340"/>
+      </w:pPr>
+      <w:r>
+        <w:rPr>
+          <w:rFonts w:ascii="Calibri" w:cs="Calibri" w:eastAsia="Calibri" w:hAnsi="Calibri"/>
+          <w:color w:val="404040"/>
+          <w:sz w:val="20"/>
+          <w:szCs w:val="20"/>
+        </w:rPr>
+        <w:t xml:space="preserve">5.1 Ce que cette phase apporte</w:t>
+      </w:r>
+    </w:p>
+    <w:p>
+      <w:pPr>
+        <w:spacing w:after="30"/>
+        <w:ind w:left="340"/>
+      </w:pPr>
+      <w:r>
+        <w:rPr>
+          <w:rFonts w:ascii="Calibri" w:cs="Calibri" w:eastAsia="Calibri" w:hAnsi="Calibri"/>
+          <w:color w:val="404040"/>
+          <w:sz w:val="20"/>
+          <w:szCs w:val="20"/>
+        </w:rPr>
+        <w:t xml:space="preserve">5.2 Spark en local, sans conteneur</w:t>
+      </w:r>
+    </w:p>
+    <w:p>
+      <w:pPr>
+        <w:spacing w:after="30"/>
+        <w:ind w:left="340"/>
+      </w:pPr>
+      <w:r>
+        <w:rPr>
+          <w:rFonts w:ascii="Calibri" w:cs="Calibri" w:eastAsia="Calibri" w:hAnsi="Calibri"/>
+          <w:color w:val="404040"/>
+          <w:sz w:val="20"/>
+          <w:szCs w:val="20"/>
+        </w:rPr>
+        <w:t xml:space="preserve">5.3 Les transformations et la règle métier</w:t>
+      </w:r>
+    </w:p>
+    <w:p>
+      <w:pPr>
+        <w:spacing w:after="30"/>
+        <w:ind w:left="340"/>
+      </w:pPr>
+      <w:r>
+        <w:rPr>
+          <w:rFonts w:ascii="Calibri" w:cs="Calibri" w:eastAsia="Calibri" w:hAnsi="Calibri"/>
+          <w:color w:val="404040"/>
+          <w:sz w:val="20"/>
+          <w:szCs w:val="20"/>
+        </w:rPr>
+        <w:t xml:space="preserve">5.4 La segmentation RFM</w:t>
+      </w:r>
+    </w:p>
+    <w:p>
+      <w:pPr>
+        <w:spacing w:after="30"/>
+        <w:ind w:left="340"/>
+      </w:pPr>
+      <w:r>
+        <w:rPr>
+          <w:rFonts w:ascii="Calibri" w:cs="Calibri" w:eastAsia="Calibri" w:hAnsi="Calibri"/>
+          <w:color w:val="404040"/>
+          <w:sz w:val="20"/>
+          <w:szCs w:val="20"/>
+        </w:rPr>
+        <w:t xml:space="preserve">5.5 Pourquoi Parquet</w:t>
+      </w:r>
+    </w:p>
+    <w:p>
+      <w:pPr>
+        <w:spacing w:after="40" w:before="160"/>
+      </w:pPr>
+      <w:r>
+        <w:rPr>
+          <w:rFonts w:ascii="Calibri" w:cs="Calibri" w:eastAsia="Calibri" w:hAnsi="Calibri"/>
+          <w:b/>
+          <w:bCs/>
+          <w:color w:val="1F3864"/>
+          <w:sz w:val="22"/>
+          <w:szCs w:val="22"/>
+        </w:rPr>
+        <w:t xml:space="preserve">6. Phase 4 — indexation Elasticsearch et tableau de bord Kibana</w:t>
+      </w:r>
+    </w:p>
+    <w:p>
+      <w:pPr>
+        <w:spacing w:after="30"/>
+        <w:ind w:left="340"/>
+      </w:pPr>
+      <w:r>
+        <w:rPr>
+          <w:rFonts w:ascii="Calibri" w:cs="Calibri" w:eastAsia="Calibri" w:hAnsi="Calibri"/>
+          <w:color w:val="404040"/>
+          <w:sz w:val="20"/>
+          <w:szCs w:val="20"/>
+        </w:rPr>
+        <w:t xml:space="preserve">6.1 Ce que cette phase apporte</w:t>
+      </w:r>
+    </w:p>
+    <w:p>
+      <w:pPr>
+        <w:spacing w:after="30"/>
+        <w:ind w:left="340"/>
+      </w:pPr>
+      <w:r>
+        <w:rPr>
+          <w:rFonts w:ascii="Calibri" w:cs="Calibri" w:eastAsia="Calibri" w:hAnsi="Calibri"/>
+          <w:color w:val="404040"/>
+          <w:sz w:val="20"/>
+          <w:szCs w:val="20"/>
+        </w:rPr>
+        <w:t xml:space="preserve">6.2 Deux index, et le choix du grain</w:t>
+      </w:r>
+    </w:p>
+    <w:p>
+      <w:pPr>
+        <w:spacing w:after="30"/>
+        <w:ind w:left="340"/>
+      </w:pPr>
+      <w:r>
+        <w:rPr>
+          <w:rFonts w:ascii="Calibri" w:cs="Calibri" w:eastAsia="Calibri" w:hAnsi="Calibri"/>
+          <w:color w:val="404040"/>
+          <w:sz w:val="20"/>
+          <w:szCs w:val="20"/>
+        </w:rPr>
+        <w:t xml:space="preserve">6.3 Les mappings</w:t>
+      </w:r>
+    </w:p>
+    <w:p>
+      <w:pPr>
+        <w:spacing w:after="30"/>
+        <w:ind w:left="340"/>
+      </w:pPr>
+      <w:r>
+        <w:rPr>
+          <w:rFonts w:ascii="Calibri" w:cs="Calibri" w:eastAsia="Calibri" w:hAnsi="Calibri"/>
+          <w:color w:val="404040"/>
+          <w:sz w:val="20"/>
+          <w:szCs w:val="20"/>
+        </w:rPr>
+        <w:t xml:space="preserve">6.4 Des identifiants dérivés des clés métier</w:t>
+      </w:r>
+    </w:p>
+    <w:p>
+      <w:pPr>
+        <w:spacing w:after="30"/>
+        <w:ind w:left="340"/>
+      </w:pPr>
+      <w:r>
+        <w:rPr>
+          <w:rFonts w:ascii="Calibri" w:cs="Calibri" w:eastAsia="Calibri" w:hAnsi="Calibri"/>
+          <w:color w:val="404040"/>
+          <w:sz w:val="20"/>
+          <w:szCs w:val="20"/>
+        </w:rPr>
+        <w:t xml:space="preserve">6.5 Les contrôles de la phase</w:t>
+      </w:r>
+    </w:p>
+    <w:p>
+      <w:pPr>
+        <w:spacing w:after="30"/>
+        <w:ind w:left="340"/>
+      </w:pPr>
+      <w:r>
+        <w:rPr>
+          <w:rFonts w:ascii="Calibri" w:cs="Calibri" w:eastAsia="Calibri" w:hAnsi="Calibri"/>
+          <w:color w:val="404040"/>
+          <w:sz w:val="20"/>
+          <w:szCs w:val="20"/>
+        </w:rPr>
+        <w:t xml:space="preserve">6.6 Le tableau de bord</w:t>
+      </w:r>
+    </w:p>
+    <w:p>
+      <w:pPr>
+        <w:spacing w:after="40" w:before="160"/>
+      </w:pPr>
+      <w:r>
+        <w:rPr>
+          <w:rFonts w:ascii="Calibri" w:cs="Calibri" w:eastAsia="Calibri" w:hAnsi="Calibri"/>
+          <w:b/>
+          <w:bCs/>
+          <w:color w:val="1F3864"/>
+          <w:sz w:val="22"/>
+          <w:szCs w:val="22"/>
+        </w:rPr>
+        <w:t xml:space="preserve">7. Résultats mesurés et contrôles de cohérence</w:t>
+      </w:r>
+    </w:p>
+    <w:p>
+      <w:pPr>
+        <w:spacing w:after="30"/>
+        <w:ind w:left="340"/>
+      </w:pPr>
+      <w:r>
+        <w:rPr>
+          <w:rFonts w:ascii="Calibri" w:cs="Calibri" w:eastAsia="Calibri" w:hAnsi="Calibri"/>
+          <w:color w:val="404040"/>
+          <w:sz w:val="20"/>
+          <w:szCs w:val="20"/>
+        </w:rPr>
+        <w:t xml:space="preserve">7.1 Les chiffres d'une exécution complète</w:t>
+      </w:r>
+    </w:p>
+    <w:p>
+      <w:pPr>
+        <w:spacing w:after="30"/>
+        <w:ind w:left="340"/>
+      </w:pPr>
+      <w:r>
+        <w:rPr>
+          <w:rFonts w:ascii="Calibri" w:cs="Calibri" w:eastAsia="Calibri" w:hAnsi="Calibri"/>
+          <w:color w:val="404040"/>
+          <w:sz w:val="20"/>
+          <w:szCs w:val="20"/>
+        </w:rPr>
+        <w:t xml:space="preserve">7.2 Les sept contrôles de cohérence</w:t>
+      </w:r>
+    </w:p>
+    <w:p>
+      <w:pPr>
+        <w:spacing w:after="30"/>
+        <w:ind w:left="340"/>
+      </w:pPr>
+      <w:r>
+        <w:rPr>
+          <w:rFonts w:ascii="Calibri" w:cs="Calibri" w:eastAsia="Calibri" w:hAnsi="Calibri"/>
+          <w:color w:val="404040"/>
+          <w:sz w:val="20"/>
+          <w:szCs w:val="20"/>
+        </w:rPr>
+        <w:t xml:space="preserve">7.3 Le traceur, contrôle complémentaire</w:t>
+      </w:r>
+    </w:p>
+    <w:p>
+      <w:pPr>
+        <w:spacing w:after="30"/>
+        <w:ind w:left="340"/>
+      </w:pPr>
+      <w:r>
+        <w:rPr>
+          <w:rFonts w:ascii="Calibri" w:cs="Calibri" w:eastAsia="Calibri" w:hAnsi="Calibri"/>
+          <w:color w:val="404040"/>
+          <w:sz w:val="20"/>
+          <w:szCs w:val="20"/>
+        </w:rPr>
+        <w:t xml:space="preserve">7.4 Ce que ces contrôles ne prouvent pas</w:t>
+      </w:r>
+    </w:p>
+    <w:p>
+      <w:pPr>
+        <w:spacing w:after="40" w:before="160"/>
+      </w:pPr>
+      <w:r>
+        <w:rPr>
+          <w:rFonts w:ascii="Calibri" w:cs="Calibri" w:eastAsia="Calibri" w:hAnsi="Calibri"/>
+          <w:b/>
+          <w:bCs/>
+          <w:color w:val="1F3864"/>
+          <w:sz w:val="22"/>
+          <w:szCs w:val="22"/>
+        </w:rPr>
+        <w:t xml:space="preserve">8. Difficultés rencontrées</w:t>
+      </w:r>
+    </w:p>
+    <w:p>
+      <w:pPr>
+        <w:spacing w:after="40" w:before="160"/>
+      </w:pPr>
+      <w:r>
+        <w:rPr>
+          <w:rFonts w:ascii="Calibri" w:cs="Calibri" w:eastAsia="Calibri" w:hAnsi="Calibri"/>
+          <w:b/>
+          <w:bCs/>
+          <w:color w:val="1F3864"/>
+          <w:sz w:val="22"/>
+          <w:szCs w:val="22"/>
+        </w:rPr>
+        <w:t xml:space="preserve">9. Limites du travail et prolongements</w:t>
+      </w:r>
+    </w:p>
+    <w:p>
+      <w:pPr>
+        <w:spacing w:after="40" w:before="160"/>
+      </w:pPr>
+      <w:r>
+        <w:rPr>
+          <w:rFonts w:ascii="Calibri" w:cs="Calibri" w:eastAsia="Calibri" w:hAnsi="Calibri"/>
+          <w:b/>
+          <w:bCs/>
+          <w:color w:val="1F3864"/>
+          <w:sz w:val="22"/>
+          <w:szCs w:val="22"/>
+        </w:rPr>
+        <w:t xml:space="preserve">10. Conclusion</w:t>
+      </w:r>
+    </w:p>
+    <w:p>
+      <w:pPr>
+        <w:spacing w:after="40" w:before="160"/>
+      </w:pPr>
+      <w:r>
+        <w:rPr>
+          <w:rFonts w:ascii="Calibri" w:cs="Calibri" w:eastAsia="Calibri" w:hAnsi="Calibri"/>
+          <w:b/>
+          <w:bCs/>
+          <w:color w:val="1F3864"/>
+          <w:sz w:val="22"/>
+          <w:szCs w:val="22"/>
+        </w:rPr>
+        <w:t xml:space="preserve">11. Annexe — enchaînement des commandes</w:t>
+      </w:r>
+    </w:p>
     <w:p>
       <w:r>
         <w:br w:type="page"/>
@@ -651,10 +1363,10 @@
         <w:rPr>
           <w:rFonts w:ascii="Consolas" w:cs="Consolas" w:eastAsia="Consolas" w:hAnsi="Consolas"/>
           <w:color w:val="1A1A1A"/>
-          <w:sz w:val="15"/>
-          <w:szCs w:val="15"/>
-        </w:rPr>
-        <w:t xml:space="preserve">   PHASE 1              PHASE 2              PHASE 3              PHASE 4</w:t>
+          <w:sz w:val="16"/>
+          <w:szCs w:val="16"/>
+        </w:rPr>
+        <w:t xml:space="preserve">  PHASE 1             PHASE 2             PHASE 3             PHASE 4</w:t>
       </w:r>
     </w:p>
     <w:p>
@@ -669,10 +1381,10 @@
         <w:rPr>
           <w:rFonts w:ascii="Consolas" w:cs="Consolas" w:eastAsia="Consolas" w:hAnsi="Consolas"/>
           <w:color w:val="1A1A1A"/>
-          <w:sz w:val="15"/>
-          <w:szCs w:val="15"/>
-        </w:rPr>
-        <w:t xml:space="preserve"> ┌──────────┐        ┌───────────┐        ┌──────────┐       ┌───────────────┐</w:t>
+          <w:sz w:val="16"/>
+          <w:szCs w:val="16"/>
+        </w:rPr>
+        <w:t xml:space="preserve">+-----------+       +-----------+       +-----------+       +---------------+</w:t>
       </w:r>
     </w:p>
     <w:p>
@@ -687,10 +1399,10 @@
         <w:rPr>
           <w:rFonts w:ascii="Consolas" w:cs="Consolas" w:eastAsia="Consolas" w:hAnsi="Consolas"/>
           <w:color w:val="1A1A1A"/>
-          <w:sz w:val="15"/>
-          <w:szCs w:val="15"/>
-        </w:rPr>
-        <w:t xml:space="preserve"> │  Oracle  │        │ Cassandra │        │  Spark   │       │ Elasticsearch │</w:t>
+          <w:sz w:val="16"/>
+          <w:szCs w:val="16"/>
+        </w:rPr>
+        <w:t xml:space="preserve">|  Oracle   |       | Cassandra |       |   Spark   |       | Elasticsearch |</w:t>
       </w:r>
     </w:p>
     <w:p>
@@ -705,10 +1417,10 @@
         <w:rPr>
           <w:rFonts w:ascii="Consolas" w:cs="Consolas" w:eastAsia="Consolas" w:hAnsi="Consolas"/>
           <w:color w:val="1A1A1A"/>
-          <w:sz w:val="15"/>
-          <w:szCs w:val="15"/>
-        </w:rPr>
-        <w:t xml:space="preserve"> │   23ai   │        │    5.0    │        │  local   │       │      +        │</w:t>
+          <w:sz w:val="16"/>
+          <w:szCs w:val="16"/>
+        </w:rPr>
+        <w:t xml:space="preserve">|   23ai    |       |    5.0    |       |   local   |       |       +       |</w:t>
       </w:r>
     </w:p>
     <w:p>
@@ -723,10 +1435,10 @@
         <w:rPr>
           <w:rFonts w:ascii="Consolas" w:cs="Consolas" w:eastAsia="Consolas" w:hAnsi="Consolas"/>
           <w:color w:val="1A1A1A"/>
-          <w:sz w:val="15"/>
-          <w:szCs w:val="15"/>
-        </w:rPr>
-        <w:t xml:space="preserve"> │(3NF, SQL)│        │ (NoSQL)   │        │ (PySpark)│       │    Kibana     │</w:t>
+          <w:sz w:val="16"/>
+          <w:szCs w:val="16"/>
+        </w:rPr>
+        <w:t xml:space="preserve">| 3NF, SQL  |       |  (NoSQL)  |       | (PySpark) |       |    Kibana     |</w:t>
       </w:r>
     </w:p>
     <w:p>
@@ -741,10 +1453,10 @@
         <w:rPr>
           <w:rFonts w:ascii="Consolas" w:cs="Consolas" w:eastAsia="Consolas" w:hAnsi="Consolas"/>
           <w:color w:val="1A1A1A"/>
-          <w:sz w:val="15"/>
-          <w:szCs w:val="15"/>
-        </w:rPr>
-        <w:t xml:space="preserve"> └────┬─────┘        └─────┬─────┘        └────┬─────┘       └───────┬───────┘</w:t>
+          <w:sz w:val="16"/>
+          <w:szCs w:val="16"/>
+        </w:rPr>
+        <w:t xml:space="preserve">+-----------+       +-----------+       +-----------+       +---------------+</w:t>
       </w:r>
     </w:p>
     <w:p>
@@ -759,10 +1471,10 @@
         <w:rPr>
           <w:rFonts w:ascii="Consolas" w:cs="Consolas" w:eastAsia="Consolas" w:hAnsi="Consolas"/>
           <w:color w:val="1A1A1A"/>
-          <w:sz w:val="15"/>
-          <w:szCs w:val="15"/>
-        </w:rPr>
-        <w:t xml:space="preserve">      │                    │                   │                     │</w:t>
+          <w:sz w:val="16"/>
+          <w:szCs w:val="16"/>
+        </w:rPr>
+        <w:t xml:space="preserve">      |                   |                   |                     |</w:t>
       </w:r>
     </w:p>
     <w:p>
@@ -777,10 +1489,10 @@
         <w:rPr>
           <w:rFonts w:ascii="Consolas" w:cs="Consolas" w:eastAsia="Consolas" w:hAnsi="Consolas"/>
           <w:color w:val="1A1A1A"/>
-          <w:sz w:val="15"/>
-          <w:szCs w:val="15"/>
-        </w:rPr>
-        <w:t xml:space="preserve">      │ JSON Lines         │ lecture CQL       │ Parquet             │ bulk API</w:t>
+          <w:sz w:val="16"/>
+          <w:szCs w:val="16"/>
+        </w:rPr>
+        <w:t xml:space="preserve">  JSON Lines         lecture CQL           Parquet              bulk API</w:t>
       </w:r>
     </w:p>
     <w:p>
@@ -795,10 +1507,10 @@
         <w:rPr>
           <w:rFonts w:ascii="Consolas" w:cs="Consolas" w:eastAsia="Consolas" w:hAnsi="Consolas"/>
           <w:color w:val="1A1A1A"/>
-          <w:sz w:val="15"/>
-          <w:szCs w:val="15"/>
-        </w:rPr>
-        <w:t xml:space="preserve">      ▼                    ▼                   ▼                     ▼</w:t>
+          <w:sz w:val="16"/>
+          <w:szCs w:val="16"/>
+        </w:rPr>
+        <w:t xml:space="preserve">      v                   v                   v                     v</w:t>
       </w:r>
     </w:p>
     <w:p>
@@ -813,10 +1525,10 @@
         <w:rPr>
           <w:rFonts w:ascii="Consolas" w:cs="Consolas" w:eastAsia="Consolas" w:hAnsi="Consolas"/>
           <w:color w:val="1A1A1A"/>
-          <w:sz w:val="15"/>
-          <w:szCs w:val="15"/>
-        </w:rPr>
-        <w:t xml:space="preserve">  data/json/          tables dénormalisées  data/parquet/       index + dashboard</w:t>
+          <w:sz w:val="16"/>
+          <w:szCs w:val="16"/>
+        </w:rPr>
+        <w:t xml:space="preserve">  data/json/        tables denorm.      data/parquet/      index + dashboard</w:t>
       </w:r>
     </w:p>
     <w:p>
@@ -3294,8 +4006,8 @@
         <w:rPr>
           <w:rFonts w:ascii="Consolas" w:cs="Consolas" w:eastAsia="Consolas" w:hAnsi="Consolas"/>
           <w:color w:val="1A1A1A"/>
-          <w:sz w:val="15"/>
-          <w:szCs w:val="15"/>
+          <w:sz w:val="16"/>
+          <w:szCs w:val="16"/>
         </w:rPr>
         <w:t xml:space="preserve">COUNTRIES(country_code, country_name, region)</w:t>
       </w:r>
@@ -3312,10 +4024,10 @@
         <w:rPr>
           <w:rFonts w:ascii="Consolas" w:cs="Consolas" w:eastAsia="Consolas" w:hAnsi="Consolas"/>
           <w:color w:val="1A1A1A"/>
-          <w:sz w:val="15"/>
-          <w:szCs w:val="15"/>
-        </w:rPr>
-        <w:t xml:space="preserve">    ▲</w:t>
+          <w:sz w:val="16"/>
+          <w:szCs w:val="16"/>
+        </w:rPr>
+        <w:t xml:space="preserve">    ^</w:t>
       </w:r>
     </w:p>
     <w:p>
@@ -3330,10 +4042,10 @@
         <w:rPr>
           <w:rFonts w:ascii="Consolas" w:cs="Consolas" w:eastAsia="Consolas" w:hAnsi="Consolas"/>
           <w:color w:val="1A1A1A"/>
-          <w:sz w:val="15"/>
-          <w:szCs w:val="15"/>
-        </w:rPr>
-        <w:t xml:space="preserve">ADDRESSES(address_id, #customer_id, address_type, street, city, postal_code, #country_code)</w:t>
+          <w:sz w:val="16"/>
+          <w:szCs w:val="16"/>
+        </w:rPr>
+        <w:t xml:space="preserve">    |</w:t>
       </w:r>
     </w:p>
     <w:p>
@@ -3348,10 +4060,10 @@
         <w:rPr>
           <w:rFonts w:ascii="Consolas" w:cs="Consolas" w:eastAsia="Consolas" w:hAnsi="Consolas"/>
           <w:color w:val="1A1A1A"/>
-          <w:sz w:val="15"/>
-          <w:szCs w:val="15"/>
-        </w:rPr>
-        <w:t xml:space="preserve">    ▲                     ▲</w:t>
+          <w:sz w:val="16"/>
+          <w:szCs w:val="16"/>
+        </w:rPr>
+        <w:t xml:space="preserve">ADDRESSES(address_id, #customer_id, address_type, street, city,</w:t>
       </w:r>
     </w:p>
     <w:p>
@@ -3366,10 +4078,10 @@
         <w:rPr>
           <w:rFonts w:ascii="Consolas" w:cs="Consolas" w:eastAsia="Consolas" w:hAnsi="Consolas"/>
           <w:color w:val="1A1A1A"/>
-          <w:sz w:val="15"/>
-          <w:szCs w:val="15"/>
-        </w:rPr>
-        <w:t xml:space="preserve">    │                 CUSTOMERS(customer_id, email, first_name, last_name,</w:t>
+          <w:sz w:val="16"/>
+          <w:szCs w:val="16"/>
+        </w:rPr>
+        <w:t xml:space="preserve">          postal_code, #country_code)</w:t>
       </w:r>
     </w:p>
     <w:p>
@@ -3384,10 +4096,10 @@
         <w:rPr>
           <w:rFonts w:ascii="Consolas" w:cs="Consolas" w:eastAsia="Consolas" w:hAnsi="Consolas"/>
           <w:color w:val="1A1A1A"/>
-          <w:sz w:val="15"/>
-          <w:szCs w:val="15"/>
-        </w:rPr>
-        <w:t xml:space="preserve">    │                           birth_date, signup_date, loyalty_tier)</w:t>
+          <w:sz w:val="16"/>
+          <w:szCs w:val="16"/>
+        </w:rPr>
+        <w:t xml:space="preserve">    ^                  ^</w:t>
       </w:r>
     </w:p>
     <w:p>
@@ -3402,10 +4114,10 @@
         <w:rPr>
           <w:rFonts w:ascii="Consolas" w:cs="Consolas" w:eastAsia="Consolas" w:hAnsi="Consolas"/>
           <w:color w:val="1A1A1A"/>
-          <w:sz w:val="15"/>
-          <w:szCs w:val="15"/>
-        </w:rPr>
-        <w:t xml:space="preserve">    │                     ▲</w:t>
+          <w:sz w:val="16"/>
+          <w:szCs w:val="16"/>
+        </w:rPr>
+        <w:t xml:space="preserve">    |                  |</w:t>
       </w:r>
     </w:p>
     <w:p>
@@ -3420,10 +4132,10 @@
         <w:rPr>
           <w:rFonts w:ascii="Consolas" w:cs="Consolas" w:eastAsia="Consolas" w:hAnsi="Consolas"/>
           <w:color w:val="1A1A1A"/>
-          <w:sz w:val="15"/>
-          <w:szCs w:val="15"/>
-        </w:rPr>
-        <w:t xml:space="preserve">ORDERS(order_id, order_ref, #customer_id, order_date, order_status,</w:t>
+          <w:sz w:val="16"/>
+          <w:szCs w:val="16"/>
+        </w:rPr>
+        <w:t xml:space="preserve">    |           CUSTOMERS(customer_id, email, first_name, last_name,</w:t>
       </w:r>
     </w:p>
     <w:p>
@@ -3438,10 +4150,10 @@
         <w:rPr>
           <w:rFonts w:ascii="Consolas" w:cs="Consolas" w:eastAsia="Consolas" w:hAnsi="Consolas"/>
           <w:color w:val="1A1A1A"/>
-          <w:sz w:val="15"/>
-          <w:szCs w:val="15"/>
-        </w:rPr>
-        <w:t xml:space="preserve">       #payment_method_id, #shipping_address_id, #billing_address_id, shipping_amount)</w:t>
+          <w:sz w:val="16"/>
+          <w:szCs w:val="16"/>
+        </w:rPr>
+        <w:t xml:space="preserve">    |                     birth_date, signup_date, loyalty_tier)</w:t>
       </w:r>
     </w:p>
     <w:p>
@@ -3456,10 +4168,10 @@
         <w:rPr>
           <w:rFonts w:ascii="Consolas" w:cs="Consolas" w:eastAsia="Consolas" w:hAnsi="Consolas"/>
           <w:color w:val="1A1A1A"/>
-          <w:sz w:val="15"/>
-          <w:szCs w:val="15"/>
-        </w:rPr>
-        <w:t xml:space="preserve">    ▲                          ▲</w:t>
+          <w:sz w:val="16"/>
+          <w:szCs w:val="16"/>
+        </w:rPr>
+        <w:t xml:space="preserve">    |                  ^</w:t>
       </w:r>
     </w:p>
     <w:p>
@@ -3474,10 +4186,10 @@
         <w:rPr>
           <w:rFonts w:ascii="Consolas" w:cs="Consolas" w:eastAsia="Consolas" w:hAnsi="Consolas"/>
           <w:color w:val="1A1A1A"/>
-          <w:sz w:val="15"/>
-          <w:szCs w:val="15"/>
-        </w:rPr>
-        <w:t xml:space="preserve">    │                  PAYMENT_METHODS(payment_method_id, method_code, method_label)</w:t>
+          <w:sz w:val="16"/>
+          <w:szCs w:val="16"/>
+        </w:rPr>
+        <w:t xml:space="preserve">    |                  |</w:t>
       </w:r>
     </w:p>
     <w:p>
@@ -3492,10 +4204,10 @@
         <w:rPr>
           <w:rFonts w:ascii="Consolas" w:cs="Consolas" w:eastAsia="Consolas" w:hAnsi="Consolas"/>
           <w:color w:val="1A1A1A"/>
-          <w:sz w:val="15"/>
-          <w:szCs w:val="15"/>
-        </w:rPr>
-        <w:t xml:space="preserve">    │</w:t>
+          <w:sz w:val="16"/>
+          <w:szCs w:val="16"/>
+        </w:rPr>
+        <w:t xml:space="preserve">ORDERS(order_id, order_ref, #customer_id, order_date, order_status,</w:t>
       </w:r>
     </w:p>
     <w:p>
@@ -3510,10 +4222,10 @@
         <w:rPr>
           <w:rFonts w:ascii="Consolas" w:cs="Consolas" w:eastAsia="Consolas" w:hAnsi="Consolas"/>
           <w:color w:val="1A1A1A"/>
-          <w:sz w:val="15"/>
-          <w:szCs w:val="15"/>
-        </w:rPr>
-        <w:t xml:space="preserve">ORDER_ITEMS(#order_id, line_no, #product_id, quantity, unit_price, discount_pct)</w:t>
+          <w:sz w:val="16"/>
+          <w:szCs w:val="16"/>
+        </w:rPr>
+        <w:t xml:space="preserve">       #payment_method_id, #shipping_address_id, #billing_address_id,</w:t>
       </w:r>
     </w:p>
     <w:p>
@@ -3528,10 +4240,10 @@
         <w:rPr>
           <w:rFonts w:ascii="Consolas" w:cs="Consolas" w:eastAsia="Consolas" w:hAnsi="Consolas"/>
           <w:color w:val="1A1A1A"/>
-          <w:sz w:val="15"/>
-          <w:szCs w:val="15"/>
-        </w:rPr>
-        <w:t xml:space="preserve">                            ▲</w:t>
+          <w:sz w:val="16"/>
+          <w:szCs w:val="16"/>
+        </w:rPr>
+        <w:t xml:space="preserve">       shipping_amount)</w:t>
       </w:r>
     </w:p>
     <w:p>
@@ -3546,10 +4258,10 @@
         <w:rPr>
           <w:rFonts w:ascii="Consolas" w:cs="Consolas" w:eastAsia="Consolas" w:hAnsi="Consolas"/>
           <w:color w:val="1A1A1A"/>
-          <w:sz w:val="15"/>
-          <w:szCs w:val="15"/>
-        </w:rPr>
-        <w:t xml:space="preserve">                     PRODUCTS(product_id, sku, product_name, brand,</w:t>
+          <w:sz w:val="16"/>
+          <w:szCs w:val="16"/>
+        </w:rPr>
+        <w:t xml:space="preserve">    ^                  ^</w:t>
       </w:r>
     </w:p>
     <w:p>
@@ -3564,10 +4276,10 @@
         <w:rPr>
           <w:rFonts w:ascii="Consolas" w:cs="Consolas" w:eastAsia="Consolas" w:hAnsi="Consolas"/>
           <w:color w:val="1A1A1A"/>
-          <w:sz w:val="15"/>
-          <w:szCs w:val="15"/>
-        </w:rPr>
-        <w:t xml:space="preserve">                              #category_id, unit_price, is_active, created_at)</w:t>
+          <w:sz w:val="16"/>
+          <w:szCs w:val="16"/>
+        </w:rPr>
+        <w:t xml:space="preserve">    |                  |</w:t>
       </w:r>
     </w:p>
     <w:p>
@@ -3582,10 +4294,10 @@
         <w:rPr>
           <w:rFonts w:ascii="Consolas" w:cs="Consolas" w:eastAsia="Consolas" w:hAnsi="Consolas"/>
           <w:color w:val="1A1A1A"/>
-          <w:sz w:val="15"/>
-          <w:szCs w:val="15"/>
-        </w:rPr>
-        <w:t xml:space="preserve">                            ▲</w:t>
+          <w:sz w:val="16"/>
+          <w:szCs w:val="16"/>
+        </w:rPr>
+        <w:t xml:space="preserve">    |           PAYMENT_METHODS(payment_method_id, method_code, method_label)</w:t>
       </w:r>
     </w:p>
     <w:p>
@@ -3600,10 +4312,172 @@
         <w:rPr>
           <w:rFonts w:ascii="Consolas" w:cs="Consolas" w:eastAsia="Consolas" w:hAnsi="Consolas"/>
           <w:color w:val="1A1A1A"/>
-          <w:sz w:val="15"/>
-          <w:szCs w:val="15"/>
-        </w:rPr>
-        <w:t xml:space="preserve">                     CATEGORIES(category_id, category_code, category_name,</w:t>
+          <w:sz w:val="16"/>
+          <w:szCs w:val="16"/>
+        </w:rPr>
+        <w:t xml:space="preserve">    |</w:t>
+      </w:r>
+    </w:p>
+    <w:p>
+      <w:pPr>
+        <w:keepNext/>
+        <w:keepLines/>
+        <w:shd w:fill="F4F5F7" w:val="clear"/>
+        <w:spacing w:after="0" w:before="0" w:line="230"/>
+        <w:ind w:left="170" w:right="100"/>
+      </w:pPr>
+      <w:r>
+        <w:rPr>
+          <w:rFonts w:ascii="Consolas" w:cs="Consolas" w:eastAsia="Consolas" w:hAnsi="Consolas"/>
+          <w:color w:val="1A1A1A"/>
+          <w:sz w:val="16"/>
+          <w:szCs w:val="16"/>
+        </w:rPr>
+        <w:t xml:space="preserve">ORDER_ITEMS(#order_id, line_no, #product_id, quantity, unit_price,</w:t>
+      </w:r>
+    </w:p>
+    <w:p>
+      <w:pPr>
+        <w:keepNext/>
+        <w:keepLines/>
+        <w:shd w:fill="F4F5F7" w:val="clear"/>
+        <w:spacing w:after="0" w:before="0" w:line="230"/>
+        <w:ind w:left="170" w:right="100"/>
+      </w:pPr>
+      <w:r>
+        <w:rPr>
+          <w:rFonts w:ascii="Consolas" w:cs="Consolas" w:eastAsia="Consolas" w:hAnsi="Consolas"/>
+          <w:color w:val="1A1A1A"/>
+          <w:sz w:val="16"/>
+          <w:szCs w:val="16"/>
+        </w:rPr>
+        <w:t xml:space="preserve">            discount_pct)</w:t>
+      </w:r>
+    </w:p>
+    <w:p>
+      <w:pPr>
+        <w:keepNext/>
+        <w:keepLines/>
+        <w:shd w:fill="F4F5F7" w:val="clear"/>
+        <w:spacing w:after="0" w:before="0" w:line="230"/>
+        <w:ind w:left="170" w:right="100"/>
+      </w:pPr>
+      <w:r>
+        <w:rPr>
+          <w:rFonts w:ascii="Consolas" w:cs="Consolas" w:eastAsia="Consolas" w:hAnsi="Consolas"/>
+          <w:color w:val="1A1A1A"/>
+          <w:sz w:val="16"/>
+          <w:szCs w:val="16"/>
+        </w:rPr>
+        <w:t xml:space="preserve">                       ^</w:t>
+      </w:r>
+    </w:p>
+    <w:p>
+      <w:pPr>
+        <w:keepNext/>
+        <w:keepLines/>
+        <w:shd w:fill="F4F5F7" w:val="clear"/>
+        <w:spacing w:after="0" w:before="0" w:line="230"/>
+        <w:ind w:left="170" w:right="100"/>
+      </w:pPr>
+      <w:r>
+        <w:rPr>
+          <w:rFonts w:ascii="Consolas" w:cs="Consolas" w:eastAsia="Consolas" w:hAnsi="Consolas"/>
+          <w:color w:val="1A1A1A"/>
+          <w:sz w:val="16"/>
+          <w:szCs w:val="16"/>
+        </w:rPr>
+        <w:t xml:space="preserve">                       |</w:t>
+      </w:r>
+    </w:p>
+    <w:p>
+      <w:pPr>
+        <w:keepNext/>
+        <w:keepLines/>
+        <w:shd w:fill="F4F5F7" w:val="clear"/>
+        <w:spacing w:after="0" w:before="0" w:line="230"/>
+        <w:ind w:left="170" w:right="100"/>
+      </w:pPr>
+      <w:r>
+        <w:rPr>
+          <w:rFonts w:ascii="Consolas" w:cs="Consolas" w:eastAsia="Consolas" w:hAnsi="Consolas"/>
+          <w:color w:val="1A1A1A"/>
+          <w:sz w:val="16"/>
+          <w:szCs w:val="16"/>
+        </w:rPr>
+        <w:t xml:space="preserve">                PRODUCTS(product_id, sku, product_name, brand,</w:t>
+      </w:r>
+    </w:p>
+    <w:p>
+      <w:pPr>
+        <w:keepNext/>
+        <w:keepLines/>
+        <w:shd w:fill="F4F5F7" w:val="clear"/>
+        <w:spacing w:after="0" w:before="0" w:line="230"/>
+        <w:ind w:left="170" w:right="100"/>
+      </w:pPr>
+      <w:r>
+        <w:rPr>
+          <w:rFonts w:ascii="Consolas" w:cs="Consolas" w:eastAsia="Consolas" w:hAnsi="Consolas"/>
+          <w:color w:val="1A1A1A"/>
+          <w:sz w:val="16"/>
+          <w:szCs w:val="16"/>
+        </w:rPr>
+        <w:t xml:space="preserve">                         #category_id, unit_price, is_active, created_at)</w:t>
+      </w:r>
+    </w:p>
+    <w:p>
+      <w:pPr>
+        <w:keepNext/>
+        <w:keepLines/>
+        <w:shd w:fill="F4F5F7" w:val="clear"/>
+        <w:spacing w:after="0" w:before="0" w:line="230"/>
+        <w:ind w:left="170" w:right="100"/>
+      </w:pPr>
+      <w:r>
+        <w:rPr>
+          <w:rFonts w:ascii="Consolas" w:cs="Consolas" w:eastAsia="Consolas" w:hAnsi="Consolas"/>
+          <w:color w:val="1A1A1A"/>
+          <w:sz w:val="16"/>
+          <w:szCs w:val="16"/>
+        </w:rPr>
+        <w:t xml:space="preserve">                       ^</w:t>
+      </w:r>
+    </w:p>
+    <w:p>
+      <w:pPr>
+        <w:keepNext/>
+        <w:keepLines/>
+        <w:shd w:fill="F4F5F7" w:val="clear"/>
+        <w:spacing w:after="0" w:before="0" w:line="230"/>
+        <w:ind w:left="170" w:right="100"/>
+      </w:pPr>
+      <w:r>
+        <w:rPr>
+          <w:rFonts w:ascii="Consolas" w:cs="Consolas" w:eastAsia="Consolas" w:hAnsi="Consolas"/>
+          <w:color w:val="1A1A1A"/>
+          <w:sz w:val="16"/>
+          <w:szCs w:val="16"/>
+        </w:rPr>
+        <w:t xml:space="preserve">                       |</w:t>
+      </w:r>
+    </w:p>
+    <w:p>
+      <w:pPr>
+        <w:keepNext/>
+        <w:keepLines/>
+        <w:shd w:fill="F4F5F7" w:val="clear"/>
+        <w:spacing w:after="0" w:before="0" w:line="230"/>
+        <w:ind w:left="170" w:right="100"/>
+      </w:pPr>
+      <w:r>
+        <w:rPr>
+          <w:rFonts w:ascii="Consolas" w:cs="Consolas" w:eastAsia="Consolas" w:hAnsi="Consolas"/>
+          <w:color w:val="1A1A1A"/>
+          <w:sz w:val="16"/>
+          <w:szCs w:val="16"/>
+        </w:rPr>
+        <w:t xml:space="preserve">                CATEGORIES(category_id, category_code, category_name,</w:t>
       </w:r>
     </w:p>
     <w:p>
@@ -3618,10 +4492,10 @@
         <w:rPr>
           <w:rFonts w:ascii="Consolas" w:cs="Consolas" w:eastAsia="Consolas" w:hAnsi="Consolas"/>
           <w:color w:val="1A1A1A"/>
-          <w:sz w:val="15"/>
-          <w:szCs w:val="15"/>
-        </w:rPr>
-        <w:t xml:space="preserve">                                #parent_category_id)   ← FK réflexive</w:t>
+          <w:sz w:val="16"/>
+          <w:szCs w:val="16"/>
+        </w:rPr>
+        <w:t xml:space="preserve">                           #parent_category_id)   &lt;- cle etrangere reflexive</w:t>
       </w:r>
     </w:p>
     <w:p>
@@ -8766,7 +9640,7 @@
           <w:sz w:val="20"/>
           <w:szCs w:val="20"/>
         </w:rPr>
-        <w:t xml:space="preserve"> demande à Cassandra de sérialiser la collection comme une valeur unique et immuable. La conséquence est à assumer : modifier une seule ligne de commande impose de réécrire tout le tableau. C'est acceptable ici parce qu'</w:t>
+        <w:t xml:space="preserve"> veut dire que Cassandra stocke toute la liste comme une seule valeur. Pour modifier une seule ligne de commande, il faut donc réécrire la liste entière. C'est acceptable ici parce qu'</w:t>
       </w:r>
       <w:r>
         <w:rPr>
@@ -8792,7 +9666,7 @@
           <w:sz w:val="20"/>
           <w:szCs w:val="20"/>
         </w:rPr>
-        <w:t xml:space="preserve">. Ce serait un mauvais choix pour une donnée mise à jour élément par élément.</w:t>
+        <w:t xml:space="preserve"> ; ce serait un mauvais choix pour une donnée mise à jour souvent.</w:t>
       </w:r>
     </w:p>
     <w:p>
@@ -11238,9 +12112,9 @@
         </w:tblBorders>
       </w:tblPr>
       <w:tblGrid>
-        <w:gridCol w:w="2806"/>
-        <w:gridCol w:w="2440"/>
-        <w:gridCol w:w="4393"/>
+        <w:gridCol w:w="2578"/>
+        <w:gridCol w:w="2242"/>
+        <w:gridCol w:w="4819"/>
       </w:tblGrid>
       <w:tr>
         <w:trPr>
@@ -11248,7 +12122,7 @@
         </w:trPr>
         <w:tc>
           <w:tcPr>
-            <w:tcW w:type="dxa" w:w="2806"/>
+            <w:tcW w:type="dxa" w:w="2578"/>
             <w:shd w:fill="E8EAEE" w:val="clear"/>
             <w:tcMar>
               <w:top w:type="dxa" w:w="60"/>
@@ -11279,7 +12153,7 @@
         </w:tc>
         <w:tc>
           <w:tcPr>
-            <w:tcW w:type="dxa" w:w="2440"/>
+            <w:tcW w:type="dxa" w:w="2242"/>
             <w:shd w:fill="E8EAEE" w:val="clear"/>
             <w:tcMar>
               <w:top w:type="dxa" w:w="60"/>
@@ -11310,7 +12184,7 @@
         </w:tc>
         <w:tc>
           <w:tcPr>
-            <w:tcW w:type="dxa" w:w="4393"/>
+            <w:tcW w:type="dxa" w:w="4819"/>
             <w:shd w:fill="E8EAEE" w:val="clear"/>
             <w:tcMar>
               <w:top w:type="dxa" w:w="60"/>
@@ -11343,7 +12217,7 @@
       <w:tr>
         <w:tc>
           <w:tcPr>
-            <w:tcW w:type="dxa" w:w="2806"/>
+            <w:tcW w:type="dxa" w:w="2578"/>
             <w:tcMar>
               <w:top w:type="dxa" w:w="60"/>
               <w:left w:type="dxa" w:w="100"/>
@@ -11373,7 +12247,7 @@
         </w:tc>
         <w:tc>
           <w:tcPr>
-            <w:tcW w:type="dxa" w:w="2440"/>
+            <w:tcW w:type="dxa" w:w="2242"/>
             <w:tcMar>
               <w:top w:type="dxa" w:w="60"/>
               <w:left w:type="dxa" w:w="100"/>
@@ -11403,7 +12277,7 @@
         </w:tc>
         <w:tc>
           <w:tcPr>
-            <w:tcW w:type="dxa" w:w="4393"/>
+            <w:tcW w:type="dxa" w:w="4819"/>
             <w:tcMar>
               <w:top w:type="dxa" w:w="60"/>
               <w:left w:type="dxa" w:w="100"/>
@@ -11435,7 +12309,7 @@
       <w:tr>
         <w:tc>
           <w:tcPr>
-            <w:tcW w:type="dxa" w:w="2806"/>
+            <w:tcW w:type="dxa" w:w="2578"/>
             <w:tcMar>
               <w:top w:type="dxa" w:w="60"/>
               <w:left w:type="dxa" w:w="100"/>
@@ -11465,7 +12339,7 @@
         </w:tc>
         <w:tc>
           <w:tcPr>
-            <w:tcW w:type="dxa" w:w="2440"/>
+            <w:tcW w:type="dxa" w:w="2242"/>
             <w:tcMar>
               <w:top w:type="dxa" w:w="60"/>
               <w:left w:type="dxa" w:w="100"/>
@@ -11495,7 +12369,7 @@
         </w:tc>
         <w:tc>
           <w:tcPr>
-            <w:tcW w:type="dxa" w:w="4393"/>
+            <w:tcW w:type="dxa" w:w="4819"/>
             <w:tcMar>
               <w:top w:type="dxa" w:w="60"/>
               <w:left w:type="dxa" w:w="100"/>
@@ -11519,7 +12393,7 @@
                 <w:sz w:val="19"/>
                 <w:szCs w:val="19"/>
               </w:rPr>
-              <w:t xml:space="preserve">courbe temporelle du tableau de bord</w:t>
+              <w:t xml:space="preserve">référence pour vérifier les totaux mensuels</w:t>
             </w:r>
           </w:p>
         </w:tc>
@@ -11527,7 +12401,7 @@
       <w:tr>
         <w:tc>
           <w:tcPr>
-            <w:tcW w:type="dxa" w:w="2806"/>
+            <w:tcW w:type="dxa" w:w="2578"/>
             <w:tcMar>
               <w:top w:type="dxa" w:w="60"/>
               <w:left w:type="dxa" w:w="100"/>
@@ -11557,7 +12431,7 @@
         </w:tc>
         <w:tc>
           <w:tcPr>
-            <w:tcW w:type="dxa" w:w="2440"/>
+            <w:tcW w:type="dxa" w:w="2242"/>
             <w:tcMar>
               <w:top w:type="dxa" w:w="60"/>
               <w:left w:type="dxa" w:w="100"/>
@@ -11587,7 +12461,7 @@
         </w:tc>
         <w:tc>
           <w:tcPr>
-            <w:tcW w:type="dxa" w:w="4393"/>
+            <w:tcW w:type="dxa" w:w="4819"/>
             <w:tcMar>
               <w:top w:type="dxa" w:w="60"/>
               <w:left w:type="dxa" w:w="100"/>
@@ -11611,7 +12485,7 @@
                 <w:sz w:val="19"/>
                 <w:szCs w:val="19"/>
               </w:rPr>
-              <w:t xml:space="preserve">répartition par rayon</w:t>
+              <w:t xml:space="preserve">référence pour la répartition par rayon</w:t>
             </w:r>
           </w:p>
         </w:tc>
@@ -11619,7 +12493,7 @@
       <w:tr>
         <w:tc>
           <w:tcPr>
-            <w:tcW w:type="dxa" w:w="2806"/>
+            <w:tcW w:type="dxa" w:w="2578"/>
             <w:tcMar>
               <w:top w:type="dxa" w:w="60"/>
               <w:left w:type="dxa" w:w="100"/>
@@ -11649,7 +12523,7 @@
         </w:tc>
         <w:tc>
           <w:tcPr>
-            <w:tcW w:type="dxa" w:w="2440"/>
+            <w:tcW w:type="dxa" w:w="2242"/>
             <w:tcMar>
               <w:top w:type="dxa" w:w="60"/>
               <w:left w:type="dxa" w:w="100"/>
@@ -11679,7 +12553,7 @@
         </w:tc>
         <w:tc>
           <w:tcPr>
-            <w:tcW w:type="dxa" w:w="4393"/>
+            <w:tcW w:type="dxa" w:w="4819"/>
             <w:tcMar>
               <w:top w:type="dxa" w:w="60"/>
               <w:left w:type="dxa" w:w="100"/>
@@ -11703,7 +12577,7 @@
                 <w:sz w:val="19"/>
                 <w:szCs w:val="19"/>
               </w:rPr>
-              <w:t xml:space="preserve">classement par rayon</w:t>
+              <w:t xml:space="preserve">référence pour le classement des ventes</w:t>
             </w:r>
           </w:p>
         </w:tc>
@@ -11711,7 +12585,7 @@
       <w:tr>
         <w:tc>
           <w:tcPr>
-            <w:tcW w:type="dxa" w:w="2806"/>
+            <w:tcW w:type="dxa" w:w="2578"/>
             <w:tcMar>
               <w:top w:type="dxa" w:w="60"/>
               <w:left w:type="dxa" w:w="100"/>
@@ -11741,7 +12615,7 @@
         </w:tc>
         <w:tc>
           <w:tcPr>
-            <w:tcW w:type="dxa" w:w="2440"/>
+            <w:tcW w:type="dxa" w:w="2242"/>
             <w:tcMar>
               <w:top w:type="dxa" w:w="60"/>
               <w:left w:type="dxa" w:w="100"/>
@@ -11771,7 +12645,7 @@
         </w:tc>
         <w:tc>
           <w:tcPr>
-            <w:tcW w:type="dxa" w:w="4393"/>
+            <w:tcW w:type="dxa" w:w="4819"/>
             <w:tcMar>
               <w:top w:type="dxa" w:w="60"/>
               <w:left w:type="dxa" w:w="100"/>
@@ -11805,6 +12679,25 @@
       <w:pPr>
         <w:spacing w:after="80"/>
       </w:pPr>
+    </w:p>
+    <w:p>
+      <w:pPr>
+        <w:spacing w:after="100" w:line="264"/>
+        <w:jc w:val="both"/>
+      </w:pPr>
+      <w:r>
+        <w:rPr>
+          <w:rFonts w:ascii="Cambria" w:cs="Cambria" w:eastAsia="Cambria" w:hAnsi="Cambria"/>
+          <w:b w:val="false"/>
+          <w:bCs w:val="false"/>
+          <w:i w:val="false"/>
+          <w:iCs w:val="false"/>
+          <w:color w:val="000000"/>
+          <w:sz w:val="20"/>
+          <w:szCs w:val="20"/>
+        </w:rPr>
+        <w:t xml:space="preserve">Seuls deux de ces cinq fichiers sont indexés en phase 4. Les trois agrégats restent en Parquet et servent de point de comparaison pour vérifier les chiffres affichés par Kibana ; la raison de ce choix est expliquée en section 6.2.</w:t>
+      </w:r>
     </w:p>
     <w:p>
       <w:pPr>

</xml_diff>

<commit_message>
Reduit le rapport et retire les developpements optionnels
Supprime la section sur les garanties de sequentialite, dont l'essentiel tient
en un paragraphe, et le tableau des anti-patterns Cassandra ecartes. Condense
les index Oracle, les proprietes du jeu genere, le cout du modele NoSQL, la
segmentation RFM, les proprietes de Parquet, les reglages de mapping et les
difficultes rencontrees. Renumerote les sous-sections des chapitres 2 et 4.

Environ 7 500 mots contre 8 400, soit deux pages de moins, sans retirer les
justifications que le sujet demande.

Co-Authored-By: Claude Opus 5 <noreply@anthropic.com>
Claude-Session: https://claude.ai/code/session_01BdhnZ8AfEoSHq2Y7betErz
</commit_message>
<xml_diff>
--- a/rapport/rapport.docx
+++ b/rapport/rapport.docx
@@ -324,7 +324,7 @@
           <w:sz w:val="20"/>
           <w:szCs w:val="20"/>
         </w:rPr>
-        <w:t xml:space="preserve">2.3 Ce qui garantit réellement la séquentialité</w:t>
+        <w:t xml:space="preserve">2.3 Budget mémoire</w:t>
       </w:r>
     </w:p>
     <w:p>
@@ -339,22 +339,7 @@
           <w:sz w:val="20"/>
           <w:szCs w:val="20"/>
         </w:rPr>
-        <w:t xml:space="preserve">2.4 Budget mémoire</w:t>
-      </w:r>
-    </w:p>
-    <w:p>
-      <w:pPr>
-        <w:spacing w:after="30"/>
-        <w:ind w:left="340"/>
-      </w:pPr>
-      <w:r>
-        <w:rPr>
-          <w:rFonts w:ascii="Calibri" w:cs="Calibri" w:eastAsia="Calibri" w:hAnsi="Calibri"/>
-          <w:color w:val="404040"/>
-          <w:sz w:val="20"/>
-          <w:szCs w:val="20"/>
-        </w:rPr>
-        <w:t xml:space="preserve">2.5 Organisation du dépôt</w:t>
+        <w:t xml:space="preserve">2.4 Organisation du dépôt</w:t>
       </w:r>
     </w:p>
     <w:p>
@@ -551,7 +536,7 @@
           <w:sz w:val="20"/>
           <w:szCs w:val="20"/>
         </w:rPr>
-        <w:t xml:space="preserve">4.4 Les anti-patterns écartés</w:t>
+        <w:t xml:space="preserve">4.4 Le type utilisateur order_item</w:t>
       </w:r>
     </w:p>
     <w:p>
@@ -566,7 +551,7 @@
           <w:sz w:val="20"/>
           <w:szCs w:val="20"/>
         </w:rPr>
-        <w:t xml:space="preserve">4.5 Le type utilisateur order_item</w:t>
+        <w:t xml:space="preserve">4.5 Le chargement</w:t>
       </w:r>
     </w:p>
     <w:p>
@@ -581,22 +566,7 @@
           <w:sz w:val="20"/>
           <w:szCs w:val="20"/>
         </w:rPr>
-        <w:t xml:space="preserve">4.6 Le chargement</w:t>
-      </w:r>
-    </w:p>
-    <w:p>
-      <w:pPr>
-        <w:spacing w:after="30"/>
-        <w:ind w:left="340"/>
-      </w:pPr>
-      <w:r>
-        <w:rPr>
-          <w:rFonts w:ascii="Calibri" w:cs="Calibri" w:eastAsia="Calibri" w:hAnsi="Calibri"/>
-          <w:color w:val="404040"/>
-          <w:sz w:val="20"/>
-          <w:szCs w:val="20"/>
-        </w:rPr>
-        <w:t xml:space="preserve">4.7 Ce que le modèle fait perdre</w:t>
+        <w:t xml:space="preserve">4.6 Ce que le modèle fait perdre</w:t>
       </w:r>
     </w:p>
     <w:p>
@@ -1227,7 +1197,7 @@
           <w:sz w:val="20"/>
           <w:szCs w:val="20"/>
         </w:rPr>
-        <w:t xml:space="preserve">Ce thème contient les trois formes de relation qui rendent l'exercice intéressant : une relation 1-N classique entre un client et ses commandes ; une relation 1-N à cardinalité variable entre une commande et ses lignes, exactement ce qu'une base orientée documents sait absorber et qu'une base relationnelle doit éclater ; et une hiérarchie réflexive dans les catégories, qui n'a pas d'équivalent direct en CQL. Un thème plus plat, des relevés de capteurs par exemple, aurait rendu l'étape de dénormalisation presque triviale.</w:t>
+        <w:t xml:space="preserve">Ce thème contient les trois formes de relation qui rendent l'exercice intéressant : une relation 1-N entre un client et ses commandes ; une relation 1-N à cardinalité variable entre une commande et ses lignes, exactement ce qu'une base orientée documents sait absorber et qu'une base relationnelle doit éclater ; et une hiérarchie réflexive dans les catégories, sans équivalent direct en CQL.</w:t>
       </w:r>
     </w:p>
     <w:p>
@@ -2347,6 +2317,103 @@
     </w:p>
     <w:p>
       <w:pPr>
+        <w:spacing w:after="100" w:line="264"/>
+        <w:jc w:val="both"/>
+      </w:pPr>
+      <w:r>
+        <w:rPr>
+          <w:rFonts w:ascii="Cambria" w:cs="Cambria" w:eastAsia="Cambria" w:hAnsi="Cambria"/>
+          <w:b w:val="false"/>
+          <w:bCs w:val="false"/>
+          <w:i w:val="false"/>
+          <w:iCs w:val="false"/>
+          <w:color w:val="000000"/>
+          <w:sz w:val="20"/>
+          <w:szCs w:val="20"/>
+        </w:rPr>
+        <w:t xml:space="preserve">Trois choses assurent que les phases ne se chevauchent pas. Les services du </w:t>
+      </w:r>
+      <w:r>
+        <w:rPr>
+          <w:rFonts w:ascii="Consolas" w:cs="Consolas" w:eastAsia="Consolas" w:hAnsi="Consolas"/>
+          <w:b w:val="false"/>
+          <w:bCs w:val="false"/>
+          <w:i w:val="false"/>
+          <w:iCs w:val="false"/>
+          <w:color w:val="000000"/>
+          <w:sz w:val="18"/>
+          <w:szCs w:val="18"/>
+        </w:rPr>
+        <w:t xml:space="preserve">docker-compose.yml</w:t>
+      </w:r>
+      <w:r>
+        <w:rPr>
+          <w:rFonts w:ascii="Cambria" w:cs="Cambria" w:eastAsia="Cambria" w:hAnsi="Cambria"/>
+          <w:b w:val="false"/>
+          <w:bCs w:val="false"/>
+          <w:i w:val="false"/>
+          <w:iCs w:val="false"/>
+          <w:color w:val="000000"/>
+          <w:sz w:val="20"/>
+          <w:szCs w:val="20"/>
+        </w:rPr>
+        <w:t xml:space="preserve"> portent tous un </w:t>
+      </w:r>
+      <w:r>
+        <w:rPr>
+          <w:rFonts w:ascii="Consolas" w:cs="Consolas" w:eastAsia="Consolas" w:hAnsi="Consolas"/>
+          <w:b w:val="false"/>
+          <w:bCs w:val="false"/>
+          <w:i w:val="false"/>
+          <w:iCs w:val="false"/>
+          <w:color w:val="000000"/>
+          <w:sz w:val="18"/>
+          <w:szCs w:val="18"/>
+        </w:rPr>
+        <w:t xml:space="preserve">profiles:</w:t>
+      </w:r>
+      <w:r>
+        <w:rPr>
+          <w:rFonts w:ascii="Cambria" w:cs="Cambria" w:eastAsia="Cambria" w:hAnsi="Cambria"/>
+          <w:b w:val="false"/>
+          <w:bCs w:val="false"/>
+          <w:i w:val="false"/>
+          <w:iCs w:val="false"/>
+          <w:color w:val="000000"/>
+          <w:sz w:val="20"/>
+          <w:szCs w:val="20"/>
+        </w:rPr>
+        <w:t xml:space="preserve">, donc </w:t>
+      </w:r>
+      <w:r>
+        <w:rPr>
+          <w:rFonts w:ascii="Consolas" w:cs="Consolas" w:eastAsia="Consolas" w:hAnsi="Consolas"/>
+          <w:b w:val="false"/>
+          <w:bCs w:val="false"/>
+          <w:i w:val="false"/>
+          <w:iCs w:val="false"/>
+          <w:color w:val="000000"/>
+          <w:sz w:val="18"/>
+          <w:szCs w:val="18"/>
+        </w:rPr>
+        <w:t xml:space="preserve">docker compose up</w:t>
+      </w:r>
+      <w:r>
+        <w:rPr>
+          <w:rFonts w:ascii="Cambria" w:cs="Cambria" w:eastAsia="Cambria" w:hAnsi="Cambria"/>
+          <w:b w:val="false"/>
+          <w:bCs w:val="false"/>
+          <w:i w:val="false"/>
+          <w:iCs w:val="false"/>
+          <w:color w:val="000000"/>
+          <w:sz w:val="20"/>
+          <w:szCs w:val="20"/>
+        </w:rPr>
+        <w:t xml:space="preserve"> sans argument ne démarre rien : il faut nommer la phase. Les scripts refusent de démarrer si une phase précédente tourne encore. Et chaque script rappelle en fin d'exécution la commande d'extinction à lancer. Les volumes étant nommés, éteindre une phase n'efface pas ses données.</w:t>
+      </w:r>
+    </w:p>
+    <w:p>
+      <w:pPr>
         <w:pStyle w:val="Heading2"/>
         <w:keepNext/>
         <w:spacing w:after="120" w:before="240"/>
@@ -2360,565 +2427,7 @@
           <w:sz w:val="24"/>
           <w:szCs w:val="24"/>
         </w:rPr>
-        <w:t xml:space="preserve">2.3 Ce qui garantit réellement la séquentialité</w:t>
-      </w:r>
-    </w:p>
-    <w:p>
-      <w:pPr>
-        <w:spacing w:after="100" w:line="264"/>
-        <w:jc w:val="both"/>
-      </w:pPr>
-      <w:r>
-        <w:rPr>
-          <w:rFonts w:ascii="Cambria" w:cs="Cambria" w:eastAsia="Cambria" w:hAnsi="Cambria"/>
-          <w:b w:val="false"/>
-          <w:bCs w:val="false"/>
-          <w:i w:val="false"/>
-          <w:iCs w:val="false"/>
-          <w:color w:val="000000"/>
-          <w:sz w:val="20"/>
-          <w:szCs w:val="20"/>
-        </w:rPr>
-        <w:t xml:space="preserve">Les services du </w:t>
-      </w:r>
-      <w:r>
-        <w:rPr>
-          <w:rFonts w:ascii="Consolas" w:cs="Consolas" w:eastAsia="Consolas" w:hAnsi="Consolas"/>
-          <w:b w:val="false"/>
-          <w:bCs w:val="false"/>
-          <w:i w:val="false"/>
-          <w:iCs w:val="false"/>
-          <w:color w:val="000000"/>
-          <w:sz w:val="18"/>
-          <w:szCs w:val="18"/>
-        </w:rPr>
-        <w:t xml:space="preserve">docker-compose.yml</w:t>
-      </w:r>
-      <w:r>
-        <w:rPr>
-          <w:rFonts w:ascii="Cambria" w:cs="Cambria" w:eastAsia="Cambria" w:hAnsi="Cambria"/>
-          <w:b w:val="false"/>
-          <w:bCs w:val="false"/>
-          <w:i w:val="false"/>
-          <w:iCs w:val="false"/>
-          <w:color w:val="000000"/>
-          <w:sz w:val="20"/>
-          <w:szCs w:val="20"/>
-        </w:rPr>
-        <w:t xml:space="preserve"> portent tous un </w:t>
-      </w:r>
-      <w:r>
-        <w:rPr>
-          <w:rFonts w:ascii="Consolas" w:cs="Consolas" w:eastAsia="Consolas" w:hAnsi="Consolas"/>
-          <w:b w:val="false"/>
-          <w:bCs w:val="false"/>
-          <w:i w:val="false"/>
-          <w:iCs w:val="false"/>
-          <w:color w:val="000000"/>
-          <w:sz w:val="18"/>
-          <w:szCs w:val="18"/>
-        </w:rPr>
-        <w:t xml:space="preserve">profiles:</w:t>
-      </w:r>
-      <w:r>
-        <w:rPr>
-          <w:rFonts w:ascii="Cambria" w:cs="Cambria" w:eastAsia="Cambria" w:hAnsi="Cambria"/>
-          <w:b w:val="false"/>
-          <w:bCs w:val="false"/>
-          <w:i w:val="false"/>
-          <w:iCs w:val="false"/>
-          <w:color w:val="000000"/>
-          <w:sz w:val="20"/>
-          <w:szCs w:val="20"/>
-        </w:rPr>
-        <w:t xml:space="preserve">, si bien qu'un </w:t>
-      </w:r>
-      <w:r>
-        <w:rPr>
-          <w:rFonts w:ascii="Consolas" w:cs="Consolas" w:eastAsia="Consolas" w:hAnsi="Consolas"/>
-          <w:b w:val="false"/>
-          <w:bCs w:val="false"/>
-          <w:i w:val="false"/>
-          <w:iCs w:val="false"/>
-          <w:color w:val="000000"/>
-          <w:sz w:val="18"/>
-          <w:szCs w:val="18"/>
-        </w:rPr>
-        <w:t xml:space="preserve">docker compose up</w:t>
-      </w:r>
-      <w:r>
-        <w:rPr>
-          <w:rFonts w:ascii="Cambria" w:cs="Cambria" w:eastAsia="Cambria" w:hAnsi="Cambria"/>
-          <w:b w:val="false"/>
-          <w:bCs w:val="false"/>
-          <w:i w:val="false"/>
-          <w:iCs w:val="false"/>
-          <w:color w:val="000000"/>
-          <w:sz w:val="20"/>
-          <w:szCs w:val="20"/>
-        </w:rPr>
-        <w:t xml:space="preserve"> sans argument ne démarre rien : il faut nommer la phase. Je précise que les profils </w:t>
-      </w:r>
-      <w:r>
-        <w:rPr>
-          <w:rFonts w:ascii="Cambria" w:cs="Cambria" w:eastAsia="Cambria" w:hAnsi="Cambria"/>
-          <w:b/>
-          <w:bCs/>
-          <w:i w:val="false"/>
-          <w:iCs w:val="false"/>
-          <w:color w:val="000000"/>
-          <w:sz w:val="20"/>
-          <w:szCs w:val="20"/>
-        </w:rPr>
-        <w:t xml:space="preserve">ne suffisent pas</w:t>
-      </w:r>
-      <w:r>
-        <w:rPr>
-          <w:rFonts w:ascii="Cambria" w:cs="Cambria" w:eastAsia="Cambria" w:hAnsi="Cambria"/>
-          <w:b w:val="false"/>
-          <w:bCs w:val="false"/>
-          <w:i w:val="false"/>
-          <w:iCs w:val="false"/>
-          <w:color w:val="000000"/>
-          <w:sz w:val="20"/>
-          <w:szCs w:val="20"/>
-        </w:rPr>
-        <w:t xml:space="preserve"> à garantir la séquentialité : rien n'interdit d'activer deux profils l'un après l'autre sans arrêter le premier. Ils réduisent le risque d'un démarrage involontaire, sans plus.</w:t>
-      </w:r>
-    </w:p>
-    <w:p>
-      <w:pPr>
-        <w:spacing w:after="100" w:line="264"/>
-        <w:jc w:val="both"/>
-      </w:pPr>
-      <w:r>
-        <w:rPr>
-          <w:rFonts w:ascii="Cambria" w:cs="Cambria" w:eastAsia="Cambria" w:hAnsi="Cambria"/>
-          <w:b w:val="false"/>
-          <w:bCs w:val="false"/>
-          <w:i w:val="false"/>
-          <w:iCs w:val="false"/>
-          <w:color w:val="000000"/>
-          <w:sz w:val="20"/>
-          <w:szCs w:val="20"/>
-        </w:rPr>
-        <w:t xml:space="preserve">La garantie effective repose sur trois éléments qui se complètent :</w:t>
-      </w:r>
-    </w:p>
-    <w:tbl>
-      <w:tblPr>
-        <w:tblW w:type="dxa" w:w="9639"/>
-        <w:tblBorders>
-          <w:top w:val="single" w:color="BFBFBF" w:sz="4"/>
-          <w:left w:val="single" w:color="BFBFBF" w:sz="4"/>
-          <w:bottom w:val="single" w:color="BFBFBF" w:sz="4"/>
-          <w:right w:val="single" w:color="BFBFBF" w:sz="4"/>
-          <w:insideH w:val="single" w:color="BFBFBF" w:sz="2"/>
-          <w:insideV w:val="single" w:color="BFBFBF" w:sz="2"/>
-        </w:tblBorders>
-      </w:tblPr>
-      <w:tblGrid>
-        <w:gridCol w:w="3486"/>
-        <w:gridCol w:w="6153"/>
-      </w:tblGrid>
-      <w:tr>
-        <w:trPr>
-          <w:tblHeader/>
-        </w:trPr>
-        <w:tc>
-          <w:tcPr>
-            <w:tcW w:type="dxa" w:w="3486"/>
-            <w:shd w:fill="E8EAEE" w:val="clear"/>
-            <w:tcMar>
-              <w:top w:type="dxa" w:w="60"/>
-              <w:left w:type="dxa" w:w="100"/>
-              <w:bottom w:type="dxa" w:w="60"/>
-              <w:right w:type="dxa" w:w="100"/>
-            </w:tcMar>
-          </w:tcPr>
-          <w:p>
-            <w:pPr>
-              <w:spacing w:after="0" w:line="240"/>
-              <w:jc w:val="left"/>
-            </w:pPr>
-            <w:r>
-              <w:rPr>
-                <w:rFonts w:ascii="Cambria" w:cs="Cambria" w:eastAsia="Cambria" w:hAnsi="Cambria"/>
-                <w:b/>
-                <w:bCs/>
-                <w:i w:val="false"/>
-                <w:iCs w:val="false"/>
-                <w:color w:val="1F3864"/>
-                <w:sz w:val="19"/>
-                <w:szCs w:val="19"/>
-              </w:rPr>
-              <w:t xml:space="preserve">Élément</w:t>
-            </w:r>
-          </w:p>
-        </w:tc>
-        <w:tc>
-          <w:tcPr>
-            <w:tcW w:type="dxa" w:w="6153"/>
-            <w:shd w:fill="E8EAEE" w:val="clear"/>
-            <w:tcMar>
-              <w:top w:type="dxa" w:w="60"/>
-              <w:left w:type="dxa" w:w="100"/>
-              <w:bottom w:type="dxa" w:w="60"/>
-              <w:right w:type="dxa" w:w="100"/>
-            </w:tcMar>
-          </w:tcPr>
-          <w:p>
-            <w:pPr>
-              <w:spacing w:after="0" w:line="240"/>
-              <w:jc w:val="left"/>
-            </w:pPr>
-            <w:r>
-              <w:rPr>
-                <w:rFonts w:ascii="Cambria" w:cs="Cambria" w:eastAsia="Cambria" w:hAnsi="Cambria"/>
-                <w:b/>
-                <w:bCs/>
-                <w:i w:val="false"/>
-                <w:iCs w:val="false"/>
-                <w:color w:val="1F3864"/>
-                <w:sz w:val="19"/>
-                <w:szCs w:val="19"/>
-              </w:rPr>
-              <w:t xml:space="preserve">Ce qu'il apporte</w:t>
-            </w:r>
-          </w:p>
-        </w:tc>
-      </w:tr>
-      <w:tr>
-        <w:tc>
-          <w:tcPr>
-            <w:tcW w:type="dxa" w:w="3486"/>
-            <w:tcMar>
-              <w:top w:type="dxa" w:w="60"/>
-              <w:left w:type="dxa" w:w="100"/>
-              <w:bottom w:type="dxa" w:w="60"/>
-              <w:right w:type="dxa" w:w="100"/>
-            </w:tcMar>
-          </w:tcPr>
-          <w:p>
-            <w:pPr>
-              <w:spacing w:after="0" w:line="240"/>
-              <w:jc w:val="left"/>
-            </w:pPr>
-            <w:r>
-              <w:rPr>
-                <w:rFonts w:ascii="Cambria" w:cs="Cambria" w:eastAsia="Cambria" w:hAnsi="Cambria"/>
-                <w:b w:val="false"/>
-                <w:bCs w:val="false"/>
-                <w:i w:val="false"/>
-                <w:iCs w:val="false"/>
-                <w:color w:val="000000"/>
-                <w:sz w:val="19"/>
-                <w:szCs w:val="19"/>
-              </w:rPr>
-              <w:t xml:space="preserve">Profils Compose</w:t>
-            </w:r>
-          </w:p>
-        </w:tc>
-        <w:tc>
-          <w:tcPr>
-            <w:tcW w:type="dxa" w:w="6153"/>
-            <w:tcMar>
-              <w:top w:type="dxa" w:w="60"/>
-              <w:left w:type="dxa" w:w="100"/>
-              <w:bottom w:type="dxa" w:w="60"/>
-              <w:right w:type="dxa" w:w="100"/>
-            </w:tcMar>
-          </w:tcPr>
-          <w:p>
-            <w:pPr>
-              <w:spacing w:after="0" w:line="240"/>
-              <w:jc w:val="left"/>
-            </w:pPr>
-            <w:r>
-              <w:rPr>
-                <w:rFonts w:ascii="Cambria" w:cs="Cambria" w:eastAsia="Cambria" w:hAnsi="Cambria"/>
-                <w:b w:val="false"/>
-                <w:bCs w:val="false"/>
-                <w:i w:val="false"/>
-                <w:iCs w:val="false"/>
-                <w:color w:val="000000"/>
-                <w:sz w:val="19"/>
-                <w:szCs w:val="19"/>
-              </w:rPr>
-              <w:t xml:space="preserve">sélection explicite des groupes de services</w:t>
-            </w:r>
-          </w:p>
-        </w:tc>
-      </w:tr>
-      <w:tr>
-        <w:tc>
-          <w:tcPr>
-            <w:tcW w:type="dxa" w:w="3486"/>
-            <w:tcMar>
-              <w:top w:type="dxa" w:w="60"/>
-              <w:left w:type="dxa" w:w="100"/>
-              <w:bottom w:type="dxa" w:w="60"/>
-              <w:right w:type="dxa" w:w="100"/>
-            </w:tcMar>
-          </w:tcPr>
-          <w:p>
-            <w:pPr>
-              <w:spacing w:after="0" w:line="240"/>
-              <w:jc w:val="left"/>
-            </w:pPr>
-            <w:r>
-              <w:rPr>
-                <w:rFonts w:ascii="Cambria" w:cs="Cambria" w:eastAsia="Cambria" w:hAnsi="Cambria"/>
-                <w:b w:val="false"/>
-                <w:bCs w:val="false"/>
-                <w:i w:val="false"/>
-                <w:iCs w:val="false"/>
-                <w:color w:val="000000"/>
-                <w:sz w:val="19"/>
-                <w:szCs w:val="19"/>
-              </w:rPr>
-              <w:t xml:space="preserve">Gardes des scripts de phase</w:t>
-            </w:r>
-          </w:p>
-        </w:tc>
-        <w:tc>
-          <w:tcPr>
-            <w:tcW w:type="dxa" w:w="6153"/>
-            <w:tcMar>
-              <w:top w:type="dxa" w:w="60"/>
-              <w:left w:type="dxa" w:w="100"/>
-              <w:bottom w:type="dxa" w:w="60"/>
-              <w:right w:type="dxa" w:w="100"/>
-            </w:tcMar>
-          </w:tcPr>
-          <w:p>
-            <w:pPr>
-              <w:spacing w:after="0" w:line="240"/>
-              <w:jc w:val="left"/>
-            </w:pPr>
-            <w:r>
-              <w:rPr>
-                <w:rFonts w:ascii="Cambria" w:cs="Cambria" w:eastAsia="Cambria" w:hAnsi="Cambria"/>
-                <w:b w:val="false"/>
-                <w:bCs w:val="false"/>
-                <w:i w:val="false"/>
-                <w:iCs w:val="false"/>
-                <w:color w:val="000000"/>
-                <w:sz w:val="19"/>
-                <w:szCs w:val="19"/>
-              </w:rPr>
-              <w:t xml:space="preserve">la phase 2 refuse de démarrer si Oracle tourne encore ; la phase 4 refuse si Oracle ou Cassandra tournent</w:t>
-            </w:r>
-          </w:p>
-        </w:tc>
-      </w:tr>
-      <w:tr>
-        <w:tc>
-          <w:tcPr>
-            <w:tcW w:type="dxa" w:w="3486"/>
-            <w:tcMar>
-              <w:top w:type="dxa" w:w="60"/>
-              <w:left w:type="dxa" w:w="100"/>
-              <w:bottom w:type="dxa" w:w="60"/>
-              <w:right w:type="dxa" w:w="100"/>
-            </w:tcMar>
-          </w:tcPr>
-          <w:p>
-            <w:pPr>
-              <w:spacing w:after="0" w:line="240"/>
-              <w:jc w:val="left"/>
-            </w:pPr>
-            <w:r>
-              <w:rPr>
-                <w:rFonts w:ascii="Cambria" w:cs="Cambria" w:eastAsia="Cambria" w:hAnsi="Cambria"/>
-                <w:b w:val="false"/>
-                <w:bCs w:val="false"/>
-                <w:i w:val="false"/>
-                <w:iCs w:val="false"/>
-                <w:color w:val="000000"/>
-                <w:sz w:val="19"/>
-                <w:szCs w:val="19"/>
-              </w:rPr>
-              <w:t xml:space="preserve">Commandes d'arrêt entre les étapes</w:t>
-            </w:r>
-          </w:p>
-        </w:tc>
-        <w:tc>
-          <w:tcPr>
-            <w:tcW w:type="dxa" w:w="6153"/>
-            <w:tcMar>
-              <w:top w:type="dxa" w:w="60"/>
-              <w:left w:type="dxa" w:w="100"/>
-              <w:bottom w:type="dxa" w:w="60"/>
-              <w:right w:type="dxa" w:w="100"/>
-            </w:tcMar>
-          </w:tcPr>
-          <w:p>
-            <w:pPr>
-              <w:spacing w:after="0" w:line="240"/>
-              <w:jc w:val="left"/>
-            </w:pPr>
-            <w:r>
-              <w:rPr>
-                <w:rFonts w:ascii="Cambria" w:cs="Cambria" w:eastAsia="Cambria" w:hAnsi="Cambria"/>
-                <w:b w:val="false"/>
-                <w:bCs w:val="false"/>
-                <w:i w:val="false"/>
-                <w:iCs w:val="false"/>
-                <w:color w:val="000000"/>
-                <w:sz w:val="19"/>
-                <w:szCs w:val="19"/>
-              </w:rPr>
-              <w:t xml:space="preserve">l'extinction effective, rappelée en fin de chaque script</w:t>
-            </w:r>
-          </w:p>
-        </w:tc>
-      </w:tr>
-    </w:tbl>
-    <w:p>
-      <w:pPr>
-        <w:spacing w:after="80"/>
-      </w:pPr>
-    </w:p>
-    <w:p>
-      <w:pPr>
-        <w:spacing w:after="100" w:line="264"/>
-        <w:jc w:val="both"/>
-      </w:pPr>
-      <w:r>
-        <w:rPr>
-          <w:rFonts w:ascii="Cambria" w:cs="Cambria" w:eastAsia="Cambria" w:hAnsi="Cambria"/>
-          <w:b w:val="false"/>
-          <w:bCs w:val="false"/>
-          <w:i w:val="false"/>
-          <w:iCs w:val="false"/>
-          <w:color w:val="000000"/>
-          <w:sz w:val="20"/>
-          <w:szCs w:val="20"/>
-        </w:rPr>
-        <w:t xml:space="preserve">Les volumes sont nommés (</w:t>
-      </w:r>
-      <w:r>
-        <w:rPr>
-          <w:rFonts w:ascii="Consolas" w:cs="Consolas" w:eastAsia="Consolas" w:hAnsi="Consolas"/>
-          <w:b w:val="false"/>
-          <w:bCs w:val="false"/>
-          <w:i w:val="false"/>
-          <w:iCs w:val="false"/>
-          <w:color w:val="000000"/>
-          <w:sz w:val="18"/>
-          <w:szCs w:val="18"/>
-        </w:rPr>
-        <w:t xml:space="preserve">oracle_data</w:t>
-      </w:r>
-      <w:r>
-        <w:rPr>
-          <w:rFonts w:ascii="Cambria" w:cs="Cambria" w:eastAsia="Cambria" w:hAnsi="Cambria"/>
-          <w:b w:val="false"/>
-          <w:bCs w:val="false"/>
-          <w:i w:val="false"/>
-          <w:iCs w:val="false"/>
-          <w:color w:val="000000"/>
-          <w:sz w:val="20"/>
-          <w:szCs w:val="20"/>
-        </w:rPr>
-        <w:t xml:space="preserve">, </w:t>
-      </w:r>
-      <w:r>
-        <w:rPr>
-          <w:rFonts w:ascii="Consolas" w:cs="Consolas" w:eastAsia="Consolas" w:hAnsi="Consolas"/>
-          <w:b w:val="false"/>
-          <w:bCs w:val="false"/>
-          <w:i w:val="false"/>
-          <w:iCs w:val="false"/>
-          <w:color w:val="000000"/>
-          <w:sz w:val="18"/>
-          <w:szCs w:val="18"/>
-        </w:rPr>
-        <w:t xml:space="preserve">cassandra_data</w:t>
-      </w:r>
-      <w:r>
-        <w:rPr>
-          <w:rFonts w:ascii="Cambria" w:cs="Cambria" w:eastAsia="Cambria" w:hAnsi="Cambria"/>
-          <w:b w:val="false"/>
-          <w:bCs w:val="false"/>
-          <w:i w:val="false"/>
-          <w:iCs w:val="false"/>
-          <w:color w:val="000000"/>
-          <w:sz w:val="20"/>
-          <w:szCs w:val="20"/>
-        </w:rPr>
-        <w:t xml:space="preserve">, </w:t>
-      </w:r>
-      <w:r>
-        <w:rPr>
-          <w:rFonts w:ascii="Consolas" w:cs="Consolas" w:eastAsia="Consolas" w:hAnsi="Consolas"/>
-          <w:b w:val="false"/>
-          <w:bCs w:val="false"/>
-          <w:i w:val="false"/>
-          <w:iCs w:val="false"/>
-          <w:color w:val="000000"/>
-          <w:sz w:val="18"/>
-          <w:szCs w:val="18"/>
-        </w:rPr>
-        <w:t xml:space="preserve">es_data</w:t>
-      </w:r>
-      <w:r>
-        <w:rPr>
-          <w:rFonts w:ascii="Cambria" w:cs="Cambria" w:eastAsia="Cambria" w:hAnsi="Cambria"/>
-          <w:b w:val="false"/>
-          <w:bCs w:val="false"/>
-          <w:i w:val="false"/>
-          <w:iCs w:val="false"/>
-          <w:color w:val="000000"/>
-          <w:sz w:val="20"/>
-          <w:szCs w:val="20"/>
-        </w:rPr>
-        <w:t xml:space="preserve">, </w:t>
-      </w:r>
-      <w:r>
-        <w:rPr>
-          <w:rFonts w:ascii="Consolas" w:cs="Consolas" w:eastAsia="Consolas" w:hAnsi="Consolas"/>
-          <w:b w:val="false"/>
-          <w:bCs w:val="false"/>
-          <w:i w:val="false"/>
-          <w:iCs w:val="false"/>
-          <w:color w:val="000000"/>
-          <w:sz w:val="18"/>
-          <w:szCs w:val="18"/>
-        </w:rPr>
-        <w:t xml:space="preserve">kibana_data</w:t>
-      </w:r>
-      <w:r>
-        <w:rPr>
-          <w:rFonts w:ascii="Cambria" w:cs="Cambria" w:eastAsia="Cambria" w:hAnsi="Cambria"/>
-          <w:b w:val="false"/>
-          <w:bCs w:val="false"/>
-          <w:i w:val="false"/>
-          <w:iCs w:val="false"/>
-          <w:color w:val="000000"/>
-          <w:sz w:val="20"/>
-          <w:szCs w:val="20"/>
-        </w:rPr>
-        <w:t xml:space="preserve">) : éteindre une phase n'efface pas ses données, et l'on peut revenir sur une phase antérieure sans tout rejouer.</w:t>
-      </w:r>
-    </w:p>
-    <w:p>
-      <w:pPr>
-        <w:pStyle w:val="Heading2"/>
-        <w:keepNext/>
-        <w:spacing w:after="120" w:before="240"/>
-      </w:pPr>
-      <w:r>
-        <w:rPr>
-          <w:rFonts w:ascii="Calibri" w:cs="Calibri" w:eastAsia="Calibri" w:hAnsi="Calibri"/>
-          <w:b/>
-          <w:bCs/>
-          <w:color w:val="2F5496"/>
-          <w:sz w:val="24"/>
-          <w:szCs w:val="24"/>
-        </w:rPr>
-        <w:t xml:space="preserve">2.4 Budget mémoire</w:t>
+        <w:t xml:space="preserve">2.3 Budget mémoire</w:t>
       </w:r>
     </w:p>
     <w:p>
@@ -3680,7 +3189,7 @@
           <w:sz w:val="24"/>
           <w:szCs w:val="24"/>
         </w:rPr>
-        <w:t xml:space="preserve">2.5 Organisation du dépôt</w:t>
+        <w:t xml:space="preserve">2.4 Organisation du dépôt</w:t>
       </w:r>
     </w:p>
     <w:p>
@@ -5325,26 +4834,7 @@
           <w:sz w:val="20"/>
           <w:szCs w:val="20"/>
         </w:rPr>
-        <w:t xml:space="preserve">, pour les accès effectivement utilisés par le projet. Ils peuvent accélérer les recherches et certaines jointures selon le plan retenu par l'optimiseur ; pour une extraction de masse, un balayage complet reste souvent le meilleur choix, et je n'ai pas cherché à l'empêcher.</w:t>
-      </w:r>
-    </w:p>
-    <w:p>
-      <w:pPr>
-        <w:spacing w:after="100" w:line="264"/>
-        <w:jc w:val="both"/>
-      </w:pPr>
-      <w:r>
-        <w:rPr>
-          <w:rFonts w:ascii="Cambria" w:cs="Cambria" w:eastAsia="Cambria" w:hAnsi="Cambria"/>
-          <w:b w:val="false"/>
-          <w:bCs w:val="false"/>
-          <w:i w:val="false"/>
-          <w:iCs w:val="false"/>
-          <w:color w:val="000000"/>
-          <w:sz w:val="20"/>
-          <w:szCs w:val="20"/>
-        </w:rPr>
-        <w:t xml:space="preserve">Un index mérite un commentaire particulier. </w:t>
+        <w:t xml:space="preserve">, pour les accès utilisés par le projet. L'un d'eux mérite d'être signalé : </w:t>
       </w:r>
       <w:r>
         <w:rPr>
@@ -5396,39 +4886,7 @@
           <w:sz w:val="20"/>
           <w:szCs w:val="20"/>
         </w:rPr>
-        <w:t xml:space="preserve"> : même clé d'accès, même ordre de tri. La différence est qu'Oracle passe par une structure annexe, l'index, tandis que Cassandra rangera directement les lignes dans cet ordre sur le disque. Même besoin métier, deux mises en œuvre.</w:t>
-      </w:r>
-    </w:p>
-    <w:p>
-      <w:pPr>
-        <w:spacing w:after="100" w:line="264"/>
-        <w:jc w:val="both"/>
-      </w:pPr>
-      <w:r>
-        <w:rPr>
-          <w:rFonts w:ascii="Consolas" w:cs="Consolas" w:eastAsia="Consolas" w:hAnsi="Consolas"/>
-          <w:b w:val="false"/>
-          <w:bCs w:val="false"/>
-          <w:i w:val="false"/>
-          <w:iCs w:val="false"/>
-          <w:color w:val="000000"/>
-          <w:sz w:val="18"/>
-          <w:szCs w:val="18"/>
-        </w:rPr>
-        <w:t xml:space="preserve">ORDER_ITEMS(order_id)</w:t>
-      </w:r>
-      <w:r>
-        <w:rPr>
-          <w:rFonts w:ascii="Cambria" w:cs="Cambria" w:eastAsia="Cambria" w:hAnsi="Cambria"/>
-          <w:b w:val="false"/>
-          <w:bCs w:val="false"/>
-          <w:i w:val="false"/>
-          <w:iCs w:val="false"/>
-          <w:color w:val="000000"/>
-          <w:sz w:val="20"/>
-          <w:szCs w:val="20"/>
-        </w:rPr>
-        <w:t xml:space="preserve"> n'est volontairement pas indexé séparément : la colonne est déjà le préfixe de la clé primaire composite.</w:t>
+        <w:t xml:space="preserve">, même clé d'accès et même ordre de tri. La différence est qu'Oracle passe par une structure annexe alors que Cassandra rangera directement les lignes dans cet ordre sur le disque.</w:t>
       </w:r>
     </w:p>
     <w:p>
@@ -6068,7 +5526,7 @@
           <w:sz w:val="20"/>
           <w:szCs w:val="20"/>
         </w:rPr>
-        <w:t xml:space="preserve">Le réalisme du générateur n'est pas cosmétique. Trois propriétés sont injectées volontairement, chacune pour une raison précise en aval : une </w:t>
+        <w:t xml:space="preserve">Le générateur injecte volontairement trois propriétés, chacune pour une raison en aval : une </w:t>
       </w:r>
       <w:r>
         <w:rPr>
@@ -6094,7 +5552,7 @@
           <w:sz w:val="20"/>
           <w:szCs w:val="20"/>
         </w:rPr>
-        <w:t xml:space="preserve">, avec un pic de novembre-décembre au double du niveau moyen et un creux en août, sans laquelle la courbe temporelle du tableau de bord serait une ligne plate ; une </w:t>
+        <w:t xml:space="preserve">, avec un pic en novembre-décembre, sans laquelle la courbe du tableau de bord serait plate ; une </w:t>
       </w:r>
       <w:r>
         <w:rPr>
@@ -6120,7 +5578,7 @@
           <w:sz w:val="20"/>
           <w:szCs w:val="20"/>
         </w:rPr>
-        <w:t xml:space="preserve"> sur les produits comme sur les clients, environ 20 % des produits concentrant 70 % des lignes, déséquilibre qui donne son sens à la segmentation RFM de la phase 3 et rend visible en phase 2 le fait que les partitions Cassandra ne sont pas de tailles égales ; et un </w:t>
+        <w:t xml:space="preserve">, où environ 20 % des produits concentrent 70 % des lignes, ce qui donne son sens à la segmentation RFM ; et un </w:t>
       </w:r>
       <w:r>
         <w:rPr>
@@ -6146,52 +5604,7 @@
           <w:sz w:val="20"/>
           <w:szCs w:val="20"/>
         </w:rPr>
-        <w:t xml:space="preserve"> avec un pic en soirée, qui rend l'histogramme par heure exploitable.</w:t>
-      </w:r>
-    </w:p>
-    <w:p>
-      <w:pPr>
-        <w:spacing w:after="100" w:line="264"/>
-        <w:jc w:val="both"/>
-      </w:pPr>
-      <w:r>
-        <w:rPr>
-          <w:rFonts w:ascii="Cambria" w:cs="Cambria" w:eastAsia="Cambria" w:hAnsi="Cambria"/>
-          <w:b w:val="false"/>
-          <w:bCs w:val="false"/>
-          <w:i w:val="false"/>
-          <w:iCs w:val="false"/>
-          <w:color w:val="000000"/>
-          <w:sz w:val="20"/>
-          <w:szCs w:val="20"/>
-        </w:rPr>
-        <w:t xml:space="preserve">Les fourchettes de prix sont définies par </w:t>
-      </w:r>
-      <w:r>
-        <w:rPr>
-          <w:rFonts w:ascii="Cambria" w:cs="Cambria" w:eastAsia="Cambria" w:hAnsi="Cambria"/>
-          <w:b/>
-          <w:bCs/>
-          <w:i w:val="false"/>
-          <w:iCs w:val="false"/>
-          <w:color w:val="000000"/>
-          <w:sz w:val="20"/>
-          <w:szCs w:val="20"/>
-        </w:rPr>
-        <w:t xml:space="preserve">type de produit</w:t>
-      </w:r>
-      <w:r>
-        <w:rPr>
-          <w:rFonts w:ascii="Cambria" w:cs="Cambria" w:eastAsia="Cambria" w:hAnsi="Cambria"/>
-          <w:b w:val="false"/>
-          <w:bCs w:val="false"/>
-          <w:i w:val="false"/>
-          <w:iCs w:val="false"/>
-          <w:color w:val="000000"/>
-          <w:sz w:val="20"/>
-          <w:szCs w:val="20"/>
-        </w:rPr>
-        <w:t xml:space="preserve"> et non par catégorie. Ce détail vient d'une correction : avec une fourchette unique par catégorie, « Périphériques » allant de 19 à 549 €, une webcam pouvait ressortir à 500 € et un écran 27 pouces à 20 €, ce qui rendait le tableau des meilleures ventes absurde à la lecture. Chaque catégorie feuille porte donc trois à quatre types de produits, chacun avec sa propre fourchette.</w:t>
+        <w:t xml:space="preserve"> avec un pic en soirée.</w:t>
       </w:r>
     </w:p>
     <w:p>
@@ -9129,7 +8542,25 @@
           <w:sz w:val="24"/>
           <w:szCs w:val="24"/>
         </w:rPr>
-        <w:t xml:space="preserve">4.4 Les anti-patterns écartés</w:t>
+        <w:t xml:space="preserve">4.4 Le type utilisateur order_item</w:t>
+      </w:r>
+    </w:p>
+    <w:p>
+      <w:pPr>
+        <w:keepNext w:val="false"/>
+        <w:keepLines/>
+        <w:shd w:fill="F4F5F7" w:val="clear"/>
+        <w:spacing w:after="160" w:before="60" w:line="230"/>
+        <w:ind w:left="170" w:right="100"/>
+      </w:pPr>
+      <w:r>
+        <w:rPr>
+          <w:rFonts w:ascii="Consolas" w:cs="Consolas" w:eastAsia="Consolas" w:hAnsi="Consolas"/>
+          <w:color w:val="1A1A1A"/>
+          <w:sz w:val="17"/>
+          <w:szCs w:val="17"/>
+        </w:rPr>
+        <w:t xml:space="preserve">items list&lt;frozen&lt;order_item&gt;&gt;</w:t>
       </w:r>
     </w:p>
     <w:p>
@@ -9148,322 +8579,157 @@
           <w:sz w:val="20"/>
           <w:szCs w:val="20"/>
         </w:rPr>
-        <w:t xml:space="preserve">J'ai envisagé puis écarté trois modélisations alternatives. Les mentionner me paraît plus utile que de ne présenter que la solution retenue.</w:t>
-      </w:r>
-    </w:p>
-    <w:tbl>
-      <w:tblPr>
-        <w:tblW w:type="dxa" w:w="9639"/>
-        <w:tblBorders>
-          <w:top w:val="single" w:color="BFBFBF" w:sz="4"/>
-          <w:left w:val="single" w:color="BFBFBF" w:sz="4"/>
-          <w:bottom w:val="single" w:color="BFBFBF" w:sz="4"/>
-          <w:right w:val="single" w:color="BFBFBF" w:sz="4"/>
-          <w:insideH w:val="single" w:color="BFBFBF" w:sz="2"/>
-          <w:insideV w:val="single" w:color="BFBFBF" w:sz="2"/>
-        </w:tblBorders>
-      </w:tblPr>
-      <w:tblGrid>
-        <w:gridCol w:w="3486"/>
-        <w:gridCol w:w="6153"/>
-      </w:tblGrid>
-      <w:tr>
-        <w:trPr>
-          <w:tblHeader/>
-        </w:trPr>
-        <w:tc>
-          <w:tcPr>
-            <w:tcW w:type="dxa" w:w="3486"/>
-            <w:shd w:fill="E8EAEE" w:val="clear"/>
-            <w:tcMar>
-              <w:top w:type="dxa" w:w="60"/>
-              <w:left w:type="dxa" w:w="100"/>
-              <w:bottom w:type="dxa" w:w="60"/>
-              <w:right w:type="dxa" w:w="100"/>
-            </w:tcMar>
-          </w:tcPr>
-          <w:p>
-            <w:pPr>
-              <w:spacing w:after="0" w:line="240"/>
-              <w:jc w:val="left"/>
-            </w:pPr>
-            <w:r>
-              <w:rPr>
-                <w:rFonts w:ascii="Cambria" w:cs="Cambria" w:eastAsia="Cambria" w:hAnsi="Cambria"/>
-                <w:b/>
-                <w:bCs/>
-                <w:i w:val="false"/>
-                <w:iCs w:val="false"/>
-                <w:color w:val="1F3864"/>
-                <w:sz w:val="19"/>
-                <w:szCs w:val="19"/>
-              </w:rPr>
-              <w:t xml:space="preserve">Choix envisagé</w:t>
-            </w:r>
-          </w:p>
-        </w:tc>
-        <w:tc>
-          <w:tcPr>
-            <w:tcW w:type="dxa" w:w="6153"/>
-            <w:shd w:fill="E8EAEE" w:val="clear"/>
-            <w:tcMar>
-              <w:top w:type="dxa" w:w="60"/>
-              <w:left w:type="dxa" w:w="100"/>
-              <w:bottom w:type="dxa" w:w="60"/>
-              <w:right w:type="dxa" w:w="100"/>
-            </w:tcMar>
-          </w:tcPr>
-          <w:p>
-            <w:pPr>
-              <w:spacing w:after="0" w:line="240"/>
-              <w:jc w:val="left"/>
-            </w:pPr>
-            <w:r>
-              <w:rPr>
-                <w:rFonts w:ascii="Cambria" w:cs="Cambria" w:eastAsia="Cambria" w:hAnsi="Cambria"/>
-                <w:b/>
-                <w:bCs/>
-                <w:i w:val="false"/>
-                <w:iCs w:val="false"/>
-                <w:color w:val="1F3864"/>
-                <w:sz w:val="19"/>
-                <w:szCs w:val="19"/>
-              </w:rPr>
-              <w:t xml:space="preserve">Pourquoi il est mauvais</w:t>
-            </w:r>
-          </w:p>
-        </w:tc>
-      </w:tr>
-      <w:tr>
-        <w:tc>
-          <w:tcPr>
-            <w:tcW w:type="dxa" w:w="3486"/>
-            <w:tcMar>
-              <w:top w:type="dxa" w:w="60"/>
-              <w:left w:type="dxa" w:w="100"/>
-              <w:bottom w:type="dxa" w:w="60"/>
-              <w:right w:type="dxa" w:w="100"/>
-            </w:tcMar>
-          </w:tcPr>
-          <w:p>
-            <w:pPr>
-              <w:spacing w:after="0" w:line="240"/>
-              <w:jc w:val="left"/>
-            </w:pPr>
-            <w:r>
-              <w:rPr>
-                <w:rFonts w:ascii="Cambria" w:cs="Cambria" w:eastAsia="Cambria" w:hAnsi="Cambria"/>
-                <w:b w:val="false"/>
-                <w:bCs w:val="false"/>
-                <w:i w:val="false"/>
-                <w:iCs w:val="false"/>
-                <w:color w:val="000000"/>
-                <w:sz w:val="19"/>
-                <w:szCs w:val="19"/>
-              </w:rPr>
-              <w:t xml:space="preserve">Partitionner par </w:t>
-            </w:r>
-            <w:r>
-              <w:rPr>
-                <w:rFonts w:ascii="Consolas" w:cs="Consolas" w:eastAsia="Consolas" w:hAnsi="Consolas"/>
-                <w:b w:val="false"/>
-                <w:bCs w:val="false"/>
-                <w:i w:val="false"/>
-                <w:iCs w:val="false"/>
-                <w:color w:val="000000"/>
-                <w:sz w:val="18"/>
-                <w:szCs w:val="18"/>
-              </w:rPr>
-              <w:t xml:space="preserve">order_date</w:t>
-            </w:r>
-          </w:p>
-        </w:tc>
-        <w:tc>
-          <w:tcPr>
-            <w:tcW w:type="dxa" w:w="6153"/>
-            <w:tcMar>
-              <w:top w:type="dxa" w:w="60"/>
-              <w:left w:type="dxa" w:w="100"/>
-              <w:bottom w:type="dxa" w:w="60"/>
-              <w:right w:type="dxa" w:w="100"/>
-            </w:tcMar>
-          </w:tcPr>
-          <w:p>
-            <w:pPr>
-              <w:spacing w:after="0" w:line="240"/>
-              <w:jc w:val="left"/>
-            </w:pPr>
-            <w:r>
-              <w:rPr>
-                <w:rFonts w:ascii="Cambria" w:cs="Cambria" w:eastAsia="Cambria" w:hAnsi="Cambria"/>
-                <w:b w:val="false"/>
-                <w:bCs w:val="false"/>
-                <w:i w:val="false"/>
-                <w:iCs w:val="false"/>
-                <w:color w:val="000000"/>
-                <w:sz w:val="19"/>
-                <w:szCs w:val="19"/>
-              </w:rPr>
-              <w:t xml:space="preserve">toutes les commandes d'une même journée se retrouvent au même endroit, qui encaisse seul les écritures du jour.</w:t>
-            </w:r>
-          </w:p>
-        </w:tc>
-      </w:tr>
-      <w:tr>
-        <w:tc>
-          <w:tcPr>
-            <w:tcW w:type="dxa" w:w="3486"/>
-            <w:tcMar>
-              <w:top w:type="dxa" w:w="60"/>
-              <w:left w:type="dxa" w:w="100"/>
-              <w:bottom w:type="dxa" w:w="60"/>
-              <w:right w:type="dxa" w:w="100"/>
-            </w:tcMar>
-          </w:tcPr>
-          <w:p>
-            <w:pPr>
-              <w:spacing w:after="0" w:line="240"/>
-              <w:jc w:val="left"/>
-            </w:pPr>
-            <w:r>
-              <w:rPr>
-                <w:rFonts w:ascii="Cambria" w:cs="Cambria" w:eastAsia="Cambria" w:hAnsi="Cambria"/>
-                <w:b w:val="false"/>
-                <w:bCs w:val="false"/>
-                <w:i w:val="false"/>
-                <w:iCs w:val="false"/>
-                <w:color w:val="000000"/>
-                <w:sz w:val="19"/>
-                <w:szCs w:val="19"/>
-              </w:rPr>
-              <w:t xml:space="preserve">Partitionner par </w:t>
-            </w:r>
-            <w:r>
-              <w:rPr>
-                <w:rFonts w:ascii="Consolas" w:cs="Consolas" w:eastAsia="Consolas" w:hAnsi="Consolas"/>
-                <w:b w:val="false"/>
-                <w:bCs w:val="false"/>
-                <w:i w:val="false"/>
-                <w:iCs w:val="false"/>
-                <w:color w:val="000000"/>
-                <w:sz w:val="18"/>
-                <w:szCs w:val="18"/>
-              </w:rPr>
-              <w:t xml:space="preserve">order_status</w:t>
-            </w:r>
-          </w:p>
-        </w:tc>
-        <w:tc>
-          <w:tcPr>
-            <w:tcW w:type="dxa" w:w="6153"/>
-            <w:tcMar>
-              <w:top w:type="dxa" w:w="60"/>
-              <w:left w:type="dxa" w:w="100"/>
-              <w:bottom w:type="dxa" w:w="60"/>
-              <w:right w:type="dxa" w:w="100"/>
-            </w:tcMar>
-          </w:tcPr>
-          <w:p>
-            <w:pPr>
-              <w:spacing w:after="0" w:line="240"/>
-              <w:jc w:val="left"/>
-            </w:pPr>
-            <w:r>
-              <w:rPr>
-                <w:rFonts w:ascii="Cambria" w:cs="Cambria" w:eastAsia="Cambria" w:hAnsi="Cambria"/>
-                <w:b w:val="false"/>
-                <w:bCs w:val="false"/>
-                <w:i w:val="false"/>
-                <w:iCs w:val="false"/>
-                <w:color w:val="000000"/>
-                <w:sz w:val="19"/>
-                <w:szCs w:val="19"/>
-              </w:rPr>
-              <w:t xml:space="preserve">six valeurs distinctes seulement, donc six partitions énormes et très déséquilibrées.</w:t>
-            </w:r>
-          </w:p>
-        </w:tc>
-      </w:tr>
-      <w:tr>
-        <w:tc>
-          <w:tcPr>
-            <w:tcW w:type="dxa" w:w="3486"/>
-            <w:tcMar>
-              <w:top w:type="dxa" w:w="60"/>
-              <w:left w:type="dxa" w:w="100"/>
-              <w:bottom w:type="dxa" w:w="60"/>
-              <w:right w:type="dxa" w:w="100"/>
-            </w:tcMar>
-          </w:tcPr>
-          <w:p>
-            <w:pPr>
-              <w:spacing w:after="0" w:line="240"/>
-              <w:jc w:val="left"/>
-            </w:pPr>
-            <w:r>
-              <w:rPr>
-                <w:rFonts w:ascii="Cambria" w:cs="Cambria" w:eastAsia="Cambria" w:hAnsi="Cambria"/>
-                <w:b w:val="false"/>
-                <w:bCs w:val="false"/>
-                <w:i w:val="false"/>
-                <w:iCs w:val="false"/>
-                <w:color w:val="000000"/>
-                <w:sz w:val="19"/>
-                <w:szCs w:val="19"/>
-              </w:rPr>
-              <w:t xml:space="preserve">Index secondaire sur </w:t>
-            </w:r>
-            <w:r>
-              <w:rPr>
-                <w:rFonts w:ascii="Consolas" w:cs="Consolas" w:eastAsia="Consolas" w:hAnsi="Consolas"/>
-                <w:b w:val="false"/>
-                <w:bCs w:val="false"/>
-                <w:i w:val="false"/>
-                <w:iCs w:val="false"/>
-                <w:color w:val="000000"/>
-                <w:sz w:val="18"/>
-                <w:szCs w:val="18"/>
-              </w:rPr>
-              <w:t xml:space="preserve">customer_id</w:t>
-            </w:r>
-          </w:p>
-        </w:tc>
-        <w:tc>
-          <w:tcPr>
-            <w:tcW w:type="dxa" w:w="6153"/>
-            <w:tcMar>
-              <w:top w:type="dxa" w:w="60"/>
-              <w:left w:type="dxa" w:w="100"/>
-              <w:bottom w:type="dxa" w:w="60"/>
-              <w:right w:type="dxa" w:w="100"/>
-            </w:tcMar>
-          </w:tcPr>
-          <w:p>
-            <w:pPr>
-              <w:spacing w:after="0" w:line="240"/>
-              <w:jc w:val="left"/>
-            </w:pPr>
-            <w:r>
-              <w:rPr>
-                <w:rFonts w:ascii="Cambria" w:cs="Cambria" w:eastAsia="Cambria" w:hAnsi="Cambria"/>
-                <w:b w:val="false"/>
-                <w:bCs w:val="false"/>
-                <w:i w:val="false"/>
-                <w:iCs w:val="false"/>
-                <w:color w:val="000000"/>
-                <w:sz w:val="19"/>
-                <w:szCs w:val="19"/>
-              </w:rPr>
-              <w:t xml:space="preserve">un index secondaire Cassandra n'a pas le comportement d'un index SQL : la lecture doit parcourir toute la table au lieu de viser une partition.</w:t>
-            </w:r>
-          </w:p>
-        </w:tc>
-      </w:tr>
-    </w:tbl>
-    <w:p>
-      <w:pPr>
-        <w:spacing w:after="80"/>
-      </w:pPr>
+        <w:t xml:space="preserve">C'est </w:t>
+      </w:r>
+      <w:r>
+        <w:rPr>
+          <w:rFonts w:ascii="Cambria" w:cs="Cambria" w:eastAsia="Cambria" w:hAnsi="Cambria"/>
+          <w:b/>
+          <w:bCs/>
+          <w:i w:val="false"/>
+          <w:iCs w:val="false"/>
+          <w:color w:val="000000"/>
+          <w:sz w:val="20"/>
+          <w:szCs w:val="20"/>
+        </w:rPr>
+        <w:t xml:space="preserve">la</w:t>
+      </w:r>
+      <w:r>
+        <w:rPr>
+          <w:rFonts w:ascii="Cambria" w:cs="Cambria" w:eastAsia="Cambria" w:hAnsi="Cambria"/>
+          <w:b w:val="false"/>
+          <w:bCs w:val="false"/>
+          <w:i w:val="false"/>
+          <w:iCs w:val="false"/>
+          <w:color w:val="000000"/>
+          <w:sz w:val="20"/>
+          <w:szCs w:val="20"/>
+        </w:rPr>
+        <w:t xml:space="preserve"> dénormalisation. La relation 1-N entre </w:t>
+      </w:r>
+      <w:r>
+        <w:rPr>
+          <w:rFonts w:ascii="Consolas" w:cs="Consolas" w:eastAsia="Consolas" w:hAnsi="Consolas"/>
+          <w:b w:val="false"/>
+          <w:bCs w:val="false"/>
+          <w:i w:val="false"/>
+          <w:iCs w:val="false"/>
+          <w:color w:val="000000"/>
+          <w:sz w:val="18"/>
+          <w:szCs w:val="18"/>
+        </w:rPr>
+        <w:t xml:space="preserve">ORDERS</w:t>
+      </w:r>
+      <w:r>
+        <w:rPr>
+          <w:rFonts w:ascii="Cambria" w:cs="Cambria" w:eastAsia="Cambria" w:hAnsi="Cambria"/>
+          <w:b w:val="false"/>
+          <w:bCs w:val="false"/>
+          <w:i w:val="false"/>
+          <w:iCs w:val="false"/>
+          <w:color w:val="000000"/>
+          <w:sz w:val="20"/>
+          <w:szCs w:val="20"/>
+        </w:rPr>
+        <w:t xml:space="preserve"> et </w:t>
+      </w:r>
+      <w:r>
+        <w:rPr>
+          <w:rFonts w:ascii="Consolas" w:cs="Consolas" w:eastAsia="Consolas" w:hAnsi="Consolas"/>
+          <w:b w:val="false"/>
+          <w:bCs w:val="false"/>
+          <w:i w:val="false"/>
+          <w:iCs w:val="false"/>
+          <w:color w:val="000000"/>
+          <w:sz w:val="18"/>
+          <w:szCs w:val="18"/>
+        </w:rPr>
+        <w:t xml:space="preserve">ORDER_ITEMS</w:t>
+      </w:r>
+      <w:r>
+        <w:rPr>
+          <w:rFonts w:ascii="Cambria" w:cs="Cambria" w:eastAsia="Cambria" w:hAnsi="Cambria"/>
+          <w:b w:val="false"/>
+          <w:bCs w:val="false"/>
+          <w:i w:val="false"/>
+          <w:iCs w:val="false"/>
+          <w:color w:val="000000"/>
+          <w:sz w:val="20"/>
+          <w:szCs w:val="20"/>
+        </w:rPr>
+        <w:t xml:space="preserve">, qui exigeait une table séparée et une jointure en SQL, devient une collection imbriquée dans la ligne de commande. Le nom du produit, sa marque et sa catégorie sont recopiés à l'intérieur : en SQL, il aurait fallu deux jointures supplémentaires pour les obtenir.</w:t>
+      </w:r>
+    </w:p>
+    <w:p>
+      <w:pPr>
+        <w:spacing w:after="100" w:line="264"/>
+        <w:jc w:val="both"/>
+      </w:pPr>
+      <w:r>
+        <w:rPr>
+          <w:rFonts w:ascii="Cambria" w:cs="Cambria" w:eastAsia="Cambria" w:hAnsi="Cambria"/>
+          <w:b w:val="false"/>
+          <w:bCs w:val="false"/>
+          <w:i w:val="false"/>
+          <w:iCs w:val="false"/>
+          <w:color w:val="000000"/>
+          <w:sz w:val="20"/>
+          <w:szCs w:val="20"/>
+        </w:rPr>
+        <w:t xml:space="preserve">Le mot-clé </w:t>
+      </w:r>
+      <w:r>
+        <w:rPr>
+          <w:rFonts w:ascii="Consolas" w:cs="Consolas" w:eastAsia="Consolas" w:hAnsi="Consolas"/>
+          <w:b w:val="false"/>
+          <w:bCs w:val="false"/>
+          <w:i w:val="false"/>
+          <w:iCs w:val="false"/>
+          <w:color w:val="000000"/>
+          <w:sz w:val="18"/>
+          <w:szCs w:val="18"/>
+        </w:rPr>
+        <w:t xml:space="preserve">frozen</w:t>
+      </w:r>
+      <w:r>
+        <w:rPr>
+          <w:rFonts w:ascii="Cambria" w:cs="Cambria" w:eastAsia="Cambria" w:hAnsi="Cambria"/>
+          <w:b w:val="false"/>
+          <w:bCs w:val="false"/>
+          <w:i w:val="false"/>
+          <w:iCs w:val="false"/>
+          <w:color w:val="000000"/>
+          <w:sz w:val="20"/>
+          <w:szCs w:val="20"/>
+        </w:rPr>
+        <w:t xml:space="preserve"> veut dire que Cassandra stocke toute la liste comme une seule valeur. Pour modifier une seule ligne de commande, il faut donc réécrire la liste entière. C'est acceptable ici parce qu'</w:t>
+      </w:r>
+      <w:r>
+        <w:rPr>
+          <w:rFonts w:ascii="Cambria" w:cs="Cambria" w:eastAsia="Cambria" w:hAnsi="Cambria"/>
+          <w:b/>
+          <w:bCs/>
+          <w:i w:val="false"/>
+          <w:iCs w:val="false"/>
+          <w:color w:val="000000"/>
+          <w:sz w:val="20"/>
+          <w:szCs w:val="20"/>
+        </w:rPr>
+        <w:t xml:space="preserve">une commande passée ne change plus</w:t>
+      </w:r>
+      <w:r>
+        <w:rPr>
+          <w:rFonts w:ascii="Cambria" w:cs="Cambria" w:eastAsia="Cambria" w:hAnsi="Cambria"/>
+          <w:b w:val="false"/>
+          <w:bCs w:val="false"/>
+          <w:i w:val="false"/>
+          <w:iCs w:val="false"/>
+          <w:color w:val="000000"/>
+          <w:sz w:val="20"/>
+          <w:szCs w:val="20"/>
+        </w:rPr>
+        <w:t xml:space="preserve"> ; ce serait un mauvais choix pour une donnée mise à jour souvent.</w:t>
+      </w:r>
     </w:p>
     <w:p>
       <w:pPr>
@@ -9480,25 +8746,7 @@
           <w:sz w:val="24"/>
           <w:szCs w:val="24"/>
         </w:rPr>
-        <w:t xml:space="preserve">4.5 Le type utilisateur order_item</w:t>
-      </w:r>
-    </w:p>
-    <w:p>
-      <w:pPr>
-        <w:keepNext w:val="false"/>
-        <w:keepLines/>
-        <w:shd w:fill="F4F5F7" w:val="clear"/>
-        <w:spacing w:after="160" w:before="60" w:line="230"/>
-        <w:ind w:left="170" w:right="100"/>
-      </w:pPr>
-      <w:r>
-        <w:rPr>
-          <w:rFonts w:ascii="Consolas" w:cs="Consolas" w:eastAsia="Consolas" w:hAnsi="Consolas"/>
-          <w:color w:val="1A1A1A"/>
-          <w:sz w:val="17"/>
-          <w:szCs w:val="17"/>
-        </w:rPr>
-        <w:t xml:space="preserve">items list&lt;frozen&lt;order_item&gt;&gt;</w:t>
+        <w:t xml:space="preserve">4.5 Le chargement</w:t>
       </w:r>
     </w:p>
     <w:p>
@@ -9517,8 +8765,85 @@
           <w:sz w:val="20"/>
           <w:szCs w:val="20"/>
         </w:rPr>
-        <w:t xml:space="preserve">C'est </w:t>
-      </w:r>
+        <w:t xml:space="preserve">Le chargeur (</w:t>
+      </w:r>
+      <w:r>
+        <w:rPr>
+          <w:rFonts w:ascii="Consolas" w:cs="Consolas" w:eastAsia="Consolas" w:hAnsi="Consolas"/>
+          <w:b w:val="false"/>
+          <w:bCs w:val="false"/>
+          <w:i w:val="false"/>
+          <w:iCs w:val="false"/>
+          <w:color w:val="000000"/>
+          <w:sz w:val="18"/>
+          <w:szCs w:val="18"/>
+        </w:rPr>
+        <w:t xml:space="preserve">pipeline/phase2_cassandra/load_json.py</w:t>
+      </w:r>
+      <w:r>
+        <w:rPr>
+          <w:rFonts w:ascii="Cambria" w:cs="Cambria" w:eastAsia="Cambria" w:hAnsi="Cambria"/>
+          <w:b w:val="false"/>
+          <w:bCs w:val="false"/>
+          <w:i w:val="false"/>
+          <w:iCs w:val="false"/>
+          <w:color w:val="000000"/>
+          <w:sz w:val="20"/>
+          <w:szCs w:val="20"/>
+        </w:rPr>
+        <w:t xml:space="preserve">) ne connaît aucune connexion Oracle : il lit </w:t>
+      </w:r>
+      <w:r>
+        <w:rPr>
+          <w:rFonts w:ascii="Consolas" w:cs="Consolas" w:eastAsia="Consolas" w:hAnsi="Consolas"/>
+          <w:b w:val="false"/>
+          <w:bCs w:val="false"/>
+          <w:i w:val="false"/>
+          <w:iCs w:val="false"/>
+          <w:color w:val="000000"/>
+          <w:sz w:val="18"/>
+          <w:szCs w:val="18"/>
+        </w:rPr>
+        <w:t xml:space="preserve">data/json/</w:t>
+      </w:r>
+      <w:r>
+        <w:rPr>
+          <w:rFonts w:ascii="Cambria" w:cs="Cambria" w:eastAsia="Cambria" w:hAnsi="Cambria"/>
+          <w:b w:val="false"/>
+          <w:bCs w:val="false"/>
+          <w:i w:val="false"/>
+          <w:iCs w:val="false"/>
+          <w:color w:val="000000"/>
+          <w:sz w:val="20"/>
+          <w:szCs w:val="20"/>
+        </w:rPr>
+        <w:t xml:space="preserve">. C'est ce qui rend l'exécution séquentielle possible, et le script de phase refuse d'ailleurs de démarrer si le conteneur Oracle tourne encore.</w:t>
+      </w:r>
+    </w:p>
+    <w:p>
+      <w:pPr>
+        <w:spacing w:after="100" w:line="264"/>
+        <w:jc w:val="both"/>
+      </w:pPr>
+      <w:r>
+        <w:rPr>
+          <w:rFonts w:ascii="Cambria" w:cs="Cambria" w:eastAsia="Cambria" w:hAnsi="Cambria"/>
+          <w:b w:val="false"/>
+          <w:bCs w:val="false"/>
+          <w:i w:val="false"/>
+          <w:iCs w:val="false"/>
+          <w:color w:val="000000"/>
+          <w:sz w:val="20"/>
+          <w:szCs w:val="20"/>
+        </w:rPr>
+        <w:t xml:space="preserve">Deux choix techniques méritent d'être justifiés.</w:t>
+      </w:r>
+    </w:p>
+    <w:p>
+      <w:pPr>
+        <w:spacing w:after="100" w:line="264"/>
+        <w:jc w:val="both"/>
+      </w:pPr>
       <w:r>
         <w:rPr>
           <w:rFonts w:ascii="Cambria" w:cs="Cambria" w:eastAsia="Cambria" w:hAnsi="Cambria"/>
@@ -9530,46 +8855,46 @@
           <w:sz w:val="20"/>
           <w:szCs w:val="20"/>
         </w:rPr>
-        <w:t xml:space="preserve">la</w:t>
-      </w:r>
-      <w:r>
-        <w:rPr>
-          <w:rFonts w:ascii="Cambria" w:cs="Cambria" w:eastAsia="Cambria" w:hAnsi="Cambria"/>
-          <w:b w:val="false"/>
-          <w:bCs w:val="false"/>
-          <w:i w:val="false"/>
-          <w:iCs w:val="false"/>
-          <w:color w:val="000000"/>
-          <w:sz w:val="20"/>
-          <w:szCs w:val="20"/>
-        </w:rPr>
-        <w:t xml:space="preserve"> dénormalisation. La relation 1-N entre </w:t>
-      </w:r>
-      <w:r>
-        <w:rPr>
-          <w:rFonts w:ascii="Consolas" w:cs="Consolas" w:eastAsia="Consolas" w:hAnsi="Consolas"/>
-          <w:b w:val="false"/>
-          <w:bCs w:val="false"/>
+        <w:t xml:space="preserve">Pas de </w:t>
+      </w:r>
+      <w:r>
+        <w:rPr>
+          <w:rFonts w:ascii="Consolas" w:cs="Consolas" w:eastAsia="Consolas" w:hAnsi="Consolas"/>
+          <w:b/>
+          <w:bCs/>
           <w:i w:val="false"/>
           <w:iCs w:val="false"/>
           <w:color w:val="000000"/>
           <w:sz w:val="18"/>
           <w:szCs w:val="18"/>
         </w:rPr>
-        <w:t xml:space="preserve">ORDERS</w:t>
-      </w:r>
-      <w:r>
-        <w:rPr>
-          <w:rFonts w:ascii="Cambria" w:cs="Cambria" w:eastAsia="Cambria" w:hAnsi="Cambria"/>
-          <w:b w:val="false"/>
-          <w:bCs w:val="false"/>
-          <w:i w:val="false"/>
-          <w:iCs w:val="false"/>
-          <w:color w:val="000000"/>
-          <w:sz w:val="20"/>
-          <w:szCs w:val="20"/>
-        </w:rPr>
-        <w:t xml:space="preserve"> et </w:t>
+        <w:t xml:space="preserve">BatchStatement</w:t>
+      </w:r>
+      <w:r>
+        <w:rPr>
+          <w:rFonts w:ascii="Cambria" w:cs="Cambria" w:eastAsia="Cambria" w:hAnsi="Cambria"/>
+          <w:b/>
+          <w:bCs/>
+          <w:i w:val="false"/>
+          <w:iCs w:val="false"/>
+          <w:color w:val="000000"/>
+          <w:sz w:val="20"/>
+          <w:szCs w:val="20"/>
+        </w:rPr>
+        <w:t xml:space="preserve">.</w:t>
+      </w:r>
+      <w:r>
+        <w:rPr>
+          <w:rFonts w:ascii="Cambria" w:cs="Cambria" w:eastAsia="Cambria" w:hAnsi="Cambria"/>
+          <w:b w:val="false"/>
+          <w:bCs w:val="false"/>
+          <w:i w:val="false"/>
+          <w:iCs w:val="false"/>
+          <w:color w:val="000000"/>
+          <w:sz w:val="20"/>
+          <w:szCs w:val="20"/>
+        </w:rPr>
+        <w:t xml:space="preserve"> C'est un réflexe venu du SQL, et une mauvaise idée ici : un batch Cassandra sert à garantir l'atomicité à l'intérieur d'une partition, ce n'est pas un outil de performance, et il devient plus lent que les écritures individuelles dès qu'il touche plusieurs partitions. J'utilise </w:t>
       </w:r>
       <w:r>
         <w:rPr>
@@ -9582,20 +8907,20 @@
           <w:sz w:val="18"/>
           <w:szCs w:val="18"/>
         </w:rPr>
-        <w:t xml:space="preserve">ORDER_ITEMS</w:t>
-      </w:r>
-      <w:r>
-        <w:rPr>
-          <w:rFonts w:ascii="Cambria" w:cs="Cambria" w:eastAsia="Cambria" w:hAnsi="Cambria"/>
-          <w:b w:val="false"/>
-          <w:bCs w:val="false"/>
-          <w:i w:val="false"/>
-          <w:iCs w:val="false"/>
-          <w:color w:val="000000"/>
-          <w:sz w:val="20"/>
-          <w:szCs w:val="20"/>
-        </w:rPr>
-        <w:t xml:space="preserve">, qui exigeait une table séparée et une jointure en SQL, devient une collection imbriquée dans la ligne de commande. Le nom du produit, sa marque et sa catégorie sont recopiés à l'intérieur : en SQL, il aurait fallu deux jointures supplémentaires pour les obtenir.</w:t>
+        <w:t xml:space="preserve">execute_concurrent_with_args</w:t>
+      </w:r>
+      <w:r>
+        <w:rPr>
+          <w:rFonts w:ascii="Cambria" w:cs="Cambria" w:eastAsia="Cambria" w:hAnsi="Cambria"/>
+          <w:b w:val="false"/>
+          <w:bCs w:val="false"/>
+          <w:i w:val="false"/>
+          <w:iCs w:val="false"/>
+          <w:color w:val="000000"/>
+          <w:sz w:val="20"/>
+          <w:szCs w:val="20"/>
+        </w:rPr>
+        <w:t xml:space="preserve">, qui envoie soixante-quatre requêtes en parallèle.</w:t>
       </w:r>
     </w:p>
     <w:p>
@@ -9606,41 +8931,28 @@
       <w:r>
         <w:rPr>
           <w:rFonts w:ascii="Cambria" w:cs="Cambria" w:eastAsia="Cambria" w:hAnsi="Cambria"/>
-          <w:b w:val="false"/>
-          <w:bCs w:val="false"/>
-          <w:i w:val="false"/>
-          <w:iCs w:val="false"/>
-          <w:color w:val="000000"/>
-          <w:sz w:val="20"/>
-          <w:szCs w:val="20"/>
-        </w:rPr>
-        <w:t xml:space="preserve">Le mot-clé </w:t>
-      </w:r>
-      <w:r>
-        <w:rPr>
-          <w:rFonts w:ascii="Consolas" w:cs="Consolas" w:eastAsia="Consolas" w:hAnsi="Consolas"/>
-          <w:b w:val="false"/>
-          <w:bCs w:val="false"/>
+          <w:b/>
+          <w:bCs/>
+          <w:i w:val="false"/>
+          <w:iCs w:val="false"/>
+          <w:color w:val="000000"/>
+          <w:sz w:val="20"/>
+          <w:szCs w:val="20"/>
+        </w:rPr>
+        <w:t xml:space="preserve">Types monétaires en </w:t>
+      </w:r>
+      <w:r>
+        <w:rPr>
+          <w:rFonts w:ascii="Consolas" w:cs="Consolas" w:eastAsia="Consolas" w:hAnsi="Consolas"/>
+          <w:b/>
+          <w:bCs/>
           <w:i w:val="false"/>
           <w:iCs w:val="false"/>
           <w:color w:val="000000"/>
           <w:sz w:val="18"/>
           <w:szCs w:val="18"/>
         </w:rPr>
-        <w:t xml:space="preserve">frozen</w:t>
-      </w:r>
-      <w:r>
-        <w:rPr>
-          <w:rFonts w:ascii="Cambria" w:cs="Cambria" w:eastAsia="Cambria" w:hAnsi="Cambria"/>
-          <w:b w:val="false"/>
-          <w:bCs w:val="false"/>
-          <w:i w:val="false"/>
-          <w:iCs w:val="false"/>
-          <w:color w:val="000000"/>
-          <w:sz w:val="20"/>
-          <w:szCs w:val="20"/>
-        </w:rPr>
-        <w:t xml:space="preserve"> veut dire que Cassandra stocke toute la liste comme une seule valeur. Pour modifier une seule ligne de commande, il faut donc réécrire la liste entière. C'est acceptable ici parce qu'</w:t>
+        <w:t xml:space="preserve">decimal</w:t>
       </w:r>
       <w:r>
         <w:rPr>
@@ -9653,20 +8965,195 @@
           <w:sz w:val="20"/>
           <w:szCs w:val="20"/>
         </w:rPr>
-        <w:t xml:space="preserve">une commande passée ne change plus</w:t>
-      </w:r>
-      <w:r>
-        <w:rPr>
-          <w:rFonts w:ascii="Cambria" w:cs="Cambria" w:eastAsia="Cambria" w:hAnsi="Cambria"/>
-          <w:b w:val="false"/>
-          <w:bCs w:val="false"/>
-          <w:i w:val="false"/>
-          <w:iCs w:val="false"/>
-          <w:color w:val="000000"/>
-          <w:sz w:val="20"/>
-          <w:szCs w:val="20"/>
-        </w:rPr>
-        <w:t xml:space="preserve"> ; ce serait un mauvais choix pour une donnée mise à jour souvent.</w:t>
+        <w:t xml:space="preserve">, jamais en </w:t>
+      </w:r>
+      <w:r>
+        <w:rPr>
+          <w:rFonts w:ascii="Consolas" w:cs="Consolas" w:eastAsia="Consolas" w:hAnsi="Consolas"/>
+          <w:b/>
+          <w:bCs/>
+          <w:i w:val="false"/>
+          <w:iCs w:val="false"/>
+          <w:color w:val="000000"/>
+          <w:sz w:val="18"/>
+          <w:szCs w:val="18"/>
+        </w:rPr>
+        <w:t xml:space="preserve">double</w:t>
+      </w:r>
+      <w:r>
+        <w:rPr>
+          <w:rFonts w:ascii="Cambria" w:cs="Cambria" w:eastAsia="Cambria" w:hAnsi="Cambria"/>
+          <w:b/>
+          <w:bCs/>
+          <w:i w:val="false"/>
+          <w:iCs w:val="false"/>
+          <w:color w:val="000000"/>
+          <w:sz w:val="20"/>
+          <w:szCs w:val="20"/>
+        </w:rPr>
+        <w:t xml:space="preserve">.</w:t>
+      </w:r>
+      <w:r>
+        <w:rPr>
+          <w:rFonts w:ascii="Cambria" w:cs="Cambria" w:eastAsia="Cambria" w:hAnsi="Cambria"/>
+          <w:b w:val="false"/>
+          <w:bCs w:val="false"/>
+          <w:i w:val="false"/>
+          <w:iCs w:val="false"/>
+          <w:color w:val="000000"/>
+          <w:sz w:val="20"/>
+          <w:szCs w:val="20"/>
+        </w:rPr>
+        <w:t xml:space="preserve"> Un </w:t>
+      </w:r>
+      <w:r>
+        <w:rPr>
+          <w:rFonts w:ascii="Consolas" w:cs="Consolas" w:eastAsia="Consolas" w:hAnsi="Consolas"/>
+          <w:b w:val="false"/>
+          <w:bCs w:val="false"/>
+          <w:i w:val="false"/>
+          <w:iCs w:val="false"/>
+          <w:color w:val="000000"/>
+          <w:sz w:val="18"/>
+          <w:szCs w:val="18"/>
+        </w:rPr>
+        <w:t xml:space="preserve">double</w:t>
+      </w:r>
+      <w:r>
+        <w:rPr>
+          <w:rFonts w:ascii="Cambria" w:cs="Cambria" w:eastAsia="Cambria" w:hAnsi="Cambria"/>
+          <w:b w:val="false"/>
+          <w:bCs w:val="false"/>
+          <w:i w:val="false"/>
+          <w:iCs w:val="false"/>
+          <w:color w:val="000000"/>
+          <w:sz w:val="20"/>
+          <w:szCs w:val="20"/>
+        </w:rPr>
+        <w:t xml:space="preserve"> ne représente pas exactement 19,90, et l'erreur s'accumule sur des centaines de milliers de lignes agrégées. Ce choix est appliqué de bout en bout : </w:t>
+      </w:r>
+      <w:r>
+        <w:rPr>
+          <w:rFonts w:ascii="Consolas" w:cs="Consolas" w:eastAsia="Consolas" w:hAnsi="Consolas"/>
+          <w:b w:val="false"/>
+          <w:bCs w:val="false"/>
+          <w:i w:val="false"/>
+          <w:iCs w:val="false"/>
+          <w:color w:val="000000"/>
+          <w:sz w:val="18"/>
+          <w:szCs w:val="18"/>
+        </w:rPr>
+        <w:t xml:space="preserve">decimal</w:t>
+      </w:r>
+      <w:r>
+        <w:rPr>
+          <w:rFonts w:ascii="Cambria" w:cs="Cambria" w:eastAsia="Cambria" w:hAnsi="Cambria"/>
+          <w:b w:val="false"/>
+          <w:bCs w:val="false"/>
+          <w:i w:val="false"/>
+          <w:iCs w:val="false"/>
+          <w:color w:val="000000"/>
+          <w:sz w:val="20"/>
+          <w:szCs w:val="20"/>
+        </w:rPr>
+        <w:t xml:space="preserve"> en Cassandra, </w:t>
+      </w:r>
+      <w:r>
+        <w:rPr>
+          <w:rFonts w:ascii="Consolas" w:cs="Consolas" w:eastAsia="Consolas" w:hAnsi="Consolas"/>
+          <w:b w:val="false"/>
+          <w:bCs w:val="false"/>
+          <w:i w:val="false"/>
+          <w:iCs w:val="false"/>
+          <w:color w:val="000000"/>
+          <w:sz w:val="18"/>
+          <w:szCs w:val="18"/>
+        </w:rPr>
+        <w:t xml:space="preserve">decimal(14,2)</w:t>
+      </w:r>
+      <w:r>
+        <w:rPr>
+          <w:rFonts w:ascii="Cambria" w:cs="Cambria" w:eastAsia="Cambria" w:hAnsi="Cambria"/>
+          <w:b w:val="false"/>
+          <w:bCs w:val="false"/>
+          <w:i w:val="false"/>
+          <w:iCs w:val="false"/>
+          <w:color w:val="000000"/>
+          <w:sz w:val="20"/>
+          <w:szCs w:val="20"/>
+        </w:rPr>
+        <w:t xml:space="preserve"> en Parquet, </w:t>
+      </w:r>
+      <w:r>
+        <w:rPr>
+          <w:rFonts w:ascii="Consolas" w:cs="Consolas" w:eastAsia="Consolas" w:hAnsi="Consolas"/>
+          <w:b w:val="false"/>
+          <w:bCs w:val="false"/>
+          <w:i w:val="false"/>
+          <w:iCs w:val="false"/>
+          <w:color w:val="000000"/>
+          <w:sz w:val="18"/>
+          <w:szCs w:val="18"/>
+        </w:rPr>
+        <w:t xml:space="preserve">scaled_float</w:t>
+      </w:r>
+      <w:r>
+        <w:rPr>
+          <w:rFonts w:ascii="Cambria" w:cs="Cambria" w:eastAsia="Cambria" w:hAnsi="Cambria"/>
+          <w:b w:val="false"/>
+          <w:bCs w:val="false"/>
+          <w:i w:val="false"/>
+          <w:iCs w:val="false"/>
+          <w:color w:val="000000"/>
+          <w:sz w:val="20"/>
+          <w:szCs w:val="20"/>
+        </w:rPr>
+        <w:t xml:space="preserve"> en Elasticsearch.</w:t>
+      </w:r>
+    </w:p>
+    <w:p>
+      <w:pPr>
+        <w:spacing w:after="100" w:line="264"/>
+        <w:jc w:val="both"/>
+      </w:pPr>
+      <w:r>
+        <w:rPr>
+          <w:rFonts w:ascii="Cambria" w:cs="Cambria" w:eastAsia="Cambria" w:hAnsi="Cambria"/>
+          <w:b w:val="false"/>
+          <w:bCs w:val="false"/>
+          <w:i w:val="false"/>
+          <w:iCs w:val="false"/>
+          <w:color w:val="000000"/>
+          <w:sz w:val="20"/>
+          <w:szCs w:val="20"/>
+        </w:rPr>
+        <w:t xml:space="preserve">En fin de chargement, le script compte les lignes de chaque table et les compare au nombre de lignes écrites. Un </w:t>
+      </w:r>
+      <w:r>
+        <w:rPr>
+          <w:rFonts w:ascii="Consolas" w:cs="Consolas" w:eastAsia="Consolas" w:hAnsi="Consolas"/>
+          <w:b w:val="false"/>
+          <w:bCs w:val="false"/>
+          <w:i w:val="false"/>
+          <w:iCs w:val="false"/>
+          <w:color w:val="000000"/>
+          <w:sz w:val="18"/>
+          <w:szCs w:val="18"/>
+        </w:rPr>
+        <w:t xml:space="preserve">COUNT(*)</w:t>
+      </w:r>
+      <w:r>
+        <w:rPr>
+          <w:rFonts w:ascii="Cambria" w:cs="Cambria" w:eastAsia="Cambria" w:hAnsi="Cambria"/>
+          <w:b w:val="false"/>
+          <w:bCs w:val="false"/>
+          <w:i w:val="false"/>
+          <w:iCs w:val="false"/>
+          <w:color w:val="000000"/>
+          <w:sz w:val="20"/>
+          <w:szCs w:val="20"/>
+        </w:rPr>
+        <w:t xml:space="preserve"> sans clé de partition est précisément le balayage que tout le modèle cherche à éviter : c'est acceptable pour un contrôle ponctuel, jamais en usage courant.</w:t>
       </w:r>
     </w:p>
     <w:p>
@@ -9684,7 +9171,7 @@
           <w:sz w:val="24"/>
           <w:szCs w:val="24"/>
         </w:rPr>
-        <w:t xml:space="preserve">4.6 Le chargement</w:t>
+        <w:t xml:space="preserve">4.6 Ce que le modèle fait perdre</w:t>
       </w:r>
     </w:p>
     <w:p>
@@ -9703,85 +9190,8 @@
           <w:sz w:val="20"/>
           <w:szCs w:val="20"/>
         </w:rPr>
-        <w:t xml:space="preserve">Le chargeur (</w:t>
-      </w:r>
-      <w:r>
-        <w:rPr>
-          <w:rFonts w:ascii="Consolas" w:cs="Consolas" w:eastAsia="Consolas" w:hAnsi="Consolas"/>
-          <w:b w:val="false"/>
-          <w:bCs w:val="false"/>
-          <w:i w:val="false"/>
-          <w:iCs w:val="false"/>
-          <w:color w:val="000000"/>
-          <w:sz w:val="18"/>
-          <w:szCs w:val="18"/>
-        </w:rPr>
-        <w:t xml:space="preserve">pipeline/phase2_cassandra/load_json.py</w:t>
-      </w:r>
-      <w:r>
-        <w:rPr>
-          <w:rFonts w:ascii="Cambria" w:cs="Cambria" w:eastAsia="Cambria" w:hAnsi="Cambria"/>
-          <w:b w:val="false"/>
-          <w:bCs w:val="false"/>
-          <w:i w:val="false"/>
-          <w:iCs w:val="false"/>
-          <w:color w:val="000000"/>
-          <w:sz w:val="20"/>
-          <w:szCs w:val="20"/>
-        </w:rPr>
-        <w:t xml:space="preserve">) ne connaît aucune connexion Oracle : il lit </w:t>
-      </w:r>
-      <w:r>
-        <w:rPr>
-          <w:rFonts w:ascii="Consolas" w:cs="Consolas" w:eastAsia="Consolas" w:hAnsi="Consolas"/>
-          <w:b w:val="false"/>
-          <w:bCs w:val="false"/>
-          <w:i w:val="false"/>
-          <w:iCs w:val="false"/>
-          <w:color w:val="000000"/>
-          <w:sz w:val="18"/>
-          <w:szCs w:val="18"/>
-        </w:rPr>
-        <w:t xml:space="preserve">data/json/</w:t>
-      </w:r>
-      <w:r>
-        <w:rPr>
-          <w:rFonts w:ascii="Cambria" w:cs="Cambria" w:eastAsia="Cambria" w:hAnsi="Cambria"/>
-          <w:b w:val="false"/>
-          <w:bCs w:val="false"/>
-          <w:i w:val="false"/>
-          <w:iCs w:val="false"/>
-          <w:color w:val="000000"/>
-          <w:sz w:val="20"/>
-          <w:szCs w:val="20"/>
-        </w:rPr>
-        <w:t xml:space="preserve">. C'est ce qui rend l'exécution séquentielle possible, et le script de phase refuse d'ailleurs de démarrer si le conteneur Oracle tourne encore.</w:t>
-      </w:r>
-    </w:p>
-    <w:p>
-      <w:pPr>
-        <w:spacing w:after="100" w:line="264"/>
-        <w:jc w:val="both"/>
-      </w:pPr>
-      <w:r>
-        <w:rPr>
-          <w:rFonts w:ascii="Cambria" w:cs="Cambria" w:eastAsia="Cambria" w:hAnsi="Cambria"/>
-          <w:b w:val="false"/>
-          <w:bCs w:val="false"/>
-          <w:i w:val="false"/>
-          <w:iCs w:val="false"/>
-          <w:color w:val="000000"/>
-          <w:sz w:val="20"/>
-          <w:szCs w:val="20"/>
-        </w:rPr>
-        <w:t xml:space="preserve">Deux choix techniques méritent d'être justifiés.</w:t>
-      </w:r>
-    </w:p>
-    <w:p>
-      <w:pPr>
-        <w:spacing w:after="100" w:line="264"/>
-        <w:jc w:val="both"/>
-      </w:pPr>
+        <w:t xml:space="preserve">Ce modèle a un coût, qu'il faut savoir énoncer. L'</w:t>
+      </w:r>
       <w:r>
         <w:rPr>
           <w:rFonts w:ascii="Cambria" w:cs="Cambria" w:eastAsia="Cambria" w:hAnsi="Cambria"/>
@@ -9793,20 +9203,46 @@
           <w:sz w:val="20"/>
           <w:szCs w:val="20"/>
         </w:rPr>
-        <w:t xml:space="preserve">Pas de </w:t>
-      </w:r>
-      <w:r>
-        <w:rPr>
-          <w:rFonts w:ascii="Consolas" w:cs="Consolas" w:eastAsia="Consolas" w:hAnsi="Consolas"/>
+        <w:t xml:space="preserve">intégrité référentielle</w:t>
+      </w:r>
+      <w:r>
+        <w:rPr>
+          <w:rFonts w:ascii="Cambria" w:cs="Cambria" w:eastAsia="Cambria" w:hAnsi="Cambria"/>
+          <w:b w:val="false"/>
+          <w:bCs w:val="false"/>
+          <w:i w:val="false"/>
+          <w:iCs w:val="false"/>
+          <w:color w:val="000000"/>
+          <w:sz w:val="20"/>
+          <w:szCs w:val="20"/>
+        </w:rPr>
+        <w:t xml:space="preserve"> disparaît, puisqu'il n'y a plus aucune clé étrangère. Les </w:t>
+      </w:r>
+      <w:r>
+        <w:rPr>
+          <w:rFonts w:ascii="Cambria" w:cs="Cambria" w:eastAsia="Cambria" w:hAnsi="Cambria"/>
           <w:b/>
           <w:bCs/>
           <w:i w:val="false"/>
           <w:iCs w:val="false"/>
           <w:color w:val="000000"/>
-          <w:sz w:val="18"/>
-          <w:szCs w:val="18"/>
-        </w:rPr>
-        <w:t xml:space="preserve">BatchStatement</w:t>
+          <w:sz w:val="20"/>
+          <w:szCs w:val="20"/>
+        </w:rPr>
+        <w:t xml:space="preserve">requêtes imprévues</w:t>
+      </w:r>
+      <w:r>
+        <w:rPr>
+          <w:rFonts w:ascii="Cambria" w:cs="Cambria" w:eastAsia="Cambria" w:hAnsi="Cambria"/>
+          <w:b w:val="false"/>
+          <w:bCs w:val="false"/>
+          <w:i w:val="false"/>
+          <w:iCs w:val="false"/>
+          <w:color w:val="000000"/>
+          <w:sz w:val="20"/>
+          <w:szCs w:val="20"/>
+        </w:rPr>
+        <w:t xml:space="preserve"> deviennent coûteuses : toute question non anticipée demande une nouvelle table et un rechargement. La </w:t>
       </w:r>
       <w:r>
         <w:rPr>
@@ -9819,53 +9255,21 @@
           <w:sz w:val="20"/>
           <w:szCs w:val="20"/>
         </w:rPr>
-        <w:t xml:space="preserve">.</w:t>
-      </w:r>
-      <w:r>
-        <w:rPr>
-          <w:rFonts w:ascii="Cambria" w:cs="Cambria" w:eastAsia="Cambria" w:hAnsi="Cambria"/>
-          <w:b w:val="false"/>
-          <w:bCs w:val="false"/>
-          <w:i w:val="false"/>
-          <w:iCs w:val="false"/>
-          <w:color w:val="000000"/>
-          <w:sz w:val="20"/>
-          <w:szCs w:val="20"/>
-        </w:rPr>
-        <w:t xml:space="preserve"> C'est un réflexe venu du SQL, et une mauvaise idée ici : un batch Cassandra sert à garantir l'atomicité à l'intérieur d'une partition, ce n'est pas un outil de performance, et il devient plus lent que les écritures individuelles dès qu'il touche plusieurs partitions. J'utilise </w:t>
-      </w:r>
-      <w:r>
-        <w:rPr>
-          <w:rFonts w:ascii="Consolas" w:cs="Consolas" w:eastAsia="Consolas" w:hAnsi="Consolas"/>
-          <w:b w:val="false"/>
-          <w:bCs w:val="false"/>
-          <w:i w:val="false"/>
-          <w:iCs w:val="false"/>
-          <w:color w:val="000000"/>
-          <w:sz w:val="18"/>
-          <w:szCs w:val="18"/>
-        </w:rPr>
-        <w:t xml:space="preserve">execute_concurrent_with_args</w:t>
-      </w:r>
-      <w:r>
-        <w:rPr>
-          <w:rFonts w:ascii="Cambria" w:cs="Cambria" w:eastAsia="Cambria" w:hAnsi="Cambria"/>
-          <w:b w:val="false"/>
-          <w:bCs w:val="false"/>
-          <w:i w:val="false"/>
-          <w:iCs w:val="false"/>
-          <w:color w:val="000000"/>
-          <w:sz w:val="20"/>
-          <w:szCs w:val="20"/>
-        </w:rPr>
-        <w:t xml:space="preserve">, qui envoie soixante-quatre requêtes en parallèle.</w:t>
-      </w:r>
-    </w:p>
-    <w:p>
-      <w:pPr>
-        <w:spacing w:after="100" w:line="264"/>
-        <w:jc w:val="both"/>
-      </w:pPr>
+        <w:t xml:space="preserve">cohérence entre les deux copies</w:t>
+      </w:r>
+      <w:r>
+        <w:rPr>
+          <w:rFonts w:ascii="Cambria" w:cs="Cambria" w:eastAsia="Cambria" w:hAnsi="Cambria"/>
+          <w:b w:val="false"/>
+          <w:bCs w:val="false"/>
+          <w:i w:val="false"/>
+          <w:iCs w:val="false"/>
+          <w:color w:val="000000"/>
+          <w:sz w:val="20"/>
+          <w:szCs w:val="20"/>
+        </w:rPr>
+        <w:t xml:space="preserve"> d'une commande n'est plus automatique et doit être vérifiée par le code. Et les </w:t>
+      </w:r>
       <w:r>
         <w:rPr>
           <w:rFonts w:ascii="Cambria" w:cs="Cambria" w:eastAsia="Cambria" w:hAnsi="Cambria"/>
@@ -9877,367 +9281,6 @@
           <w:sz w:val="20"/>
           <w:szCs w:val="20"/>
         </w:rPr>
-        <w:t xml:space="preserve">Types monétaires en </w:t>
-      </w:r>
-      <w:r>
-        <w:rPr>
-          <w:rFonts w:ascii="Consolas" w:cs="Consolas" w:eastAsia="Consolas" w:hAnsi="Consolas"/>
-          <w:b/>
-          <w:bCs/>
-          <w:i w:val="false"/>
-          <w:iCs w:val="false"/>
-          <w:color w:val="000000"/>
-          <w:sz w:val="18"/>
-          <w:szCs w:val="18"/>
-        </w:rPr>
-        <w:t xml:space="preserve">decimal</w:t>
-      </w:r>
-      <w:r>
-        <w:rPr>
-          <w:rFonts w:ascii="Cambria" w:cs="Cambria" w:eastAsia="Cambria" w:hAnsi="Cambria"/>
-          <w:b/>
-          <w:bCs/>
-          <w:i w:val="false"/>
-          <w:iCs w:val="false"/>
-          <w:color w:val="000000"/>
-          <w:sz w:val="20"/>
-          <w:szCs w:val="20"/>
-        </w:rPr>
-        <w:t xml:space="preserve">, jamais en </w:t>
-      </w:r>
-      <w:r>
-        <w:rPr>
-          <w:rFonts w:ascii="Consolas" w:cs="Consolas" w:eastAsia="Consolas" w:hAnsi="Consolas"/>
-          <w:b/>
-          <w:bCs/>
-          <w:i w:val="false"/>
-          <w:iCs w:val="false"/>
-          <w:color w:val="000000"/>
-          <w:sz w:val="18"/>
-          <w:szCs w:val="18"/>
-        </w:rPr>
-        <w:t xml:space="preserve">double</w:t>
-      </w:r>
-      <w:r>
-        <w:rPr>
-          <w:rFonts w:ascii="Cambria" w:cs="Cambria" w:eastAsia="Cambria" w:hAnsi="Cambria"/>
-          <w:b/>
-          <w:bCs/>
-          <w:i w:val="false"/>
-          <w:iCs w:val="false"/>
-          <w:color w:val="000000"/>
-          <w:sz w:val="20"/>
-          <w:szCs w:val="20"/>
-        </w:rPr>
-        <w:t xml:space="preserve">.</w:t>
-      </w:r>
-      <w:r>
-        <w:rPr>
-          <w:rFonts w:ascii="Cambria" w:cs="Cambria" w:eastAsia="Cambria" w:hAnsi="Cambria"/>
-          <w:b w:val="false"/>
-          <w:bCs w:val="false"/>
-          <w:i w:val="false"/>
-          <w:iCs w:val="false"/>
-          <w:color w:val="000000"/>
-          <w:sz w:val="20"/>
-          <w:szCs w:val="20"/>
-        </w:rPr>
-        <w:t xml:space="preserve"> Un </w:t>
-      </w:r>
-      <w:r>
-        <w:rPr>
-          <w:rFonts w:ascii="Consolas" w:cs="Consolas" w:eastAsia="Consolas" w:hAnsi="Consolas"/>
-          <w:b w:val="false"/>
-          <w:bCs w:val="false"/>
-          <w:i w:val="false"/>
-          <w:iCs w:val="false"/>
-          <w:color w:val="000000"/>
-          <w:sz w:val="18"/>
-          <w:szCs w:val="18"/>
-        </w:rPr>
-        <w:t xml:space="preserve">double</w:t>
-      </w:r>
-      <w:r>
-        <w:rPr>
-          <w:rFonts w:ascii="Cambria" w:cs="Cambria" w:eastAsia="Cambria" w:hAnsi="Cambria"/>
-          <w:b w:val="false"/>
-          <w:bCs w:val="false"/>
-          <w:i w:val="false"/>
-          <w:iCs w:val="false"/>
-          <w:color w:val="000000"/>
-          <w:sz w:val="20"/>
-          <w:szCs w:val="20"/>
-        </w:rPr>
-        <w:t xml:space="preserve"> ne représente pas exactement 19,90, et l'erreur s'accumule sur des centaines de milliers de lignes agrégées. Ce choix est appliqué de bout en bout : </w:t>
-      </w:r>
-      <w:r>
-        <w:rPr>
-          <w:rFonts w:ascii="Consolas" w:cs="Consolas" w:eastAsia="Consolas" w:hAnsi="Consolas"/>
-          <w:b w:val="false"/>
-          <w:bCs w:val="false"/>
-          <w:i w:val="false"/>
-          <w:iCs w:val="false"/>
-          <w:color w:val="000000"/>
-          <w:sz w:val="18"/>
-          <w:szCs w:val="18"/>
-        </w:rPr>
-        <w:t xml:space="preserve">decimal</w:t>
-      </w:r>
-      <w:r>
-        <w:rPr>
-          <w:rFonts w:ascii="Cambria" w:cs="Cambria" w:eastAsia="Cambria" w:hAnsi="Cambria"/>
-          <w:b w:val="false"/>
-          <w:bCs w:val="false"/>
-          <w:i w:val="false"/>
-          <w:iCs w:val="false"/>
-          <w:color w:val="000000"/>
-          <w:sz w:val="20"/>
-          <w:szCs w:val="20"/>
-        </w:rPr>
-        <w:t xml:space="preserve"> en Cassandra, </w:t>
-      </w:r>
-      <w:r>
-        <w:rPr>
-          <w:rFonts w:ascii="Consolas" w:cs="Consolas" w:eastAsia="Consolas" w:hAnsi="Consolas"/>
-          <w:b w:val="false"/>
-          <w:bCs w:val="false"/>
-          <w:i w:val="false"/>
-          <w:iCs w:val="false"/>
-          <w:color w:val="000000"/>
-          <w:sz w:val="18"/>
-          <w:szCs w:val="18"/>
-        </w:rPr>
-        <w:t xml:space="preserve">decimal(14,2)</w:t>
-      </w:r>
-      <w:r>
-        <w:rPr>
-          <w:rFonts w:ascii="Cambria" w:cs="Cambria" w:eastAsia="Cambria" w:hAnsi="Cambria"/>
-          <w:b w:val="false"/>
-          <w:bCs w:val="false"/>
-          <w:i w:val="false"/>
-          <w:iCs w:val="false"/>
-          <w:color w:val="000000"/>
-          <w:sz w:val="20"/>
-          <w:szCs w:val="20"/>
-        </w:rPr>
-        <w:t xml:space="preserve"> en Parquet, </w:t>
-      </w:r>
-      <w:r>
-        <w:rPr>
-          <w:rFonts w:ascii="Consolas" w:cs="Consolas" w:eastAsia="Consolas" w:hAnsi="Consolas"/>
-          <w:b w:val="false"/>
-          <w:bCs w:val="false"/>
-          <w:i w:val="false"/>
-          <w:iCs w:val="false"/>
-          <w:color w:val="000000"/>
-          <w:sz w:val="18"/>
-          <w:szCs w:val="18"/>
-        </w:rPr>
-        <w:t xml:space="preserve">scaled_float</w:t>
-      </w:r>
-      <w:r>
-        <w:rPr>
-          <w:rFonts w:ascii="Cambria" w:cs="Cambria" w:eastAsia="Cambria" w:hAnsi="Cambria"/>
-          <w:b w:val="false"/>
-          <w:bCs w:val="false"/>
-          <w:i w:val="false"/>
-          <w:iCs w:val="false"/>
-          <w:color w:val="000000"/>
-          <w:sz w:val="20"/>
-          <w:szCs w:val="20"/>
-        </w:rPr>
-        <w:t xml:space="preserve"> en Elasticsearch.</w:t>
-      </w:r>
-    </w:p>
-    <w:p>
-      <w:pPr>
-        <w:spacing w:after="100" w:line="264"/>
-        <w:jc w:val="both"/>
-      </w:pPr>
-      <w:r>
-        <w:rPr>
-          <w:rFonts w:ascii="Cambria" w:cs="Cambria" w:eastAsia="Cambria" w:hAnsi="Cambria"/>
-          <w:b w:val="false"/>
-          <w:bCs w:val="false"/>
-          <w:i w:val="false"/>
-          <w:iCs w:val="false"/>
-          <w:color w:val="000000"/>
-          <w:sz w:val="20"/>
-          <w:szCs w:val="20"/>
-        </w:rPr>
-        <w:t xml:space="preserve">En fin de chargement, le script compte les lignes de chaque table et les compare au nombre de lignes écrites. Un </w:t>
-      </w:r>
-      <w:r>
-        <w:rPr>
-          <w:rFonts w:ascii="Consolas" w:cs="Consolas" w:eastAsia="Consolas" w:hAnsi="Consolas"/>
-          <w:b w:val="false"/>
-          <w:bCs w:val="false"/>
-          <w:i w:val="false"/>
-          <w:iCs w:val="false"/>
-          <w:color w:val="000000"/>
-          <w:sz w:val="18"/>
-          <w:szCs w:val="18"/>
-        </w:rPr>
-        <w:t xml:space="preserve">COUNT(*)</w:t>
-      </w:r>
-      <w:r>
-        <w:rPr>
-          <w:rFonts w:ascii="Cambria" w:cs="Cambria" w:eastAsia="Cambria" w:hAnsi="Cambria"/>
-          <w:b w:val="false"/>
-          <w:bCs w:val="false"/>
-          <w:i w:val="false"/>
-          <w:iCs w:val="false"/>
-          <w:color w:val="000000"/>
-          <w:sz w:val="20"/>
-          <w:szCs w:val="20"/>
-        </w:rPr>
-        <w:t xml:space="preserve"> sans clé de partition est précisément le balayage que tout le modèle cherche à éviter : c'est acceptable pour un contrôle ponctuel, jamais en usage courant.</w:t>
-      </w:r>
-    </w:p>
-    <w:p>
-      <w:pPr>
-        <w:pStyle w:val="Heading2"/>
-        <w:keepNext/>
-        <w:spacing w:after="120" w:before="240"/>
-      </w:pPr>
-      <w:r>
-        <w:rPr>
-          <w:rFonts w:ascii="Calibri" w:cs="Calibri" w:eastAsia="Calibri" w:hAnsi="Calibri"/>
-          <w:b/>
-          <w:bCs/>
-          <w:color w:val="2F5496"/>
-          <w:sz w:val="24"/>
-          <w:szCs w:val="24"/>
-        </w:rPr>
-        <w:t xml:space="preserve">4.7 Ce que le modèle fait perdre</w:t>
-      </w:r>
-    </w:p>
-    <w:p>
-      <w:pPr>
-        <w:spacing w:after="100" w:line="264"/>
-        <w:jc w:val="both"/>
-      </w:pPr>
-      <w:r>
-        <w:rPr>
-          <w:rFonts w:ascii="Cambria" w:cs="Cambria" w:eastAsia="Cambria" w:hAnsi="Cambria"/>
-          <w:b w:val="false"/>
-          <w:bCs w:val="false"/>
-          <w:i w:val="false"/>
-          <w:iCs w:val="false"/>
-          <w:color w:val="000000"/>
-          <w:sz w:val="20"/>
-          <w:szCs w:val="20"/>
-        </w:rPr>
-        <w:t xml:space="preserve">Un modèle NoSQL orienté requêtes a un coût, qu'il serait malhonnête de passer sous silence.</w:t>
-      </w:r>
-    </w:p>
-    <w:p>
-      <w:pPr>
-        <w:spacing w:after="100" w:line="264"/>
-        <w:jc w:val="both"/>
-      </w:pPr>
-      <w:r>
-        <w:rPr>
-          <w:rFonts w:ascii="Cambria" w:cs="Cambria" w:eastAsia="Cambria" w:hAnsi="Cambria"/>
-          <w:b w:val="false"/>
-          <w:bCs w:val="false"/>
-          <w:i w:val="false"/>
-          <w:iCs w:val="false"/>
-          <w:color w:val="000000"/>
-          <w:sz w:val="20"/>
-          <w:szCs w:val="20"/>
-        </w:rPr>
-        <w:t xml:space="preserve">L'</w:t>
-      </w:r>
-      <w:r>
-        <w:rPr>
-          <w:rFonts w:ascii="Cambria" w:cs="Cambria" w:eastAsia="Cambria" w:hAnsi="Cambria"/>
-          <w:b/>
-          <w:bCs/>
-          <w:i w:val="false"/>
-          <w:iCs w:val="false"/>
-          <w:color w:val="000000"/>
-          <w:sz w:val="20"/>
-          <w:szCs w:val="20"/>
-        </w:rPr>
-        <w:t xml:space="preserve">intégrité référentielle</w:t>
-      </w:r>
-      <w:r>
-        <w:rPr>
-          <w:rFonts w:ascii="Cambria" w:cs="Cambria" w:eastAsia="Cambria" w:hAnsi="Cambria"/>
-          <w:b w:val="false"/>
-          <w:bCs w:val="false"/>
-          <w:i w:val="false"/>
-          <w:iCs w:val="false"/>
-          <w:color w:val="000000"/>
-          <w:sz w:val="20"/>
-          <w:szCs w:val="20"/>
-        </w:rPr>
-        <w:t xml:space="preserve"> disparaît : il n'y a plus aucune clé étrangère. Si un nom de produit change, les commandes passées gardent l'ancien. Ici c'est voulu, puisque c'est de l'historisation, mais plus rien ne l'impose techniquement. Les </w:t>
-      </w:r>
-      <w:r>
-        <w:rPr>
-          <w:rFonts w:ascii="Cambria" w:cs="Cambria" w:eastAsia="Cambria" w:hAnsi="Cambria"/>
-          <w:b/>
-          <w:bCs/>
-          <w:i w:val="false"/>
-          <w:iCs w:val="false"/>
-          <w:color w:val="000000"/>
-          <w:sz w:val="20"/>
-          <w:szCs w:val="20"/>
-        </w:rPr>
-        <w:t xml:space="preserve">requêtes imprévues</w:t>
-      </w:r>
-      <w:r>
-        <w:rPr>
-          <w:rFonts w:ascii="Cambria" w:cs="Cambria" w:eastAsia="Cambria" w:hAnsi="Cambria"/>
-          <w:b w:val="false"/>
-          <w:bCs w:val="false"/>
-          <w:i w:val="false"/>
-          <w:iCs w:val="false"/>
-          <w:color w:val="000000"/>
-          <w:sz w:val="20"/>
-          <w:szCs w:val="20"/>
-        </w:rPr>
-        <w:t xml:space="preserve"> deviennent coûteuses : toute question non anticipée exige une nouvelle table et un rechargement, là où en SQL il aurait suffi d'écrire une requête. La </w:t>
-      </w:r>
-      <w:r>
-        <w:rPr>
-          <w:rFonts w:ascii="Cambria" w:cs="Cambria" w:eastAsia="Cambria" w:hAnsi="Cambria"/>
-          <w:b/>
-          <w:bCs/>
-          <w:i w:val="false"/>
-          <w:iCs w:val="false"/>
-          <w:color w:val="000000"/>
-          <w:sz w:val="20"/>
-          <w:szCs w:val="20"/>
-        </w:rPr>
-        <w:t xml:space="preserve">cohérence entre les copies</w:t>
-      </w:r>
-      <w:r>
-        <w:rPr>
-          <w:rFonts w:ascii="Cambria" w:cs="Cambria" w:eastAsia="Cambria" w:hAnsi="Cambria"/>
-          <w:b w:val="false"/>
-          <w:bCs w:val="false"/>
-          <w:i w:val="false"/>
-          <w:iCs w:val="false"/>
-          <w:color w:val="000000"/>
-          <w:sz w:val="20"/>
-          <w:szCs w:val="20"/>
-        </w:rPr>
-        <w:t xml:space="preserve"> n'est plus automatique, puisque la même commande existe dans deux tables et qu'une écriture partielle peut les désynchroniser : il faut des contrôles applicatifs, ce qui explique les comptages du chargeur et le traceur présenté en section 7. Enfin les </w:t>
-      </w:r>
-      <w:r>
-        <w:rPr>
-          <w:rFonts w:ascii="Cambria" w:cs="Cambria" w:eastAsia="Cambria" w:hAnsi="Cambria"/>
-          <w:b/>
-          <w:bCs/>
-          <w:i w:val="false"/>
-          <w:iCs w:val="false"/>
-          <w:color w:val="000000"/>
-          <w:sz w:val="20"/>
-          <w:szCs w:val="20"/>
-        </w:rPr>
         <w:t xml:space="preserve">analyses transverses</w:t>
       </w:r>
       <w:r>
@@ -10251,7 +9294,7 @@
           <w:sz w:val="20"/>
           <w:szCs w:val="20"/>
         </w:rPr>
-        <w:t xml:space="preserve"> ne sont pas le terrain de ce modèle, une agrégation non ciblée pouvant balayer toute la table. C'est exactement le vide que la phase suivante vient combler.</w:t>
+        <w:t xml:space="preserve"> ne sont pas le terrain de ce modèle : c'est le vide que la phase suivante comble.</w:t>
       </w:r>
     </w:p>
     <w:p>
@@ -11373,7 +10416,7 @@
           <w:sz w:val="20"/>
           <w:szCs w:val="20"/>
         </w:rPr>
-        <w:t xml:space="preserve">Récence, Fréquence, Montant : la segmentation client classique, et l'endroit du projet où les données servent enfin à répondre à une question de gestion.</w:t>
+        <w:t xml:space="preserve">Récence, Fréquence, Montant : la segmentation client classique, et l'endroit du projet où les données répondent enfin à une question de gestion. Six segments en sortent : Champions, Fidèles, Nouveaux, À reconquérir, Endormis, À surveiller.</w:t>
       </w:r>
     </w:p>
     <w:p>
@@ -11444,7 +10487,85 @@
           <w:sz w:val="20"/>
           <w:szCs w:val="20"/>
         </w:rPr>
-        <w:t xml:space="preserve">) et non par seuils fixes. La conséquence est importante : la segmentation devient indépendante de la devise, du volume et de la période. Elle reste valable si le jeu de données change d'échelle, là où des seuils écrits en dur seraient à re-régler.</w:t>
+        <w:t xml:space="preserve">) et non par seuils fixes, ce qui rend la segmentation indépendante de l'échelle des données. Deux détails de mise en œuvre : la </w:t>
+      </w:r>
+      <w:r>
+        <w:rPr>
+          <w:rFonts w:ascii="Cambria" w:cs="Cambria" w:eastAsia="Cambria" w:hAnsi="Cambria"/>
+          <w:b/>
+          <w:bCs/>
+          <w:i w:val="false"/>
+          <w:iCs w:val="false"/>
+          <w:color w:val="000000"/>
+          <w:sz w:val="20"/>
+          <w:szCs w:val="20"/>
+        </w:rPr>
+        <w:t xml:space="preserve">récence est inversée</w:t>
+      </w:r>
+      <w:r>
+        <w:rPr>
+          <w:rFonts w:ascii="Cambria" w:cs="Cambria" w:eastAsia="Cambria" w:hAnsi="Cambria"/>
+          <w:b w:val="false"/>
+          <w:bCs w:val="false"/>
+          <w:i w:val="false"/>
+          <w:iCs w:val="false"/>
+          <w:color w:val="000000"/>
+          <w:sz w:val="20"/>
+          <w:szCs w:val="20"/>
+        </w:rPr>
+        <w:t xml:space="preserve">, car peu de jours depuis le dernier achat est un bon signe, d'où le </w:t>
+      </w:r>
+      <w:r>
+        <w:rPr>
+          <w:rFonts w:ascii="Consolas" w:cs="Consolas" w:eastAsia="Consolas" w:hAnsi="Consolas"/>
+          <w:b w:val="false"/>
+          <w:bCs w:val="false"/>
+          <w:i w:val="false"/>
+          <w:iCs w:val="false"/>
+          <w:color w:val="000000"/>
+          <w:sz w:val="18"/>
+          <w:szCs w:val="18"/>
+        </w:rPr>
+        <w:t xml:space="preserve">6 - score</w:t>
+      </w:r>
+      <w:r>
+        <w:rPr>
+          <w:rFonts w:ascii="Cambria" w:cs="Cambria" w:eastAsia="Cambria" w:hAnsi="Cambria"/>
+          <w:b w:val="false"/>
+          <w:bCs w:val="false"/>
+          <w:i w:val="false"/>
+          <w:iCs w:val="false"/>
+          <w:color w:val="000000"/>
+          <w:sz w:val="20"/>
+          <w:szCs w:val="20"/>
+        </w:rPr>
+        <w:t xml:space="preserve"> ; et la </w:t>
+      </w:r>
+      <w:r>
+        <w:rPr>
+          <w:rFonts w:ascii="Cambria" w:cs="Cambria" w:eastAsia="Cambria" w:hAnsi="Cambria"/>
+          <w:b/>
+          <w:bCs/>
+          <w:i w:val="false"/>
+          <w:iCs w:val="false"/>
+          <w:color w:val="000000"/>
+          <w:sz w:val="20"/>
+          <w:szCs w:val="20"/>
+        </w:rPr>
+        <w:t xml:space="preserve">date de référence est la dernière commande observée</w:t>
+      </w:r>
+      <w:r>
+        <w:rPr>
+          <w:rFonts w:ascii="Cambria" w:cs="Cambria" w:eastAsia="Cambria" w:hAnsi="Cambria"/>
+          <w:b w:val="false"/>
+          <w:bCs w:val="false"/>
+          <w:i w:val="false"/>
+          <w:iCs w:val="false"/>
+          <w:color w:val="000000"/>
+          <w:sz w:val="20"/>
+          <w:szCs w:val="20"/>
+        </w:rPr>
+        <w:t xml:space="preserve">, pas la date du jour, sinon tous les clients glisseraient peu à peu vers « endormis » sans que rien n'ait changé.</w:t>
       </w:r>
     </w:p>
     <w:p>
@@ -11463,19 +10584,8 @@
           <w:sz w:val="20"/>
           <w:szCs w:val="20"/>
         </w:rPr>
-        <w:t xml:space="preserve">Deux détails de mise en œuvre :</w:t>
-      </w:r>
-    </w:p>
-    <w:p>
-      <w:pPr>
-        <w:pStyle w:val="ListParagraph"/>
-        <w:numPr>
-          <w:ilvl w:val="0"/>
-          <w:numId w:val="2"/>
-        </w:numPr>
-        <w:spacing w:after="50" w:line="264"/>
-        <w:jc w:val="both"/>
-      </w:pPr>
+        <w:t xml:space="preserve">Deux propriétés expliquent des écarts de comptage visibles plus loin. Le regroupement porte sur le </w:t>
+      </w:r>
       <w:r>
         <w:rPr>
           <w:rFonts w:ascii="Cambria" w:cs="Cambria" w:eastAsia="Cambria" w:hAnsi="Cambria"/>
@@ -11487,20 +10597,20 @@
           <w:sz w:val="20"/>
           <w:szCs w:val="20"/>
         </w:rPr>
-        <w:t xml:space="preserve">la récence est inversée.</w:t>
-      </w:r>
-      <w:r>
-        <w:rPr>
-          <w:rFonts w:ascii="Cambria" w:cs="Cambria" w:eastAsia="Cambria" w:hAnsi="Cambria"/>
-          <w:b w:val="false"/>
-          <w:bCs w:val="false"/>
-          <w:i w:val="false"/>
-          <w:iCs w:val="false"/>
-          <w:color w:val="000000"/>
-          <w:sz w:val="20"/>
-          <w:szCs w:val="20"/>
-        </w:rPr>
-        <w:t xml:space="preserve"> Peu de jours écoulés depuis le dernier achat est un bon signe, donc un score élevé : d'où le </w:t>
+        <w:t xml:space="preserve">seul</w:t>
+      </w:r>
+      <w:r>
+        <w:rPr>
+          <w:rFonts w:ascii="Cambria" w:cs="Cambria" w:eastAsia="Cambria" w:hAnsi="Cambria"/>
+          <w:b w:val="false"/>
+          <w:bCs w:val="false"/>
+          <w:i w:val="false"/>
+          <w:iCs w:val="false"/>
+          <w:color w:val="000000"/>
+          <w:sz w:val="20"/>
+          <w:szCs w:val="20"/>
+        </w:rPr>
+        <w:t xml:space="preserve"> </w:t>
       </w:r>
       <w:r>
         <w:rPr>
@@ -11513,133 +10623,6 @@
           <w:sz w:val="18"/>
           <w:szCs w:val="18"/>
         </w:rPr>
-        <w:t xml:space="preserve">6 - score</w:t>
-      </w:r>
-      <w:r>
-        <w:rPr>
-          <w:rFonts w:ascii="Cambria" w:cs="Cambria" w:eastAsia="Cambria" w:hAnsi="Cambria"/>
-          <w:b w:val="false"/>
-          <w:bCs w:val="false"/>
-          <w:i w:val="false"/>
-          <w:iCs w:val="false"/>
-          <w:color w:val="000000"/>
-          <w:sz w:val="20"/>
-          <w:szCs w:val="20"/>
-        </w:rPr>
-        <w:t xml:space="preserve"> ;</w:t>
-      </w:r>
-    </w:p>
-    <w:p>
-      <w:pPr>
-        <w:pStyle w:val="ListParagraph"/>
-        <w:numPr>
-          <w:ilvl w:val="0"/>
-          <w:numId w:val="2"/>
-        </w:numPr>
-        <w:spacing w:after="120" w:line="264"/>
-        <w:jc w:val="both"/>
-      </w:pPr>
-      <w:r>
-        <w:rPr>
-          <w:rFonts w:ascii="Cambria" w:cs="Cambria" w:eastAsia="Cambria" w:hAnsi="Cambria"/>
-          <w:b/>
-          <w:bCs/>
-          <w:i w:val="false"/>
-          <w:iCs w:val="false"/>
-          <w:color w:val="000000"/>
-          <w:sz w:val="20"/>
-          <w:szCs w:val="20"/>
-        </w:rPr>
-        <w:t xml:space="preserve">la date de référence est la dernière commande observée</w:t>
-      </w:r>
-      <w:r>
-        <w:rPr>
-          <w:rFonts w:ascii="Cambria" w:cs="Cambria" w:eastAsia="Cambria" w:hAnsi="Cambria"/>
-          <w:b w:val="false"/>
-          <w:bCs w:val="false"/>
-          <w:i w:val="false"/>
-          <w:iCs w:val="false"/>
-          <w:color w:val="000000"/>
-          <w:sz w:val="20"/>
-          <w:szCs w:val="20"/>
-        </w:rPr>
-        <w:t xml:space="preserve">, pas la date du jour. Sinon la segmentation vieillirait toute seule entre le calcul et la consultation du tableau de bord, et tous les clients glisseraient progressivement vers « endormis » sans que rien n'ait changé.</w:t>
-      </w:r>
-    </w:p>
-    <w:p>
-      <w:pPr>
-        <w:spacing w:after="100" w:line="264"/>
-        <w:jc w:val="both"/>
-      </w:pPr>
-      <w:r>
-        <w:rPr>
-          <w:rFonts w:ascii="Cambria" w:cs="Cambria" w:eastAsia="Cambria" w:hAnsi="Cambria"/>
-          <w:b w:val="false"/>
-          <w:bCs w:val="false"/>
-          <w:i w:val="false"/>
-          <w:iCs w:val="false"/>
-          <w:color w:val="000000"/>
-          <w:sz w:val="20"/>
-          <w:szCs w:val="20"/>
-        </w:rPr>
-        <w:t xml:space="preserve">Six segments en sortent : Champions, Fidèles, Nouveaux, À reconquérir, Endormis, À surveiller.</w:t>
-      </w:r>
-    </w:p>
-    <w:p>
-      <w:pPr>
-        <w:spacing w:after="100" w:line="264"/>
-        <w:jc w:val="both"/>
-      </w:pPr>
-      <w:r>
-        <w:rPr>
-          <w:rFonts w:ascii="Cambria" w:cs="Cambria" w:eastAsia="Cambria" w:hAnsi="Cambria"/>
-          <w:b w:val="false"/>
-          <w:bCs w:val="false"/>
-          <w:i w:val="false"/>
-          <w:iCs w:val="false"/>
-          <w:color w:val="000000"/>
-          <w:sz w:val="20"/>
-          <w:szCs w:val="20"/>
-        </w:rPr>
-        <w:t xml:space="preserve">Deux propriétés expliquent des écarts de comptage visibles plus loin. Le regroupement porte sur le </w:t>
-      </w:r>
-      <w:r>
-        <w:rPr>
-          <w:rFonts w:ascii="Cambria" w:cs="Cambria" w:eastAsia="Cambria" w:hAnsi="Cambria"/>
-          <w:b/>
-          <w:bCs/>
-          <w:i w:val="false"/>
-          <w:iCs w:val="false"/>
-          <w:color w:val="000000"/>
-          <w:sz w:val="20"/>
-          <w:szCs w:val="20"/>
-        </w:rPr>
-        <w:t xml:space="preserve">seul</w:t>
-      </w:r>
-      <w:r>
-        <w:rPr>
-          <w:rFonts w:ascii="Cambria" w:cs="Cambria" w:eastAsia="Cambria" w:hAnsi="Cambria"/>
-          <w:b w:val="false"/>
-          <w:bCs w:val="false"/>
-          <w:i w:val="false"/>
-          <w:iCs w:val="false"/>
-          <w:color w:val="000000"/>
-          <w:sz w:val="20"/>
-          <w:szCs w:val="20"/>
-        </w:rPr>
-        <w:t xml:space="preserve"> </w:t>
-      </w:r>
-      <w:r>
-        <w:rPr>
-          <w:rFonts w:ascii="Consolas" w:cs="Consolas" w:eastAsia="Consolas" w:hAnsi="Consolas"/>
-          <w:b w:val="false"/>
-          <w:bCs w:val="false"/>
-          <w:i w:val="false"/>
-          <w:iCs w:val="false"/>
-          <w:color w:val="000000"/>
-          <w:sz w:val="18"/>
-          <w:szCs w:val="18"/>
-        </w:rPr>
         <w:t xml:space="preserve">customer_id</w:t>
       </w:r>
       <w:r>
@@ -11653,78 +10636,7 @@
           <w:sz w:val="20"/>
           <w:szCs w:val="20"/>
         </w:rPr>
-        <w:t xml:space="preserve"> : y ajouter le pays ou le niveau de fidélité serait tentant, mais il suffirait qu'un client ait commandé depuis deux pays pour qu'il apparaisse en deux lignes, segmenté sur des achats fractionnés. Et la segmentation ne couvre que les clients ayant généré du chiffre d'affaires, un client dont toutes les commandes sont annulées n'ayant pas de récence exploitable : l'index Elasticsearch des clients contient donc nettement moins de documents que la table </w:t>
-      </w:r>
-      <w:r>
-        <w:rPr>
-          <w:rFonts w:ascii="Consolas" w:cs="Consolas" w:eastAsia="Consolas" w:hAnsi="Consolas"/>
-          <w:b w:val="false"/>
-          <w:bCs w:val="false"/>
-          <w:i w:val="false"/>
-          <w:iCs w:val="false"/>
-          <w:color w:val="000000"/>
-          <w:sz w:val="18"/>
-          <w:szCs w:val="18"/>
-        </w:rPr>
-        <w:t xml:space="preserve">customers</w:t>
-      </w:r>
-      <w:r>
-        <w:rPr>
-          <w:rFonts w:ascii="Cambria" w:cs="Cambria" w:eastAsia="Cambria" w:hAnsi="Cambria"/>
-          <w:b w:val="false"/>
-          <w:bCs w:val="false"/>
-          <w:i w:val="false"/>
-          <w:iCs w:val="false"/>
-          <w:color w:val="000000"/>
-          <w:sz w:val="20"/>
-          <w:szCs w:val="20"/>
-        </w:rPr>
-        <w:t xml:space="preserve"> d'Oracle : 3 439 contre 5 000 sur l'exécution de référence.</w:t>
-      </w:r>
-    </w:p>
-    <w:p>
-      <w:pPr>
-        <w:spacing w:after="100" w:line="264"/>
-        <w:jc w:val="both"/>
-      </w:pPr>
-      <w:r>
-        <w:rPr>
-          <w:rFonts w:ascii="Cambria" w:cs="Cambria" w:eastAsia="Cambria" w:hAnsi="Cambria"/>
-          <w:b w:val="false"/>
-          <w:bCs w:val="false"/>
-          <w:i w:val="false"/>
-          <w:iCs w:val="false"/>
-          <w:color w:val="000000"/>
-          <w:sz w:val="20"/>
-          <w:szCs w:val="20"/>
-        </w:rPr>
-        <w:t xml:space="preserve">La table de faits est enfin mise en cache (</w:t>
-      </w:r>
-      <w:r>
-        <w:rPr>
-          <w:rFonts w:ascii="Consolas" w:cs="Consolas" w:eastAsia="Consolas" w:hAnsi="Consolas"/>
-          <w:b w:val="false"/>
-          <w:bCs w:val="false"/>
-          <w:i w:val="false"/>
-          <w:iCs w:val="false"/>
-          <w:color w:val="000000"/>
-          <w:sz w:val="18"/>
-          <w:szCs w:val="18"/>
-        </w:rPr>
-        <w:t xml:space="preserve">.cache()</w:t>
-      </w:r>
-      <w:r>
-        <w:rPr>
-          <w:rFonts w:ascii="Cambria" w:cs="Cambria" w:eastAsia="Cambria" w:hAnsi="Cambria"/>
-          <w:b w:val="false"/>
-          <w:bCs w:val="false"/>
-          <w:i w:val="false"/>
-          <w:iCs w:val="false"/>
-          <w:color w:val="000000"/>
-          <w:sz w:val="20"/>
-          <w:szCs w:val="20"/>
-        </w:rPr>
-        <w:t xml:space="preserve">) parce qu'elle est relue par cinq traitements successifs ; les transformations Spark étant paresseuses, sans cache la lecture Cassandra serait rejouée cinq fois.</w:t>
+        <w:t xml:space="preserve"> : y ajouter le pays suffirait à faire apparaître en deux lignes un client ayant commandé depuis deux pays. Et la segmentation ne couvre que les clients ayant généré du chiffre d'affaires, d'où 3 439 clients segmentés pour 5 000 inscrits.</w:t>
       </w:r>
     </w:p>
     <w:p>
@@ -11761,7 +10673,7 @@
           <w:sz w:val="20"/>
           <w:szCs w:val="20"/>
         </w:rPr>
-        <w:t xml:space="preserve">Quatre propriétés, qui se complètent. </w:t>
+        <w:t xml:space="preserve">Quatre propriétés. </w:t>
       </w:r>
       <w:r>
         <w:rPr>
@@ -11787,7 +10699,33 @@
           <w:sz w:val="20"/>
           <w:szCs w:val="20"/>
         </w:rPr>
-        <w:t xml:space="preserve"> : une requête qui ne lit que </w:t>
+        <w:t xml:space="preserve"> : une requête qui ne porte que sur deux colonnes ne lit que ces deux colonnes, là où JSON et CSV imposent de parcourir chaque ligne entière. </w:t>
+      </w:r>
+      <w:r>
+        <w:rPr>
+          <w:rFonts w:ascii="Cambria" w:cs="Cambria" w:eastAsia="Cambria" w:hAnsi="Cambria"/>
+          <w:b/>
+          <w:bCs/>
+          <w:i w:val="false"/>
+          <w:iCs w:val="false"/>
+          <w:color w:val="000000"/>
+          <w:sz w:val="20"/>
+          <w:szCs w:val="20"/>
+        </w:rPr>
+        <w:t xml:space="preserve">Compressé</w:t>
+      </w:r>
+      <w:r>
+        <w:rPr>
+          <w:rFonts w:ascii="Cambria" w:cs="Cambria" w:eastAsia="Cambria" w:hAnsi="Cambria"/>
+          <w:b w:val="false"/>
+          <w:bCs w:val="false"/>
+          <w:i w:val="false"/>
+          <w:iCs w:val="false"/>
+          <w:color w:val="000000"/>
+          <w:sz w:val="20"/>
+          <w:szCs w:val="20"/>
+        </w:rPr>
+        <w:t xml:space="preserve"> : les valeurs d'une même colonne sont homogènes, donc très compressibles ; j'ai retenu </w:t>
       </w:r>
       <w:r>
         <w:rPr>
@@ -11800,20 +10738,20 @@
           <w:sz w:val="18"/>
           <w:szCs w:val="18"/>
         </w:rPr>
-        <w:t xml:space="preserve">net_amount</w:t>
-      </w:r>
-      <w:r>
-        <w:rPr>
-          <w:rFonts w:ascii="Cambria" w:cs="Cambria" w:eastAsia="Cambria" w:hAnsi="Cambria"/>
-          <w:b w:val="false"/>
-          <w:bCs w:val="false"/>
-          <w:i w:val="false"/>
-          <w:iCs w:val="false"/>
-          <w:color w:val="000000"/>
-          <w:sz w:val="20"/>
-          <w:szCs w:val="20"/>
-        </w:rPr>
-        <w:t xml:space="preserve"> et </w:t>
+        <w:t xml:space="preserve">snappy</w:t>
+      </w:r>
+      <w:r>
+        <w:rPr>
+          <w:rFonts w:ascii="Cambria" w:cs="Cambria" w:eastAsia="Cambria" w:hAnsi="Cambria"/>
+          <w:b w:val="false"/>
+          <w:bCs w:val="false"/>
+          <w:i w:val="false"/>
+          <w:iCs w:val="false"/>
+          <w:color w:val="000000"/>
+          <w:sz w:val="20"/>
+          <w:szCs w:val="20"/>
+        </w:rPr>
+        <w:t xml:space="preserve">, qui décompresse plus vite que </w:t>
       </w:r>
       <w:r>
         <w:rPr>
@@ -11826,20 +10764,20 @@
           <w:sz w:val="18"/>
           <w:szCs w:val="18"/>
         </w:rPr>
-        <w:t xml:space="preserve">year_month</w:t>
-      </w:r>
-      <w:r>
-        <w:rPr>
-          <w:rFonts w:ascii="Cambria" w:cs="Cambria" w:eastAsia="Cambria" w:hAnsi="Cambria"/>
-          <w:b w:val="false"/>
-          <w:bCs w:val="false"/>
-          <w:i w:val="false"/>
-          <w:iCs w:val="false"/>
-          <w:color w:val="000000"/>
-          <w:sz w:val="20"/>
-          <w:szCs w:val="20"/>
-        </w:rPr>
-        <w:t xml:space="preserve"> ne lit que ces deux colonnes sur le disque, là où JSON et CSV imposent de parcourir chaque ligne entière pour en extraire deux champs. </w:t>
+        <w:t xml:space="preserve">gzip</w:t>
+      </w:r>
+      <w:r>
+        <w:rPr>
+          <w:rFonts w:ascii="Cambria" w:cs="Cambria" w:eastAsia="Cambria" w:hAnsi="Cambria"/>
+          <w:b w:val="false"/>
+          <w:bCs w:val="false"/>
+          <w:i w:val="false"/>
+          <w:iCs w:val="false"/>
+          <w:color w:val="000000"/>
+          <w:sz w:val="20"/>
+          <w:szCs w:val="20"/>
+        </w:rPr>
+        <w:t xml:space="preserve"> pour un taux à peine moindre. </w:t>
       </w:r>
       <w:r>
         <w:rPr>
@@ -11852,20 +10790,20 @@
           <w:sz w:val="20"/>
           <w:szCs w:val="20"/>
         </w:rPr>
-        <w:t xml:space="preserve">Compressé</w:t>
-      </w:r>
-      <w:r>
-        <w:rPr>
-          <w:rFonts w:ascii="Cambria" w:cs="Cambria" w:eastAsia="Cambria" w:hAnsi="Cambria"/>
-          <w:b w:val="false"/>
-          <w:bCs w:val="false"/>
-          <w:i w:val="false"/>
-          <w:iCs w:val="false"/>
-          <w:color w:val="000000"/>
-          <w:sz w:val="20"/>
-          <w:szCs w:val="20"/>
-        </w:rPr>
-        <w:t xml:space="preserve"> : les valeurs d'une même colonne sont homogènes, donc très compressibles ; j'ai retenu </w:t>
+        <w:t xml:space="preserve">Typé</w:t>
+      </w:r>
+      <w:r>
+        <w:rPr>
+          <w:rFonts w:ascii="Cambria" w:cs="Cambria" w:eastAsia="Cambria" w:hAnsi="Cambria"/>
+          <w:b w:val="false"/>
+          <w:bCs w:val="false"/>
+          <w:i w:val="false"/>
+          <w:iCs w:val="false"/>
+          <w:color w:val="000000"/>
+          <w:sz w:val="20"/>
+          <w:szCs w:val="20"/>
+        </w:rPr>
+        <w:t xml:space="preserve"> : le schéma est dans le fichier, et les montants sont en </w:t>
       </w:r>
       <w:r>
         <w:rPr>
@@ -11878,46 +10816,20 @@
           <w:sz w:val="18"/>
           <w:szCs w:val="18"/>
         </w:rPr>
-        <w:t xml:space="preserve">snappy</w:t>
-      </w:r>
-      <w:r>
-        <w:rPr>
-          <w:rFonts w:ascii="Cambria" w:cs="Cambria" w:eastAsia="Cambria" w:hAnsi="Cambria"/>
-          <w:b w:val="false"/>
-          <w:bCs w:val="false"/>
-          <w:i w:val="false"/>
-          <w:iCs w:val="false"/>
-          <w:color w:val="000000"/>
-          <w:sz w:val="20"/>
-          <w:szCs w:val="20"/>
-        </w:rPr>
-        <w:t xml:space="preserve"> plutôt que </w:t>
-      </w:r>
-      <w:r>
-        <w:rPr>
-          <w:rFonts w:ascii="Consolas" w:cs="Consolas" w:eastAsia="Consolas" w:hAnsi="Consolas"/>
-          <w:b w:val="false"/>
-          <w:bCs w:val="false"/>
-          <w:i w:val="false"/>
-          <w:iCs w:val="false"/>
-          <w:color w:val="000000"/>
-          <w:sz w:val="18"/>
-          <w:szCs w:val="18"/>
-        </w:rPr>
-        <w:t xml:space="preserve">gzip</w:t>
-      </w:r>
-      <w:r>
-        <w:rPr>
-          <w:rFonts w:ascii="Cambria" w:cs="Cambria" w:eastAsia="Cambria" w:hAnsi="Cambria"/>
-          <w:b w:val="false"/>
-          <w:bCs w:val="false"/>
-          <w:i w:val="false"/>
-          <w:iCs w:val="false"/>
-          <w:color w:val="000000"/>
-          <w:sz w:val="20"/>
-          <w:szCs w:val="20"/>
-        </w:rPr>
-        <w:t xml:space="preserve">, car elle décompresse beaucoup plus vite pour un taux à peine moindre, le bon arbitrage pour un format destiné à être relu souvent. </w:t>
+        <w:t xml:space="preserve">decimal(14,2)</w:t>
+      </w:r>
+      <w:r>
+        <w:rPr>
+          <w:rFonts w:ascii="Cambria" w:cs="Cambria" w:eastAsia="Cambria" w:hAnsi="Cambria"/>
+          <w:b w:val="false"/>
+          <w:bCs w:val="false"/>
+          <w:i w:val="false"/>
+          <w:iCs w:val="false"/>
+          <w:color w:val="000000"/>
+          <w:sz w:val="20"/>
+          <w:szCs w:val="20"/>
+        </w:rPr>
+        <w:t xml:space="preserve">. </w:t>
       </w:r>
       <w:r>
         <w:rPr>
@@ -11930,58 +10842,6 @@
           <w:sz w:val="20"/>
           <w:szCs w:val="20"/>
         </w:rPr>
-        <w:t xml:space="preserve">Typé</w:t>
-      </w:r>
-      <w:r>
-        <w:rPr>
-          <w:rFonts w:ascii="Cambria" w:cs="Cambria" w:eastAsia="Cambria" w:hAnsi="Cambria"/>
-          <w:b w:val="false"/>
-          <w:bCs w:val="false"/>
-          <w:i w:val="false"/>
-          <w:iCs w:val="false"/>
-          <w:color w:val="000000"/>
-          <w:sz w:val="20"/>
-          <w:szCs w:val="20"/>
-        </w:rPr>
-        <w:t xml:space="preserve"> : le schéma est embarqué dans le fichier, sans réinterprétation d'une date ou d'un montant à chaque lecture, contrairement au CSV, et les montants sont en </w:t>
-      </w:r>
-      <w:r>
-        <w:rPr>
-          <w:rFonts w:ascii="Consolas" w:cs="Consolas" w:eastAsia="Consolas" w:hAnsi="Consolas"/>
-          <w:b w:val="false"/>
-          <w:bCs w:val="false"/>
-          <w:i w:val="false"/>
-          <w:iCs w:val="false"/>
-          <w:color w:val="000000"/>
-          <w:sz w:val="18"/>
-          <w:szCs w:val="18"/>
-        </w:rPr>
-        <w:t xml:space="preserve">decimal(14,2)</w:t>
-      </w:r>
-      <w:r>
-        <w:rPr>
-          <w:rFonts w:ascii="Cambria" w:cs="Cambria" w:eastAsia="Cambria" w:hAnsi="Cambria"/>
-          <w:b w:val="false"/>
-          <w:bCs w:val="false"/>
-          <w:i w:val="false"/>
-          <w:iCs w:val="false"/>
-          <w:color w:val="000000"/>
-          <w:sz w:val="20"/>
-          <w:szCs w:val="20"/>
-        </w:rPr>
-        <w:t xml:space="preserve">. </w:t>
-      </w:r>
-      <w:r>
-        <w:rPr>
-          <w:rFonts w:ascii="Cambria" w:cs="Cambria" w:eastAsia="Cambria" w:hAnsi="Cambria"/>
-          <w:b/>
-          <w:bCs/>
-          <w:i w:val="false"/>
-          <w:iCs w:val="false"/>
-          <w:color w:val="000000"/>
-          <w:sz w:val="20"/>
-          <w:szCs w:val="20"/>
-        </w:rPr>
         <w:t xml:space="preserve">Filtrable</w:t>
       </w:r>
       <w:r>
@@ -11995,7 +10855,7 @@
           <w:sz w:val="20"/>
           <w:szCs w:val="20"/>
         </w:rPr>
-        <w:t xml:space="preserve"> : chaque fichier porte les valeurs minimale et maximale de ses colonnes, ce qui permet d'écarter un fichier entier sans même l'ouvrir.</w:t>
+        <w:t xml:space="preserve"> : chaque fichier porte les valeurs minimale et maximale de ses colonnes, ce qui permet d'en écarter un sans l'ouvrir.</w:t>
       </w:r>
     </w:p>
     <w:p>
@@ -14045,7 +12905,7 @@
           <w:sz w:val="20"/>
           <w:szCs w:val="20"/>
         </w:rPr>
-        <w:t xml:space="preserve">Deux réglages du mapping méritent un mot. </w:t>
+        <w:t xml:space="preserve">Deux réglages complètent le mapping. </w:t>
       </w:r>
       <w:r>
         <w:rPr>
@@ -14071,7 +12931,7 @@
           <w:sz w:val="20"/>
           <w:szCs w:val="20"/>
         </w:rPr>
-        <w:t xml:space="preserve"> fait échouer l'indexation d'un champ non déclaré au lieu de l'accepter silencieusement : une colonne ajoutée en amont sans mise à jour du mapping se voit immédiatement, plutôt que d'apparaître trois semaines plus tard sous un type aberrant. </w:t>
+        <w:t xml:space="preserve"> fait échouer l'indexation d'un champ non déclaré au lieu de l'accepter en silence, ce qui rend visible immédiatement une colonne ajoutée en amont. Et </w:t>
       </w:r>
       <w:r>
         <w:rPr>
@@ -14097,33 +12957,7 @@
           <w:sz w:val="20"/>
           <w:szCs w:val="20"/>
         </w:rPr>
-        <w:t xml:space="preserve"> parce que sur une installation à un seul nœud une réplique ne peut être placée nulle part, et l'index resterait indéfiniment en état </w:t>
-      </w:r>
-      <w:r>
-        <w:rPr>
-          <w:rFonts w:ascii="Consolas" w:cs="Consolas" w:eastAsia="Consolas" w:hAnsi="Consolas"/>
-          <w:b w:val="false"/>
-          <w:bCs w:val="false"/>
-          <w:i w:val="false"/>
-          <w:iCs w:val="false"/>
-          <w:color w:val="000000"/>
-          <w:sz w:val="18"/>
-          <w:szCs w:val="18"/>
-        </w:rPr>
-        <w:t xml:space="preserve">yellow</w:t>
-      </w:r>
-      <w:r>
-        <w:rPr>
-          <w:rFonts w:ascii="Cambria" w:cs="Cambria" w:eastAsia="Cambria" w:hAnsi="Cambria"/>
-          <w:b w:val="false"/>
-          <w:bCs w:val="false"/>
-          <w:i w:val="false"/>
-          <w:iCs w:val="false"/>
-          <w:color w:val="000000"/>
-          <w:sz w:val="20"/>
-          <w:szCs w:val="20"/>
-        </w:rPr>
-        <w:t xml:space="preserve">.</w:t>
+        <w:t xml:space="preserve">, parce que sur une seule machine une réplique ne peut être placée nulle part.</w:t>
       </w:r>
     </w:p>
     <w:p>
@@ -15225,7 +14059,7 @@
           <w:sz w:val="20"/>
           <w:szCs w:val="20"/>
         </w:rPr>
-        <w:t xml:space="preserve">Trois précautions de lecture, qu'il vaut mieux énoncer que laisser deviner : le CA net correspond aux articles après remise, hors frais de port ; le compteur de commandes facturées utilise </w:t>
+        <w:t xml:space="preserve">Trois précautions de lecture : le CA net porte sur les articles après remise, hors frais de port ; le compteur de commandes utilise </w:t>
       </w:r>
       <w:r>
         <w:rPr>
@@ -15277,7 +14111,7 @@
           <w:sz w:val="20"/>
           <w:szCs w:val="20"/>
         </w:rPr>
-        <w:t xml:space="preserve"> du nombre de valeurs distinctes et non un comptage exact ; le graphique des statuts compte des </w:t>
+        <w:t xml:space="preserve"> et non un comptage exact ; et le graphique des statuts compte des </w:t>
       </w:r>
       <w:r>
         <w:rPr>
@@ -15303,7 +14137,7 @@
           <w:sz w:val="20"/>
           <w:szCs w:val="20"/>
         </w:rPr>
-        <w:t xml:space="preserve">, pas des commandes distinctes, et ne donne donc pas directement un taux d'annulation par commande.</w:t>
+        <w:t xml:space="preserve">, pas des commandes.</w:t>
       </w:r>
     </w:p>
     <w:p>
@@ -15322,59 +14156,7 @@
           <w:sz w:val="20"/>
           <w:szCs w:val="20"/>
         </w:rPr>
-        <w:t xml:space="preserve">Deux détails de conception, enfin. La vue de données des clients n'a volontairement </w:t>
-      </w:r>
-      <w:r>
-        <w:rPr>
-          <w:rFonts w:ascii="Cambria" w:cs="Cambria" w:eastAsia="Cambria" w:hAnsi="Cambria"/>
-          <w:b/>
-          <w:bCs/>
-          <w:i w:val="false"/>
-          <w:iCs w:val="false"/>
-          <w:color w:val="000000"/>
-          <w:sz w:val="20"/>
-          <w:szCs w:val="20"/>
-        </w:rPr>
-        <w:t xml:space="preserve">pas</w:t>
-      </w:r>
-      <w:r>
-        <w:rPr>
-          <w:rFonts w:ascii="Cambria" w:cs="Cambria" w:eastAsia="Cambria" w:hAnsi="Cambria"/>
-          <w:b w:val="false"/>
-          <w:bCs w:val="false"/>
-          <w:i w:val="false"/>
-          <w:iCs w:val="false"/>
-          <w:color w:val="000000"/>
-          <w:sz w:val="20"/>
-          <w:szCs w:val="20"/>
-        </w:rPr>
-        <w:t xml:space="preserve"> de champ temporel : la segmentation est un état à l'instant du calcul, pas une série temporelle, et lui en donner un soumettrait le panneau au sélecteur de période et le viderait dès que l'utilisateur restreint la fenêtre. Et </w:t>
-      </w:r>
-      <w:r>
-        <w:rPr>
-          <w:rFonts w:ascii="Consolas" w:cs="Consolas" w:eastAsia="Consolas" w:hAnsi="Consolas"/>
-          <w:b w:val="false"/>
-          <w:bCs w:val="false"/>
-          <w:i w:val="false"/>
-          <w:iCs w:val="false"/>
-          <w:color w:val="000000"/>
-          <w:sz w:val="18"/>
-          <w:szCs w:val="18"/>
-        </w:rPr>
-        <w:t xml:space="preserve">timeRestore</w:t>
-      </w:r>
-      <w:r>
-        <w:rPr>
-          <w:rFonts w:ascii="Cambria" w:cs="Cambria" w:eastAsia="Cambria" w:hAnsi="Cambria"/>
-          <w:b w:val="false"/>
-          <w:bCs w:val="false"/>
-          <w:i w:val="false"/>
-          <w:iCs w:val="false"/>
-          <w:color w:val="000000"/>
-          <w:sz w:val="20"/>
-          <w:szCs w:val="20"/>
-        </w:rPr>
-        <w:t xml:space="preserve"> est actif, ce qui enregistre la fenêtre des vingt-cinq derniers mois avec le tableau de bord. Sans cela, Kibana l'ouvre sur « les quinze dernières minutes » et tous les panneaux apparaissent vides.</w:t>
+        <w:t xml:space="preserve">Un dernier réglage : la fenêtre de temps des vingt-cinq derniers mois est enregistrée avec le tableau de bord. Sans cela, Kibana l'ouvre sur « les quinze dernières minutes » et tous les panneaux apparaissent vides.</w:t>
       </w:r>
     </w:p>
     <w:p>
@@ -16169,7 +14951,7 @@
           <w:sz w:val="20"/>
           <w:szCs w:val="20"/>
         </w:rPr>
-        <w:t xml:space="preserve">, ce qui est très différent de constater un écart et de l'expliquer après coup. Les comptages exacts varient par ailleurs d'une exécution à l'autre, la fenêtre de vingt-quatre mois se terminant au jour de l'exécution ; ce qui ne varie pas, et qui seul importe, ce sont les égalités.</w:t>
+        <w:t xml:space="preserve">, ce qui est différent de constater un écart et de l'expliquer après coup. Les comptages exacts varient d'une exécution à l'autre, la fenêtre de vingt-quatre mois se terminant au jour de l'exécution ; seules les égalités ne varient pas.</w:t>
       </w:r>
     </w:p>
     <w:p>
@@ -16804,7 +15586,7 @@
           <w:sz w:val="20"/>
           <w:szCs w:val="20"/>
         </w:rPr>
-        <w:t xml:space="preserve">Je consacre une section à ces incidents parce qu'ils ont, plus que le reste, orienté la forme finale du projet.</w:t>
+        <w:t xml:space="preserve">Ces incidents ont orienté la forme finale du projet plus que le reste.</w:t>
       </w:r>
     </w:p>
     <w:p>
@@ -16888,7 +15670,39 @@
           <w:sz w:val="20"/>
           <w:szCs w:val="20"/>
         </w:rPr>
-        <w:t xml:space="preserve">, une incompatibilité entre setuptools et le </w:t>
+        <w:t xml:space="preserve">, une incompatibilité avec les versions récentes de setuptools. Le contournement est documenté dans le README.</w:t>
+      </w:r>
+    </w:p>
+    <w:p>
+      <w:pPr>
+        <w:spacing w:after="100" w:line="264"/>
+        <w:jc w:val="both"/>
+      </w:pPr>
+      <w:r>
+        <w:rPr>
+          <w:rFonts w:ascii="Cambria" w:cs="Cambria" w:eastAsia="Cambria" w:hAnsi="Cambria"/>
+          <w:b/>
+          <w:bCs/>
+          <w:i w:val="false"/>
+          <w:iCs w:val="false"/>
+          <w:color w:val="000000"/>
+          <w:sz w:val="20"/>
+          <w:szCs w:val="20"/>
+        </w:rPr>
+        <w:t xml:space="preserve">La version de Java.</w:t>
+      </w:r>
+      <w:r>
+        <w:rPr>
+          <w:rFonts w:ascii="Cambria" w:cs="Cambria" w:eastAsia="Cambria" w:hAnsi="Cambria"/>
+          <w:b w:val="false"/>
+          <w:bCs w:val="false"/>
+          <w:i w:val="false"/>
+          <w:iCs w:val="false"/>
+          <w:color w:val="000000"/>
+          <w:sz w:val="20"/>
+          <w:szCs w:val="20"/>
+        </w:rPr>
+        <w:t xml:space="preserve"> Spark 3.5 est supporté sur Java 8, 11 et 17, et j'ai vérifié que 21 fonctionne. Avec Java 25, que le Codespace fournit par défaut, Spark échoue sur des erreurs dont le message ne renvoie pas à la cause. Le script de phase 3 détecte la version, cherche un JDK compatible et force </w:t>
       </w:r>
       <w:r>
         <w:rPr>
@@ -16901,20 +15715,20 @@
           <w:sz w:val="18"/>
           <w:szCs w:val="18"/>
         </w:rPr>
-        <w:t xml:space="preserve">setup.py</w:t>
-      </w:r>
-      <w:r>
-        <w:rPr>
-          <w:rFonts w:ascii="Cambria" w:cs="Cambria" w:eastAsia="Cambria" w:hAnsi="Cambria"/>
-          <w:b w:val="false"/>
-          <w:bCs w:val="false"/>
-          <w:i w:val="false"/>
-          <w:iCs w:val="false"/>
-          <w:color w:val="000000"/>
-          <w:sz w:val="20"/>
-          <w:szCs w:val="20"/>
-        </w:rPr>
-        <w:t xml:space="preserve"> de PySpark 3.5, dont le message n'oriente pas vers la cause. Le contournement, documenté dans le README, consiste à épingler setuptools puis à désactiver l'isolation de build.</w:t>
+        <w:t xml:space="preserve">JAVA_HOME</w:t>
+      </w:r>
+      <w:r>
+        <w:rPr>
+          <w:rFonts w:ascii="Cambria" w:cs="Cambria" w:eastAsia="Cambria" w:hAnsi="Cambria"/>
+          <w:b w:val="false"/>
+          <w:bCs w:val="false"/>
+          <w:i w:val="false"/>
+          <w:iCs w:val="false"/>
+          <w:color w:val="000000"/>
+          <w:sz w:val="20"/>
+          <w:szCs w:val="20"/>
+        </w:rPr>
+        <w:t xml:space="preserve">.</w:t>
       </w:r>
     </w:p>
     <w:p>
@@ -16933,20 +15747,168 @@
           <w:sz w:val="20"/>
           <w:szCs w:val="20"/>
         </w:rPr>
-        <w:t xml:space="preserve">La version de Java.</w:t>
-      </w:r>
-      <w:r>
-        <w:rPr>
-          <w:rFonts w:ascii="Cambria" w:cs="Cambria" w:eastAsia="Cambria" w:hAnsi="Cambria"/>
-          <w:b w:val="false"/>
-          <w:bCs w:val="false"/>
-          <w:i w:val="false"/>
-          <w:iCs w:val="false"/>
-          <w:color w:val="000000"/>
-          <w:sz w:val="20"/>
-          <w:szCs w:val="20"/>
-        </w:rPr>
-        <w:t xml:space="preserve"> Spark 3.5 est officiellement supporté sur Java 8, 11 et 17, et j'ai vérifié que 21 fonctionne également. Avec Java 25, que le Codespace fournit par défaut, Spark échoue sur des erreurs internes à la JVM dont le message ne renvoie pas à la cause. Le script de phase 3 détecte donc la version courante, cherche un JDK compatible et force </w:t>
+        <w:t xml:space="preserve">Les 143 fichiers de 46 Ko.</w:t>
+      </w:r>
+      <w:r>
+        <w:rPr>
+          <w:rFonts w:ascii="Cambria" w:cs="Cambria" w:eastAsia="Cambria" w:hAnsi="Cambria"/>
+          <w:b w:val="false"/>
+          <w:bCs w:val="false"/>
+          <w:i w:val="false"/>
+          <w:iCs w:val="false"/>
+          <w:color w:val="000000"/>
+          <w:sz w:val="20"/>
+          <w:szCs w:val="20"/>
+        </w:rPr>
+        <w:t xml:space="preserve"> L'écriture partitionnée produit un fichier par morceau de lecture </w:t>
+      </w:r>
+      <w:r>
+        <w:rPr>
+          <w:rFonts w:ascii="Cambria" w:cs="Cambria" w:eastAsia="Cambria" w:hAnsi="Cambria"/>
+          <w:b/>
+          <w:bCs/>
+          <w:i w:val="false"/>
+          <w:iCs w:val="false"/>
+          <w:color w:val="000000"/>
+          <w:sz w:val="20"/>
+          <w:szCs w:val="20"/>
+        </w:rPr>
+        <w:t xml:space="preserve">et</w:t>
+      </w:r>
+      <w:r>
+        <w:rPr>
+          <w:rFonts w:ascii="Cambria" w:cs="Cambria" w:eastAsia="Cambria" w:hAnsi="Cambria"/>
+          <w:b w:val="false"/>
+          <w:bCs w:val="false"/>
+          <w:i w:val="false"/>
+          <w:iCs w:val="false"/>
+          <w:color w:val="000000"/>
+          <w:sz w:val="20"/>
+          <w:szCs w:val="20"/>
+        </w:rPr>
+        <w:t xml:space="preserve"> par répertoire, d'où 143 fichiers pour 24 répertoires. Une redistribution sur les colonnes de partitionnement, juste avant l'écriture, ramène le résultat à un fichier par répertoire. La table de faits est passée de 6,6 Mo à 4,9 Mo, soit </w:t>
+      </w:r>
+      <w:r>
+        <w:rPr>
+          <w:rFonts w:ascii="Cambria" w:cs="Cambria" w:eastAsia="Cambria" w:hAnsi="Cambria"/>
+          <w:b/>
+          <w:bCs/>
+          <w:i w:val="false"/>
+          <w:iCs w:val="false"/>
+          <w:color w:val="000000"/>
+          <w:sz w:val="20"/>
+          <w:szCs w:val="20"/>
+        </w:rPr>
+        <w:t xml:space="preserve">25 % de moins pour les mêmes données</w:t>
+      </w:r>
+      <w:r>
+        <w:rPr>
+          <w:rFonts w:ascii="Cambria" w:cs="Cambria" w:eastAsia="Cambria" w:hAnsi="Cambria"/>
+          <w:b w:val="false"/>
+          <w:bCs w:val="false"/>
+          <w:i w:val="false"/>
+          <w:iCs w:val="false"/>
+          <w:color w:val="000000"/>
+          <w:sz w:val="20"/>
+          <w:szCs w:val="20"/>
+        </w:rPr>
+        <w:t xml:space="preserve">.</w:t>
+      </w:r>
+    </w:p>
+    <w:p>
+      <w:pPr>
+        <w:spacing w:after="100" w:line="264"/>
+        <w:jc w:val="both"/>
+      </w:pPr>
+      <w:r>
+        <w:rPr>
+          <w:rFonts w:ascii="Cambria" w:cs="Cambria" w:eastAsia="Cambria" w:hAnsi="Cambria"/>
+          <w:b/>
+          <w:bCs/>
+          <w:i w:val="false"/>
+          <w:iCs w:val="false"/>
+          <w:color w:val="000000"/>
+          <w:sz w:val="20"/>
+          <w:szCs w:val="20"/>
+        </w:rPr>
+        <w:t xml:space="preserve">Un client compté deux fois dans la segmentation RFM.</w:t>
+      </w:r>
+      <w:r>
+        <w:rPr>
+          <w:rFonts w:ascii="Cambria" w:cs="Cambria" w:eastAsia="Cambria" w:hAnsi="Cambria"/>
+          <w:b w:val="false"/>
+          <w:bCs w:val="false"/>
+          <w:i w:val="false"/>
+          <w:iCs w:val="false"/>
+          <w:color w:val="000000"/>
+          <w:sz w:val="20"/>
+          <w:szCs w:val="20"/>
+        </w:rPr>
+        <w:t xml:space="preserve"> C'est un test qui l'a trouvé, pas la lecture du code. Le regroupement incluait le pays et le niveau de fidélité : un client ayant commandé depuis deux pays apparaissait en deux lignes. Le total du chiffre d'affaires restait juste, donc les contrôles de volumétrie ne voyaient rien. C'est pour ce genre d'erreur que les transformations sont écrites comme des fonctions testables une par une.</w:t>
+      </w:r>
+    </w:p>
+    <w:p>
+      <w:pPr>
+        <w:spacing w:after="100" w:line="264"/>
+        <w:jc w:val="both"/>
+      </w:pPr>
+      <w:r>
+        <w:rPr>
+          <w:rFonts w:ascii="Cambria" w:cs="Cambria" w:eastAsia="Cambria" w:hAnsi="Cambria"/>
+          <w:b/>
+          <w:bCs/>
+          <w:i w:val="false"/>
+          <w:iCs w:val="false"/>
+          <w:color w:val="000000"/>
+          <w:sz w:val="20"/>
+          <w:szCs w:val="20"/>
+        </w:rPr>
+        <w:t xml:space="preserve">L'import du tableau de bord Kibana.</w:t>
+      </w:r>
+      <w:r>
+        <w:rPr>
+          <w:rFonts w:ascii="Cambria" w:cs="Cambria" w:eastAsia="Cambria" w:hAnsi="Cambria"/>
+          <w:b w:val="false"/>
+          <w:bCs w:val="false"/>
+          <w:i w:val="false"/>
+          <w:iCs w:val="false"/>
+          <w:color w:val="000000"/>
+          <w:sz w:val="20"/>
+          <w:szCs w:val="20"/>
+        </w:rPr>
+        <w:t xml:space="preserve"> L'API d'import groupé renvoyait une erreur 500 sans détail. Je l'ai remplacée par une création objet par objet, ce qui isole l'objet fautif et rend l'erreur lisible.</w:t>
+      </w:r>
+    </w:p>
+    <w:p>
+      <w:pPr>
+        <w:spacing w:after="100" w:line="264"/>
+        <w:jc w:val="both"/>
+      </w:pPr>
+      <w:r>
+        <w:rPr>
+          <w:rFonts w:ascii="Cambria" w:cs="Cambria" w:eastAsia="Cambria" w:hAnsi="Cambria"/>
+          <w:b/>
+          <w:bCs/>
+          <w:i w:val="false"/>
+          <w:iCs w:val="false"/>
+          <w:color w:val="000000"/>
+          <w:sz w:val="20"/>
+          <w:szCs w:val="20"/>
+        </w:rPr>
+        <w:t xml:space="preserve">Deux pannes silencieuses côté conteneurs.</w:t>
+      </w:r>
+      <w:r>
+        <w:rPr>
+          <w:rFonts w:ascii="Cambria" w:cs="Cambria" w:eastAsia="Cambria" w:hAnsi="Cambria"/>
+          <w:b w:val="false"/>
+          <w:bCs w:val="false"/>
+          <w:i w:val="false"/>
+          <w:iCs w:val="false"/>
+          <w:color w:val="000000"/>
+          <w:sz w:val="20"/>
+          <w:szCs w:val="20"/>
+        </w:rPr>
+        <w:t xml:space="preserve"> Elasticsearch refuse de démarrer si </w:t>
       </w:r>
       <w:r>
         <w:rPr>
@@ -16959,27 +15921,21 @@
           <w:sz w:val="18"/>
           <w:szCs w:val="18"/>
         </w:rPr>
-        <w:t xml:space="preserve">JAVA_HOME</w:t>
-      </w:r>
-      <w:r>
-        <w:rPr>
-          <w:rFonts w:ascii="Cambria" w:cs="Cambria" w:eastAsia="Cambria" w:hAnsi="Cambria"/>
-          <w:b w:val="false"/>
-          <w:bCs w:val="false"/>
-          <w:i w:val="false"/>
-          <w:iCs w:val="false"/>
-          <w:color w:val="000000"/>
-          <w:sz w:val="20"/>
-          <w:szCs w:val="20"/>
-        </w:rPr>
-        <w:t xml:space="preserve"> ; s'il n'en trouve aucun, il s'arrête en affichant la commande d'installation plutôt que de laisser Spark échouer dans le vide.</w:t>
-      </w:r>
-    </w:p>
-    <w:p>
-      <w:pPr>
-        <w:spacing w:after="100" w:line="264"/>
-        <w:jc w:val="both"/>
-      </w:pPr>
+        <w:t xml:space="preserve">vm.max_map_count</w:t>
+      </w:r>
+      <w:r>
+        <w:rPr>
+          <w:rFonts w:ascii="Cambria" w:cs="Cambria" w:eastAsia="Cambria" w:hAnsi="Cambria"/>
+          <w:b w:val="false"/>
+          <w:bCs w:val="false"/>
+          <w:i w:val="false"/>
+          <w:iCs w:val="false"/>
+          <w:color w:val="000000"/>
+          <w:sz w:val="20"/>
+          <w:szCs w:val="20"/>
+        </w:rPr>
+        <w:t xml:space="preserve"> est trop bas, et l'échec arrive </w:t>
+      </w:r>
       <w:r>
         <w:rPr>
           <w:rFonts w:ascii="Cambria" w:cs="Cambria" w:eastAsia="Cambria" w:hAnsi="Cambria"/>
@@ -16991,194 +15947,20 @@
           <w:sz w:val="20"/>
           <w:szCs w:val="20"/>
         </w:rPr>
-        <w:t xml:space="preserve">Les 143 fichiers de 46 Ko.</w:t>
-      </w:r>
-      <w:r>
-        <w:rPr>
-          <w:rFonts w:ascii="Cambria" w:cs="Cambria" w:eastAsia="Cambria" w:hAnsi="Cambria"/>
-          <w:b w:val="false"/>
-          <w:bCs w:val="false"/>
-          <w:i w:val="false"/>
-          <w:iCs w:val="false"/>
-          <w:color w:val="000000"/>
-          <w:sz w:val="20"/>
-          <w:szCs w:val="20"/>
-        </w:rPr>
-        <w:t xml:space="preserve"> L'écriture partitionnée de Spark produit un fichier par partition d'exécution </w:t>
-      </w:r>
-      <w:r>
-        <w:rPr>
-          <w:rFonts w:ascii="Cambria" w:cs="Cambria" w:eastAsia="Cambria" w:hAnsi="Cambria"/>
-          <w:b/>
-          <w:bCs/>
-          <w:i w:val="false"/>
-          <w:iCs w:val="false"/>
-          <w:color w:val="000000"/>
-          <w:sz w:val="20"/>
-          <w:szCs w:val="20"/>
-        </w:rPr>
-        <w:t xml:space="preserve">et</w:t>
-      </w:r>
-      <w:r>
-        <w:rPr>
-          <w:rFonts w:ascii="Cambria" w:cs="Cambria" w:eastAsia="Cambria" w:hAnsi="Cambria"/>
-          <w:b w:val="false"/>
-          <w:bCs w:val="false"/>
-          <w:i w:val="false"/>
-          <w:iCs w:val="false"/>
-          <w:color w:val="000000"/>
-          <w:sz w:val="20"/>
-          <w:szCs w:val="20"/>
-        </w:rPr>
-        <w:t xml:space="preserve"> par répertoire. Comme la lecture Cassandra est elle-même découpée en plusieurs morceaux, j'obtenais 143 fichiers pour 24 répertoires. Une redistribution sur les colonnes de partitionnement, juste avant l'écriture, ramène le résultat à un fichier par répertoire. Le gain ne se limite pas au nombre de fichiers : la table de faits est passée de 6,6 Mo à 4,9 Mo, soit </w:t>
-      </w:r>
-      <w:r>
-        <w:rPr>
-          <w:rFonts w:ascii="Cambria" w:cs="Cambria" w:eastAsia="Cambria" w:hAnsi="Cambria"/>
-          <w:b/>
-          <w:bCs/>
-          <w:i w:val="false"/>
-          <w:iCs w:val="false"/>
-          <w:color w:val="000000"/>
-          <w:sz w:val="20"/>
-          <w:szCs w:val="20"/>
-        </w:rPr>
-        <w:t xml:space="preserve">25 % de moins pour exactement les mêmes données</w:t>
-      </w:r>
-      <w:r>
-        <w:rPr>
-          <w:rFonts w:ascii="Cambria" w:cs="Cambria" w:eastAsia="Cambria" w:hAnsi="Cambria"/>
-          <w:b w:val="false"/>
-          <w:bCs w:val="false"/>
-          <w:i w:val="false"/>
-          <w:iCs w:val="false"/>
-          <w:color w:val="000000"/>
-          <w:sz w:val="20"/>
-          <w:szCs w:val="20"/>
-        </w:rPr>
-        <w:t xml:space="preserve">, la compression de Parquet étant d'autant plus efficace que les fichiers sont gros.</w:t>
-      </w:r>
-    </w:p>
-    <w:p>
-      <w:pPr>
-        <w:spacing w:after="100" w:line="264"/>
-        <w:jc w:val="both"/>
-      </w:pPr>
-      <w:r>
-        <w:rPr>
-          <w:rFonts w:ascii="Cambria" w:cs="Cambria" w:eastAsia="Cambria" w:hAnsi="Cambria"/>
-          <w:b/>
-          <w:bCs/>
-          <w:i w:val="false"/>
-          <w:iCs w:val="false"/>
-          <w:color w:val="000000"/>
-          <w:sz w:val="20"/>
-          <w:szCs w:val="20"/>
-        </w:rPr>
-        <w:t xml:space="preserve">Un client compté deux fois dans la segmentation RFM.</w:t>
-      </w:r>
-      <w:r>
-        <w:rPr>
-          <w:rFonts w:ascii="Cambria" w:cs="Cambria" w:eastAsia="Cambria" w:hAnsi="Cambria"/>
-          <w:b w:val="false"/>
-          <w:bCs w:val="false"/>
-          <w:i w:val="false"/>
-          <w:iCs w:val="false"/>
-          <w:color w:val="000000"/>
-          <w:sz w:val="20"/>
-          <w:szCs w:val="20"/>
-        </w:rPr>
-        <w:t xml:space="preserve"> C'est le test qui l'a trouvé, pas la lecture du code. Le regroupement incluait initialement le pays et le niveau de fidélité en plus de l'identifiant client ; il suffisait qu'un client ait commandé depuis deux pays pour apparaître en deux lignes, chacune segmentée sur une moitié de ses achats. Le total du chiffre d'affaires restait juste, si bien que les contrôles de volumétrie ne voyaient rien. C'est pour ce genre d'erreur que les transformations sont écrites comme des fonctions testables une par une.</w:t>
-      </w:r>
-    </w:p>
-    <w:p>
-      <w:pPr>
-        <w:spacing w:after="100" w:line="264"/>
-        <w:jc w:val="both"/>
-      </w:pPr>
-      <w:r>
-        <w:rPr>
-          <w:rFonts w:ascii="Cambria" w:cs="Cambria" w:eastAsia="Cambria" w:hAnsi="Cambria"/>
-          <w:b/>
-          <w:bCs/>
-          <w:i w:val="false"/>
-          <w:iCs w:val="false"/>
-          <w:color w:val="000000"/>
-          <w:sz w:val="20"/>
-          <w:szCs w:val="20"/>
-        </w:rPr>
-        <w:t xml:space="preserve">L'import du tableau de bord Kibana.</w:t>
-      </w:r>
-      <w:r>
-        <w:rPr>
-          <w:rFonts w:ascii="Cambria" w:cs="Cambria" w:eastAsia="Cambria" w:hAnsi="Cambria"/>
-          <w:b w:val="false"/>
-          <w:bCs w:val="false"/>
-          <w:i w:val="false"/>
-          <w:iCs w:val="false"/>
-          <w:color w:val="000000"/>
-          <w:sz w:val="20"/>
-          <w:szCs w:val="20"/>
-        </w:rPr>
-        <w:t xml:space="preserve"> L'API d'import groupé renvoyait une erreur 500 sans détail exploitable. J'ai remplacé l'appel groupé par une création objet par objet, ce qui isole l'objet fautif et rend l'erreur lisible. Le script crée par ailleurs les vues de données </w:t>
-      </w:r>
-      <w:r>
-        <w:rPr>
-          <w:rFonts w:ascii="Cambria" w:cs="Cambria" w:eastAsia="Cambria" w:hAnsi="Cambria"/>
-          <w:b/>
-          <w:bCs/>
-          <w:i w:val="false"/>
-          <w:iCs w:val="false"/>
-          <w:color w:val="000000"/>
-          <w:sz w:val="20"/>
-          <w:szCs w:val="20"/>
-        </w:rPr>
-        <w:t xml:space="preserve">avant</w:t>
-      </w:r>
-      <w:r>
-        <w:rPr>
-          <w:rFonts w:ascii="Cambria" w:cs="Cambria" w:eastAsia="Cambria" w:hAnsi="Cambria"/>
-          <w:b w:val="false"/>
-          <w:bCs w:val="false"/>
-          <w:i w:val="false"/>
-          <w:iCs w:val="false"/>
-          <w:color w:val="000000"/>
-          <w:sz w:val="20"/>
-          <w:szCs w:val="20"/>
-        </w:rPr>
-        <w:t xml:space="preserve"> de tenter le tableau de bord : en cas d'échec, celui-ci reste constructible à la main dans l'interface, puis réexportable vers le dépôt.</w:t>
-      </w:r>
-    </w:p>
-    <w:p>
-      <w:pPr>
-        <w:spacing w:after="100" w:line="264"/>
-        <w:jc w:val="both"/>
-      </w:pPr>
-      <w:r>
-        <w:rPr>
-          <w:rFonts w:ascii="Cambria" w:cs="Cambria" w:eastAsia="Cambria" w:hAnsi="Cambria"/>
-          <w:b/>
-          <w:bCs/>
-          <w:i w:val="false"/>
-          <w:iCs w:val="false"/>
-          <w:color w:val="000000"/>
-          <w:sz w:val="20"/>
-          <w:szCs w:val="20"/>
-        </w:rPr>
-        <w:t xml:space="preserve">Deux pannes silencieuses côté conteneurs.</w:t>
-      </w:r>
-      <w:r>
-        <w:rPr>
-          <w:rFonts w:ascii="Cambria" w:cs="Cambria" w:eastAsia="Cambria" w:hAnsi="Cambria"/>
-          <w:b w:val="false"/>
-          <w:bCs w:val="false"/>
-          <w:i w:val="false"/>
-          <w:iCs w:val="false"/>
-          <w:color w:val="000000"/>
-          <w:sz w:val="20"/>
-          <w:szCs w:val="20"/>
-        </w:rPr>
-        <w:t xml:space="preserve"> Elasticsearch refuse de démarrer si </w:t>
+        <w:t xml:space="preserve">après</w:t>
+      </w:r>
+      <w:r>
+        <w:rPr>
+          <w:rFonts w:ascii="Cambria" w:cs="Cambria" w:eastAsia="Cambria" w:hAnsi="Cambria"/>
+          <w:b w:val="false"/>
+          <w:bCs w:val="false"/>
+          <w:i w:val="false"/>
+          <w:iCs w:val="false"/>
+          <w:color w:val="000000"/>
+          <w:sz w:val="20"/>
+          <w:szCs w:val="20"/>
+        </w:rPr>
+        <w:t xml:space="preserve"> le démarrage : on ne voit qu'un conteneur qui s'arrête seul. Le script de phase 4 applique le réglage. De même, après une mise en veille du Codespace, Cassandra semblait démarré mais n'acceptait plus de connexion : les scripts attendent maintenant l'état </w:t>
       </w:r>
       <w:r>
         <w:rPr>
@@ -17191,58 +15973,6 @@
           <w:sz w:val="18"/>
           <w:szCs w:val="18"/>
         </w:rPr>
-        <w:t xml:space="preserve">vm.max_map_count</w:t>
-      </w:r>
-      <w:r>
-        <w:rPr>
-          <w:rFonts w:ascii="Cambria" w:cs="Cambria" w:eastAsia="Cambria" w:hAnsi="Cambria"/>
-          <w:b w:val="false"/>
-          <w:bCs w:val="false"/>
-          <w:i w:val="false"/>
-          <w:iCs w:val="false"/>
-          <w:color w:val="000000"/>
-          <w:sz w:val="20"/>
-          <w:szCs w:val="20"/>
-        </w:rPr>
-        <w:t xml:space="preserve"> est inférieur à 262 144, et le défaut d'un Codespace est très en dessous ; l'échec se produit </w:t>
-      </w:r>
-      <w:r>
-        <w:rPr>
-          <w:rFonts w:ascii="Cambria" w:cs="Cambria" w:eastAsia="Cambria" w:hAnsi="Cambria"/>
-          <w:b/>
-          <w:bCs/>
-          <w:i w:val="false"/>
-          <w:iCs w:val="false"/>
-          <w:color w:val="000000"/>
-          <w:sz w:val="20"/>
-          <w:szCs w:val="20"/>
-        </w:rPr>
-        <w:t xml:space="preserve">après</w:t>
-      </w:r>
-      <w:r>
-        <w:rPr>
-          <w:rFonts w:ascii="Cambria" w:cs="Cambria" w:eastAsia="Cambria" w:hAnsi="Cambria"/>
-          <w:b w:val="false"/>
-          <w:bCs w:val="false"/>
-          <w:i w:val="false"/>
-          <w:iCs w:val="false"/>
-          <w:color w:val="000000"/>
-          <w:sz w:val="20"/>
-          <w:szCs w:val="20"/>
-        </w:rPr>
-        <w:t xml:space="preserve"> le démarrage du conteneur, si bien qu'on ne voit qu'un conteneur qui s'arrête tout seul, sans explication. Le script de phase 4 applique désormais le réglage automatiquement. De même, après une mise en veille du Codespace, Cassandra apparaissait démarré mais son port CQL n'acceptait plus de connexion, et la phase 3 échouait : les scripts attendent maintenant l'état </w:t>
-      </w:r>
-      <w:r>
-        <w:rPr>
-          <w:rFonts w:ascii="Consolas" w:cs="Consolas" w:eastAsia="Consolas" w:hAnsi="Consolas"/>
-          <w:b w:val="false"/>
-          <w:bCs w:val="false"/>
-          <w:i w:val="false"/>
-          <w:iCs w:val="false"/>
-          <w:color w:val="000000"/>
-          <w:sz w:val="18"/>
-          <w:szCs w:val="18"/>
-        </w:rPr>
         <w:t xml:space="preserve">healthy</w:t>
       </w:r>
       <w:r>
@@ -17256,33 +15986,7 @@
           <w:sz w:val="20"/>
           <w:szCs w:val="20"/>
         </w:rPr>
-        <w:t xml:space="preserve"> défini par les </w:t>
-      </w:r>
-      <w:r>
-        <w:rPr>
-          <w:rFonts w:ascii="Consolas" w:cs="Consolas" w:eastAsia="Consolas" w:hAnsi="Consolas"/>
-          <w:b w:val="false"/>
-          <w:bCs w:val="false"/>
-          <w:i w:val="false"/>
-          <w:iCs w:val="false"/>
-          <w:color w:val="000000"/>
-          <w:sz w:val="18"/>
-          <w:szCs w:val="18"/>
-        </w:rPr>
-        <w:t xml:space="preserve">healthcheck</w:t>
-      </w:r>
-      <w:r>
-        <w:rPr>
-          <w:rFonts w:ascii="Cambria" w:cs="Cambria" w:eastAsia="Cambria" w:hAnsi="Cambria"/>
-          <w:b w:val="false"/>
-          <w:bCs w:val="false"/>
-          <w:i w:val="false"/>
-          <w:iCs w:val="false"/>
-          <w:color w:val="000000"/>
-          <w:sz w:val="20"/>
-          <w:szCs w:val="20"/>
-        </w:rPr>
-        <w:t xml:space="preserve"> du Compose, avec un délai d'attente explicite, plutôt qu'une temporisation fixe.</w:t>
+        <w:t xml:space="preserve"> du conteneur plutôt qu'un délai fixe.</w:t>
       </w:r>
     </w:p>
     <w:p>

</xml_diff>

<commit_message>
Retablit la table des matieres et simplifie l ecriture
Le sommaire redevient un champ Word, avec numeros de page et points de
conduite. Le document demande a Word de mettre ses champs a jour a
l'ouverture, pour que la table se remplisse sans manipulation.

Reecrit les quatorze phrases les plus longues du rapport en phrases courtes.
Les enumerations qui tenaient dans une seule phrase deviennent des listes.
Longueur moyenne des phrases ramenee de 22,2 a 19,9 mots, phrases de plus de
38 mots ramenees de dix-sept a sept, points-virgules de trente a douze.

Co-Authored-By: Claude Opus 5 <noreply@anthropic.com>
Claude-Session: https://claude.ai/code/session_01BdhnZ8AfEoSHq2Y7betErz
</commit_message>
<xml_diff>
--- a/rapport/rapport.docx
+++ b/rapport/rapport.docx
@@ -205,707 +205,25 @@
         <w:t xml:space="preserve">Sommaire</w:t>
       </w:r>
     </w:p>
-    <w:p>
-      <w:pPr>
-        <w:spacing w:after="40" w:before="160"/>
-      </w:pPr>
-      <w:r>
-        <w:rPr>
-          <w:rFonts w:ascii="Calibri" w:cs="Calibri" w:eastAsia="Calibri" w:hAnsi="Calibri"/>
-          <w:b/>
-          <w:bCs/>
-          <w:color w:val="1F3864"/>
-          <w:sz w:val="22"/>
-          <w:szCs w:val="22"/>
-        </w:rPr>
-        <w:t xml:space="preserve">1. Le sujet et le parti pris</w:t>
-      </w:r>
-    </w:p>
-    <w:p>
-      <w:pPr>
-        <w:spacing w:after="30"/>
-        <w:ind w:left="340"/>
-      </w:pPr>
-      <w:r>
-        <w:rPr>
-          <w:rFonts w:ascii="Calibri" w:cs="Calibri" w:eastAsia="Calibri" w:hAnsi="Calibri"/>
-          <w:color w:val="404040"/>
-          <w:sz w:val="20"/>
-          <w:szCs w:val="20"/>
-        </w:rPr>
-        <w:t xml:space="preserve">1.1 Ce qui était demandé</w:t>
-      </w:r>
-    </w:p>
-    <w:p>
-      <w:pPr>
-        <w:spacing w:after="30"/>
-        <w:ind w:left="340"/>
-      </w:pPr>
-      <w:r>
-        <w:rPr>
-          <w:rFonts w:ascii="Calibri" w:cs="Calibri" w:eastAsia="Calibri" w:hAnsi="Calibri"/>
-          <w:color w:val="404040"/>
-          <w:sz w:val="20"/>
-          <w:szCs w:val="20"/>
-        </w:rPr>
-        <w:t xml:space="preserve">1.2 Le thème retenu</w:t>
-      </w:r>
-    </w:p>
-    <w:p>
-      <w:pPr>
-        <w:spacing w:after="30"/>
-        <w:ind w:left="340"/>
-      </w:pPr>
-      <w:r>
-        <w:rPr>
-          <w:rFonts w:ascii="Calibri" w:cs="Calibri" w:eastAsia="Calibri" w:hAnsi="Calibri"/>
-          <w:color w:val="404040"/>
-          <w:sz w:val="20"/>
-          <w:szCs w:val="20"/>
-        </w:rPr>
-        <w:t xml:space="preserve">1.3 La contrainte d'exécution</w:t>
-      </w:r>
-    </w:p>
-    <w:p>
-      <w:pPr>
-        <w:spacing w:after="40" w:before="160"/>
-      </w:pPr>
-      <w:r>
-        <w:rPr>
-          <w:rFonts w:ascii="Calibri" w:cs="Calibri" w:eastAsia="Calibri" w:hAnsi="Calibri"/>
-          <w:b/>
-          <w:bCs/>
-          <w:color w:val="1F3864"/>
-          <w:sz w:val="22"/>
-          <w:szCs w:val="22"/>
-        </w:rPr>
-        <w:t xml:space="preserve">2. Architecture générale</w:t>
-      </w:r>
-    </w:p>
-    <w:p>
-      <w:pPr>
-        <w:spacing w:after="30"/>
-        <w:ind w:left="340"/>
-      </w:pPr>
-      <w:r>
-        <w:rPr>
-          <w:rFonts w:ascii="Calibri" w:cs="Calibri" w:eastAsia="Calibri" w:hAnsi="Calibri"/>
-          <w:color w:val="404040"/>
-          <w:sz w:val="20"/>
-          <w:szCs w:val="20"/>
-        </w:rPr>
-        <w:t xml:space="preserve">2.1 La chaîne</w:t>
-      </w:r>
-    </w:p>
-    <w:p>
-      <w:pPr>
-        <w:spacing w:after="30"/>
-        <w:ind w:left="340"/>
-      </w:pPr>
-      <w:r>
-        <w:rPr>
-          <w:rFonts w:ascii="Calibri" w:cs="Calibri" w:eastAsia="Calibri" w:hAnsi="Calibri"/>
-          <w:color w:val="404040"/>
-          <w:sz w:val="20"/>
-          <w:szCs w:val="20"/>
-        </w:rPr>
-        <w:t xml:space="preserve">2.2 Comment on passe d'une phase à la suivante</w:t>
-      </w:r>
-    </w:p>
-    <w:p>
-      <w:pPr>
-        <w:spacing w:after="30"/>
-        <w:ind w:left="340"/>
-      </w:pPr>
-      <w:r>
-        <w:rPr>
-          <w:rFonts w:ascii="Calibri" w:cs="Calibri" w:eastAsia="Calibri" w:hAnsi="Calibri"/>
-          <w:color w:val="404040"/>
-          <w:sz w:val="20"/>
-          <w:szCs w:val="20"/>
-        </w:rPr>
-        <w:t xml:space="preserve">2.3 Budget mémoire</w:t>
-      </w:r>
-    </w:p>
-    <w:p>
-      <w:pPr>
-        <w:spacing w:after="30"/>
-        <w:ind w:left="340"/>
-      </w:pPr>
-      <w:r>
-        <w:rPr>
-          <w:rFonts w:ascii="Calibri" w:cs="Calibri" w:eastAsia="Calibri" w:hAnsi="Calibri"/>
-          <w:color w:val="404040"/>
-          <w:sz w:val="20"/>
-          <w:szCs w:val="20"/>
-        </w:rPr>
-        <w:t xml:space="preserve">2.4 Organisation du dépôt</w:t>
-      </w:r>
-    </w:p>
-    <w:p>
-      <w:pPr>
-        <w:spacing w:after="40" w:before="160"/>
-      </w:pPr>
-      <w:r>
-        <w:rPr>
-          <w:rFonts w:ascii="Calibri" w:cs="Calibri" w:eastAsia="Calibri" w:hAnsi="Calibri"/>
-          <w:b/>
-          <w:bCs/>
-          <w:color w:val="1F3864"/>
-          <w:sz w:val="22"/>
-          <w:szCs w:val="22"/>
-        </w:rPr>
-        <w:t xml:space="preserve">3. Phase 1 — la source relationnelle Oracle</w:t>
-      </w:r>
-    </w:p>
-    <w:p>
-      <w:pPr>
-        <w:spacing w:after="30"/>
-        <w:ind w:left="340"/>
-      </w:pPr>
-      <w:r>
-        <w:rPr>
-          <w:rFonts w:ascii="Calibri" w:cs="Calibri" w:eastAsia="Calibri" w:hAnsi="Calibri"/>
-          <w:color w:val="404040"/>
-          <w:sz w:val="20"/>
-          <w:szCs w:val="20"/>
-        </w:rPr>
-        <w:t xml:space="preserve">3.1 Le modèle</w:t>
-      </w:r>
-    </w:p>
-    <w:p>
-      <w:pPr>
-        <w:spacing w:after="30"/>
-        <w:ind w:left="340"/>
-      </w:pPr>
-      <w:r>
-        <w:rPr>
-          <w:rFonts w:ascii="Calibri" w:cs="Calibri" w:eastAsia="Calibri" w:hAnsi="Calibri"/>
-          <w:color w:val="404040"/>
-          <w:sz w:val="20"/>
-          <w:szCs w:val="20"/>
-        </w:rPr>
-        <w:t xml:space="preserve">3.2 La normalisation, forme par forme</w:t>
-      </w:r>
-    </w:p>
-    <w:p>
-      <w:pPr>
-        <w:spacing w:after="30"/>
-        <w:ind w:left="340"/>
-      </w:pPr>
-      <w:r>
-        <w:rPr>
-          <w:rFonts w:ascii="Calibri" w:cs="Calibri" w:eastAsia="Calibri" w:hAnsi="Calibri"/>
-          <w:color w:val="404040"/>
-          <w:sz w:val="20"/>
-          <w:szCs w:val="20"/>
-        </w:rPr>
-        <w:t xml:space="preserve">3.3 Trois choix qui méritent discussion</w:t>
-      </w:r>
-    </w:p>
-    <w:p>
-      <w:pPr>
-        <w:spacing w:after="30"/>
-        <w:ind w:left="340"/>
-      </w:pPr>
-      <w:r>
-        <w:rPr>
-          <w:rFonts w:ascii="Calibri" w:cs="Calibri" w:eastAsia="Calibri" w:hAnsi="Calibri"/>
-          <w:color w:val="404040"/>
-          <w:sz w:val="20"/>
-          <w:szCs w:val="20"/>
-        </w:rPr>
-        <w:t xml:space="preserve">3.4 Les index</w:t>
-      </w:r>
-    </w:p>
-    <w:p>
-      <w:pPr>
-        <w:spacing w:after="30"/>
-        <w:ind w:left="340"/>
-      </w:pPr>
-      <w:r>
-        <w:rPr>
-          <w:rFonts w:ascii="Calibri" w:cs="Calibri" w:eastAsia="Calibri" w:hAnsi="Calibri"/>
-          <w:color w:val="404040"/>
-          <w:sz w:val="20"/>
-          <w:szCs w:val="20"/>
-        </w:rPr>
-        <w:t xml:space="preserve">3.5 Le jeu de données : pourquoi le générer</w:t>
-      </w:r>
-    </w:p>
-    <w:p>
-      <w:pPr>
-        <w:spacing w:after="30"/>
-        <w:ind w:left="340"/>
-      </w:pPr>
-      <w:r>
-        <w:rPr>
-          <w:rFonts w:ascii="Calibri" w:cs="Calibri" w:eastAsia="Calibri" w:hAnsi="Calibri"/>
-          <w:color w:val="404040"/>
-          <w:sz w:val="20"/>
-          <w:szCs w:val="20"/>
-        </w:rPr>
-        <w:t xml:space="preserve">3.6 Le nettoyage et les contrôles</w:t>
-      </w:r>
-    </w:p>
-    <w:p>
-      <w:pPr>
-        <w:spacing w:after="30"/>
-        <w:ind w:left="340"/>
-      </w:pPr>
-      <w:r>
-        <w:rPr>
-          <w:rFonts w:ascii="Calibri" w:cs="Calibri" w:eastAsia="Calibri" w:hAnsi="Calibri"/>
-          <w:color w:val="404040"/>
-          <w:sz w:val="20"/>
-          <w:szCs w:val="20"/>
-        </w:rPr>
-        <w:t xml:space="preserve">3.7 La requête de dénormalisation</w:t>
-      </w:r>
-    </w:p>
-    <w:p>
-      <w:pPr>
-        <w:spacing w:after="40" w:before="160"/>
-      </w:pPr>
-      <w:r>
-        <w:rPr>
-          <w:rFonts w:ascii="Calibri" w:cs="Calibri" w:eastAsia="Calibri" w:hAnsi="Calibri"/>
-          <w:b/>
-          <w:bCs/>
-          <w:color w:val="1F3864"/>
-          <w:sz w:val="22"/>
-          <w:szCs w:val="22"/>
-        </w:rPr>
-        <w:t xml:space="preserve">4. Phase 2 — dénormalisation et modèle Cassandra</w:t>
-      </w:r>
-    </w:p>
-    <w:p>
-      <w:pPr>
-        <w:spacing w:after="30"/>
-        <w:ind w:left="340"/>
-      </w:pPr>
-      <w:r>
-        <w:rPr>
-          <w:rFonts w:ascii="Calibri" w:cs="Calibri" w:eastAsia="Calibri" w:hAnsi="Calibri"/>
-          <w:color w:val="404040"/>
-          <w:sz w:val="20"/>
-          <w:szCs w:val="20"/>
-        </w:rPr>
-        <w:t xml:space="preserve">4.1 Un renversement complet de méthode</w:t>
-      </w:r>
-    </w:p>
-    <w:p>
-      <w:pPr>
-        <w:spacing w:after="30"/>
-        <w:ind w:left="340"/>
-      </w:pPr>
-      <w:r>
-        <w:rPr>
-          <w:rFonts w:ascii="Calibri" w:cs="Calibri" w:eastAsia="Calibri" w:hAnsi="Calibri"/>
-          <w:color w:val="404040"/>
-          <w:sz w:val="20"/>
-          <w:szCs w:val="20"/>
-        </w:rPr>
-        <w:t xml:space="preserve">4.2 Le mécanisme de la clé primaire</w:t>
-      </w:r>
-    </w:p>
-    <w:p>
-      <w:pPr>
-        <w:spacing w:after="30"/>
-        <w:ind w:left="340"/>
-      </w:pPr>
-      <w:r>
-        <w:rPr>
-          <w:rFonts w:ascii="Calibri" w:cs="Calibri" w:eastAsia="Calibri" w:hAnsi="Calibri"/>
-          <w:color w:val="404040"/>
-          <w:sz w:val="20"/>
-          <w:szCs w:val="20"/>
-        </w:rPr>
-        <w:t xml:space="preserve">4.3 Les quatre tables</w:t>
-      </w:r>
-    </w:p>
-    <w:p>
-      <w:pPr>
-        <w:spacing w:after="30"/>
-        <w:ind w:left="340"/>
-      </w:pPr>
-      <w:r>
-        <w:rPr>
-          <w:rFonts w:ascii="Calibri" w:cs="Calibri" w:eastAsia="Calibri" w:hAnsi="Calibri"/>
-          <w:color w:val="404040"/>
-          <w:sz w:val="20"/>
-          <w:szCs w:val="20"/>
-        </w:rPr>
-        <w:t xml:space="preserve">4.4 Le type utilisateur order_item</w:t>
-      </w:r>
-    </w:p>
-    <w:p>
-      <w:pPr>
-        <w:spacing w:after="30"/>
-        <w:ind w:left="340"/>
-      </w:pPr>
-      <w:r>
-        <w:rPr>
-          <w:rFonts w:ascii="Calibri" w:cs="Calibri" w:eastAsia="Calibri" w:hAnsi="Calibri"/>
-          <w:color w:val="404040"/>
-          <w:sz w:val="20"/>
-          <w:szCs w:val="20"/>
-        </w:rPr>
-        <w:t xml:space="preserve">4.5 Le chargement</w:t>
-      </w:r>
-    </w:p>
-    <w:p>
-      <w:pPr>
-        <w:spacing w:after="30"/>
-        <w:ind w:left="340"/>
-      </w:pPr>
-      <w:r>
-        <w:rPr>
-          <w:rFonts w:ascii="Calibri" w:cs="Calibri" w:eastAsia="Calibri" w:hAnsi="Calibri"/>
-          <w:color w:val="404040"/>
-          <w:sz w:val="20"/>
-          <w:szCs w:val="20"/>
-        </w:rPr>
-        <w:t xml:space="preserve">4.6 Ce que le modèle fait perdre</w:t>
-      </w:r>
-    </w:p>
-    <w:p>
-      <w:pPr>
-        <w:spacing w:after="40" w:before="160"/>
-      </w:pPr>
-      <w:r>
-        <w:rPr>
-          <w:rFonts w:ascii="Calibri" w:cs="Calibri" w:eastAsia="Calibri" w:hAnsi="Calibri"/>
-          <w:b/>
-          <w:bCs/>
-          <w:color w:val="1F3864"/>
-          <w:sz w:val="22"/>
-          <w:szCs w:val="22"/>
-        </w:rPr>
-        <w:t xml:space="preserve">5. Phase 3 — formatage Spark et Parquet</w:t>
-      </w:r>
-    </w:p>
-    <w:p>
-      <w:pPr>
-        <w:spacing w:after="30"/>
-        <w:ind w:left="340"/>
-      </w:pPr>
-      <w:r>
-        <w:rPr>
-          <w:rFonts w:ascii="Calibri" w:cs="Calibri" w:eastAsia="Calibri" w:hAnsi="Calibri"/>
-          <w:color w:val="404040"/>
-          <w:sz w:val="20"/>
-          <w:szCs w:val="20"/>
-        </w:rPr>
-        <w:t xml:space="preserve">5.1 Ce que cette phase apporte</w:t>
-      </w:r>
-    </w:p>
-    <w:p>
-      <w:pPr>
-        <w:spacing w:after="30"/>
-        <w:ind w:left="340"/>
-      </w:pPr>
-      <w:r>
-        <w:rPr>
-          <w:rFonts w:ascii="Calibri" w:cs="Calibri" w:eastAsia="Calibri" w:hAnsi="Calibri"/>
-          <w:color w:val="404040"/>
-          <w:sz w:val="20"/>
-          <w:szCs w:val="20"/>
-        </w:rPr>
-        <w:t xml:space="preserve">5.2 Spark en local, sans conteneur</w:t>
-      </w:r>
-    </w:p>
-    <w:p>
-      <w:pPr>
-        <w:spacing w:after="30"/>
-        <w:ind w:left="340"/>
-      </w:pPr>
-      <w:r>
-        <w:rPr>
-          <w:rFonts w:ascii="Calibri" w:cs="Calibri" w:eastAsia="Calibri" w:hAnsi="Calibri"/>
-          <w:color w:val="404040"/>
-          <w:sz w:val="20"/>
-          <w:szCs w:val="20"/>
-        </w:rPr>
-        <w:t xml:space="preserve">5.3 Les transformations et la règle métier</w:t>
-      </w:r>
-    </w:p>
-    <w:p>
-      <w:pPr>
-        <w:spacing w:after="30"/>
-        <w:ind w:left="340"/>
-      </w:pPr>
-      <w:r>
-        <w:rPr>
-          <w:rFonts w:ascii="Calibri" w:cs="Calibri" w:eastAsia="Calibri" w:hAnsi="Calibri"/>
-          <w:color w:val="404040"/>
-          <w:sz w:val="20"/>
-          <w:szCs w:val="20"/>
-        </w:rPr>
-        <w:t xml:space="preserve">5.4 La segmentation RFM</w:t>
-      </w:r>
-    </w:p>
-    <w:p>
-      <w:pPr>
-        <w:spacing w:after="30"/>
-        <w:ind w:left="340"/>
-      </w:pPr>
-      <w:r>
-        <w:rPr>
-          <w:rFonts w:ascii="Calibri" w:cs="Calibri" w:eastAsia="Calibri" w:hAnsi="Calibri"/>
-          <w:color w:val="404040"/>
-          <w:sz w:val="20"/>
-          <w:szCs w:val="20"/>
-        </w:rPr>
-        <w:t xml:space="preserve">5.5 Pourquoi Parquet</w:t>
-      </w:r>
-    </w:p>
-    <w:p>
-      <w:pPr>
-        <w:spacing w:after="40" w:before="160"/>
-      </w:pPr>
-      <w:r>
-        <w:rPr>
-          <w:rFonts w:ascii="Calibri" w:cs="Calibri" w:eastAsia="Calibri" w:hAnsi="Calibri"/>
-          <w:b/>
-          <w:bCs/>
-          <w:color w:val="1F3864"/>
-          <w:sz w:val="22"/>
-          <w:szCs w:val="22"/>
-        </w:rPr>
-        <w:t xml:space="preserve">6. Phase 4 — indexation Elasticsearch et tableau de bord Kibana</w:t>
-      </w:r>
-    </w:p>
-    <w:p>
-      <w:pPr>
-        <w:spacing w:after="30"/>
-        <w:ind w:left="340"/>
-      </w:pPr>
-      <w:r>
-        <w:rPr>
-          <w:rFonts w:ascii="Calibri" w:cs="Calibri" w:eastAsia="Calibri" w:hAnsi="Calibri"/>
-          <w:color w:val="404040"/>
-          <w:sz w:val="20"/>
-          <w:szCs w:val="20"/>
-        </w:rPr>
-        <w:t xml:space="preserve">6.1 Ce que cette phase apporte</w:t>
-      </w:r>
-    </w:p>
-    <w:p>
-      <w:pPr>
-        <w:spacing w:after="30"/>
-        <w:ind w:left="340"/>
-      </w:pPr>
-      <w:r>
-        <w:rPr>
-          <w:rFonts w:ascii="Calibri" w:cs="Calibri" w:eastAsia="Calibri" w:hAnsi="Calibri"/>
-          <w:color w:val="404040"/>
-          <w:sz w:val="20"/>
-          <w:szCs w:val="20"/>
-        </w:rPr>
-        <w:t xml:space="preserve">6.2 Deux index, et le choix du grain</w:t>
-      </w:r>
-    </w:p>
-    <w:p>
-      <w:pPr>
-        <w:spacing w:after="30"/>
-        <w:ind w:left="340"/>
-      </w:pPr>
-      <w:r>
-        <w:rPr>
-          <w:rFonts w:ascii="Calibri" w:cs="Calibri" w:eastAsia="Calibri" w:hAnsi="Calibri"/>
-          <w:color w:val="404040"/>
-          <w:sz w:val="20"/>
-          <w:szCs w:val="20"/>
-        </w:rPr>
-        <w:t xml:space="preserve">6.3 Les mappings</w:t>
-      </w:r>
-    </w:p>
-    <w:p>
-      <w:pPr>
-        <w:spacing w:after="30"/>
-        <w:ind w:left="340"/>
-      </w:pPr>
-      <w:r>
-        <w:rPr>
-          <w:rFonts w:ascii="Calibri" w:cs="Calibri" w:eastAsia="Calibri" w:hAnsi="Calibri"/>
-          <w:color w:val="404040"/>
-          <w:sz w:val="20"/>
-          <w:szCs w:val="20"/>
-        </w:rPr>
-        <w:t xml:space="preserve">6.4 Des identifiants dérivés des clés métier</w:t>
-      </w:r>
-    </w:p>
-    <w:p>
-      <w:pPr>
-        <w:spacing w:after="30"/>
-        <w:ind w:left="340"/>
-      </w:pPr>
-      <w:r>
-        <w:rPr>
-          <w:rFonts w:ascii="Calibri" w:cs="Calibri" w:eastAsia="Calibri" w:hAnsi="Calibri"/>
-          <w:color w:val="404040"/>
-          <w:sz w:val="20"/>
-          <w:szCs w:val="20"/>
-        </w:rPr>
-        <w:t xml:space="preserve">6.5 Les contrôles de la phase</w:t>
-      </w:r>
-    </w:p>
-    <w:p>
-      <w:pPr>
-        <w:spacing w:after="30"/>
-        <w:ind w:left="340"/>
-      </w:pPr>
-      <w:r>
-        <w:rPr>
-          <w:rFonts w:ascii="Calibri" w:cs="Calibri" w:eastAsia="Calibri" w:hAnsi="Calibri"/>
-          <w:color w:val="404040"/>
-          <w:sz w:val="20"/>
-          <w:szCs w:val="20"/>
-        </w:rPr>
-        <w:t xml:space="preserve">6.6 Le tableau de bord</w:t>
-      </w:r>
-    </w:p>
-    <w:p>
-      <w:pPr>
-        <w:spacing w:after="40" w:before="160"/>
-      </w:pPr>
-      <w:r>
-        <w:rPr>
-          <w:rFonts w:ascii="Calibri" w:cs="Calibri" w:eastAsia="Calibri" w:hAnsi="Calibri"/>
-          <w:b/>
-          <w:bCs/>
-          <w:color w:val="1F3864"/>
-          <w:sz w:val="22"/>
-          <w:szCs w:val="22"/>
-        </w:rPr>
-        <w:t xml:space="preserve">7. Résultats mesurés et contrôles de cohérence</w:t>
-      </w:r>
-    </w:p>
-    <w:p>
-      <w:pPr>
-        <w:spacing w:after="30"/>
-        <w:ind w:left="340"/>
-      </w:pPr>
-      <w:r>
-        <w:rPr>
-          <w:rFonts w:ascii="Calibri" w:cs="Calibri" w:eastAsia="Calibri" w:hAnsi="Calibri"/>
-          <w:color w:val="404040"/>
-          <w:sz w:val="20"/>
-          <w:szCs w:val="20"/>
-        </w:rPr>
-        <w:t xml:space="preserve">7.1 Les chiffres d'une exécution complète</w:t>
-      </w:r>
-    </w:p>
-    <w:p>
-      <w:pPr>
-        <w:spacing w:after="30"/>
-        <w:ind w:left="340"/>
-      </w:pPr>
-      <w:r>
-        <w:rPr>
-          <w:rFonts w:ascii="Calibri" w:cs="Calibri" w:eastAsia="Calibri" w:hAnsi="Calibri"/>
-          <w:color w:val="404040"/>
-          <w:sz w:val="20"/>
-          <w:szCs w:val="20"/>
-        </w:rPr>
-        <w:t xml:space="preserve">7.2 Les sept contrôles de cohérence</w:t>
-      </w:r>
-    </w:p>
-    <w:p>
-      <w:pPr>
-        <w:spacing w:after="30"/>
-        <w:ind w:left="340"/>
-      </w:pPr>
-      <w:r>
-        <w:rPr>
-          <w:rFonts w:ascii="Calibri" w:cs="Calibri" w:eastAsia="Calibri" w:hAnsi="Calibri"/>
-          <w:color w:val="404040"/>
-          <w:sz w:val="20"/>
-          <w:szCs w:val="20"/>
-        </w:rPr>
-        <w:t xml:space="preserve">7.3 Le traceur, contrôle complémentaire</w:t>
-      </w:r>
-    </w:p>
-    <w:p>
-      <w:pPr>
-        <w:spacing w:after="30"/>
-        <w:ind w:left="340"/>
-      </w:pPr>
-      <w:r>
-        <w:rPr>
-          <w:rFonts w:ascii="Calibri" w:cs="Calibri" w:eastAsia="Calibri" w:hAnsi="Calibri"/>
-          <w:color w:val="404040"/>
-          <w:sz w:val="20"/>
-          <w:szCs w:val="20"/>
-        </w:rPr>
-        <w:t xml:space="preserve">7.4 Ce que ces contrôles ne prouvent pas</w:t>
-      </w:r>
-    </w:p>
-    <w:p>
-      <w:pPr>
-        <w:spacing w:after="40" w:before="160"/>
-      </w:pPr>
-      <w:r>
-        <w:rPr>
-          <w:rFonts w:ascii="Calibri" w:cs="Calibri" w:eastAsia="Calibri" w:hAnsi="Calibri"/>
-          <w:b/>
-          <w:bCs/>
-          <w:color w:val="1F3864"/>
-          <w:sz w:val="22"/>
-          <w:szCs w:val="22"/>
-        </w:rPr>
-        <w:t xml:space="preserve">8. Difficultés rencontrées</w:t>
-      </w:r>
-    </w:p>
-    <w:p>
-      <w:pPr>
-        <w:spacing w:after="40" w:before="160"/>
-      </w:pPr>
-      <w:r>
-        <w:rPr>
-          <w:rFonts w:ascii="Calibri" w:cs="Calibri" w:eastAsia="Calibri" w:hAnsi="Calibri"/>
-          <w:b/>
-          <w:bCs/>
-          <w:color w:val="1F3864"/>
-          <w:sz w:val="22"/>
-          <w:szCs w:val="22"/>
-        </w:rPr>
-        <w:t xml:space="preserve">9. Limites du travail et prolongements</w:t>
-      </w:r>
-    </w:p>
-    <w:p>
-      <w:pPr>
-        <w:spacing w:after="40" w:before="160"/>
-      </w:pPr>
-      <w:r>
-        <w:rPr>
-          <w:rFonts w:ascii="Calibri" w:cs="Calibri" w:eastAsia="Calibri" w:hAnsi="Calibri"/>
-          <w:b/>
-          <w:bCs/>
-          <w:color w:val="1F3864"/>
-          <w:sz w:val="22"/>
-          <w:szCs w:val="22"/>
-        </w:rPr>
-        <w:t xml:space="preserve">10. Conclusion</w:t>
-      </w:r>
-    </w:p>
-    <w:p>
-      <w:pPr>
-        <w:spacing w:after="40" w:before="160"/>
-      </w:pPr>
-      <w:r>
-        <w:rPr>
-          <w:rFonts w:ascii="Calibri" w:cs="Calibri" w:eastAsia="Calibri" w:hAnsi="Calibri"/>
-          <w:b/>
-          <w:bCs/>
-          <w:color w:val="1F3864"/>
-          <w:sz w:val="22"/>
-          <w:szCs w:val="22"/>
-        </w:rPr>
-        <w:t xml:space="preserve">11. Annexe — enchaînement des commandes</w:t>
-      </w:r>
-    </w:p>
+    <w:sdt>
+      <w:sdtPr>
+        <w:alias w:val="Sommaire"/>
+      </w:sdtPr>
+      <w:sdtContent>
+        <w:p>
+          <w:r>
+            <w:fldChar w:fldCharType="begin" w:dirty="true"/>
+            <w:instrText xml:space="preserve">TOC \o "1-2"</w:instrText>
+            <w:fldChar w:fldCharType="separate"/>
+          </w:r>
+        </w:p>
+        <w:p>
+          <w:r>
+            <w:fldChar w:fldCharType="end"/>
+          </w:r>
+        </w:p>
+      </w:sdtContent>
+    </w:sdt>
     <w:p>
       <w:r>
         <w:br w:type="page"/>
@@ -966,7 +284,31 @@
           <w:sz w:val="20"/>
           <w:szCs w:val="20"/>
         </w:rPr>
-        <w:t xml:space="preserve">L'énoncé impose une chaîne complète en quatre étapes : construire une source de données </w:t>
+        <w:t xml:space="preserve">L'énoncé impose une chaîne en quatre étapes :</w:t>
+      </w:r>
+    </w:p>
+    <w:p>
+      <w:pPr>
+        <w:pStyle w:val="ListParagraph"/>
+        <w:numPr>
+          <w:ilvl w:val="0"/>
+          <w:numId w:val="2"/>
+        </w:numPr>
+        <w:spacing w:after="50" w:line="264"/>
+        <w:jc w:val="both"/>
+      </w:pPr>
+      <w:r>
+        <w:rPr>
+          <w:rFonts w:ascii="Cambria" w:cs="Cambria" w:eastAsia="Cambria" w:hAnsi="Cambria"/>
+          <w:b w:val="false"/>
+          <w:bCs w:val="false"/>
+          <w:i w:val="false"/>
+          <w:iCs w:val="false"/>
+          <w:color w:val="000000"/>
+          <w:sz w:val="20"/>
+          <w:szCs w:val="20"/>
+        </w:rPr>
+        <w:t xml:space="preserve">construire une source de données </w:t>
       </w:r>
       <w:r>
         <w:rPr>
@@ -992,8 +334,19 @@
           <w:sz w:val="20"/>
           <w:szCs w:val="20"/>
         </w:rPr>
-        <w:t xml:space="preserve"> avec une structure normalisée ; </w:t>
-      </w:r>
+        <w:t xml:space="preserve">, avec une structure normalisée ;</w:t>
+      </w:r>
+    </w:p>
+    <w:p>
+      <w:pPr>
+        <w:pStyle w:val="ListParagraph"/>
+        <w:numPr>
+          <w:ilvl w:val="0"/>
+          <w:numId w:val="2"/>
+        </w:numPr>
+        <w:spacing w:after="50" w:line="264"/>
+        <w:jc w:val="both"/>
+      </w:pPr>
       <w:r>
         <w:rPr>
           <w:rFonts w:ascii="Cambria" w:cs="Cambria" w:eastAsia="Cambria" w:hAnsi="Cambria"/>
@@ -1044,8 +397,19 @@
           <w:sz w:val="20"/>
           <w:szCs w:val="20"/>
         </w:rPr>
-        <w:t xml:space="preserve"> en passant par un fichier JSON ; </w:t>
-      </w:r>
+        <w:t xml:space="preserve">, en passant par un fichier JSON ;</w:t>
+      </w:r>
+    </w:p>
+    <w:p>
+      <w:pPr>
+        <w:pStyle w:val="ListParagraph"/>
+        <w:numPr>
+          <w:ilvl w:val="0"/>
+          <w:numId w:val="2"/>
+        </w:numPr>
+        <w:spacing w:after="50" w:line="264"/>
+        <w:jc w:val="both"/>
+      </w:pPr>
       <w:r>
         <w:rPr>
           <w:rFonts w:ascii="Cambria" w:cs="Cambria" w:eastAsia="Cambria" w:hAnsi="Cambria"/>
@@ -1070,8 +434,19 @@
           <w:sz w:val="20"/>
           <w:szCs w:val="20"/>
         </w:rPr>
-        <w:t xml:space="preserve"> le résultat pour Spark ou Parquet en y appliquant des fonctions d'analyse en Python ; enfin </w:t>
-      </w:r>
+        <w:t xml:space="preserve"> le résultat pour Spark ou Parquet, avec des fonctions d'analyse en Python ;</w:t>
+      </w:r>
+    </w:p>
+    <w:p>
+      <w:pPr>
+        <w:pStyle w:val="ListParagraph"/>
+        <w:numPr>
+          <w:ilvl w:val="0"/>
+          <w:numId w:val="2"/>
+        </w:numPr>
+        <w:spacing w:after="120" w:line="264"/>
+        <w:jc w:val="both"/>
+      </w:pPr>
       <w:r>
         <w:rPr>
           <w:rFonts w:ascii="Cambria" w:cs="Cambria" w:eastAsia="Cambria" w:hAnsi="Cambria"/>
@@ -1122,7 +497,26 @@
           <w:sz w:val="20"/>
           <w:szCs w:val="20"/>
         </w:rPr>
-        <w:t xml:space="preserve">. Le thème métier est libre.</w:t>
+        <w:t xml:space="preserve">.</w:t>
+      </w:r>
+    </w:p>
+    <w:p>
+      <w:pPr>
+        <w:spacing w:after="100" w:line="264"/>
+        <w:jc w:val="both"/>
+      </w:pPr>
+      <w:r>
+        <w:rPr>
+          <w:rFonts w:ascii="Cambria" w:cs="Cambria" w:eastAsia="Cambria" w:hAnsi="Cambria"/>
+          <w:b w:val="false"/>
+          <w:bCs w:val="false"/>
+          <w:i w:val="false"/>
+          <w:iCs w:val="false"/>
+          <w:color w:val="000000"/>
+          <w:sz w:val="20"/>
+          <w:szCs w:val="20"/>
+        </w:rPr>
+        <w:t xml:space="preserve">Le thème métier est libre.</w:t>
       </w:r>
     </w:p>
     <w:p>
@@ -1197,7 +591,7 @@
           <w:sz w:val="20"/>
           <w:szCs w:val="20"/>
         </w:rPr>
-        <w:t xml:space="preserve">Ce thème contient les trois formes de relation qui rendent l'exercice intéressant : une relation 1-N entre un client et ses commandes ; une relation 1-N à cardinalité variable entre une commande et ses lignes, exactement ce qu'une base orientée documents sait absorber et qu'une base relationnelle doit éclater ; et une hiérarchie réflexive dans les catégories, sans équivalent direct en CQL.</w:t>
+        <w:t xml:space="preserve">Ce thème contient les trois formes de relation qui rendent l'exercice intéressant. Un client a plusieurs commandes, c'est la relation 1-N classique. Une commande a un nombre variable de lignes, et c'est exactement ce qu'une base orientée documents sait absorber alors qu'une base relationnelle doit l'éclater dans une table à part. Enfin les catégories forment une hiérarchie réflexive, qui n'a pas d'équivalent direct en CQL.</w:t>
       </w:r>
     </w:p>
     <w:p>
@@ -5526,7 +4920,31 @@
           <w:sz w:val="20"/>
           <w:szCs w:val="20"/>
         </w:rPr>
-        <w:t xml:space="preserve">Le générateur injecte volontairement trois propriétés, chacune pour une raison en aval : une </w:t>
+        <w:t xml:space="preserve">Le générateur injecte volontairement trois propriétés, chacune pour une raison en aval :</w:t>
+      </w:r>
+    </w:p>
+    <w:p>
+      <w:pPr>
+        <w:pStyle w:val="ListParagraph"/>
+        <w:numPr>
+          <w:ilvl w:val="0"/>
+          <w:numId w:val="3"/>
+        </w:numPr>
+        <w:spacing w:after="50" w:line="264"/>
+        <w:jc w:val="both"/>
+      </w:pPr>
+      <w:r>
+        <w:rPr>
+          <w:rFonts w:ascii="Cambria" w:cs="Cambria" w:eastAsia="Cambria" w:hAnsi="Cambria"/>
+          <w:b w:val="false"/>
+          <w:bCs w:val="false"/>
+          <w:i w:val="false"/>
+          <w:iCs w:val="false"/>
+          <w:color w:val="000000"/>
+          <w:sz w:val="20"/>
+          <w:szCs w:val="20"/>
+        </w:rPr>
+        <w:t xml:space="preserve">une </w:t>
       </w:r>
       <w:r>
         <w:rPr>
@@ -5552,7 +4970,31 @@
           <w:sz w:val="20"/>
           <w:szCs w:val="20"/>
         </w:rPr>
-        <w:t xml:space="preserve">, avec un pic en novembre-décembre, sans laquelle la courbe du tableau de bord serait plate ; une </w:t>
+        <w:t xml:space="preserve">, avec un pic en novembre-décembre. Sans elle, la courbe du tableau de bord serait plate ;</w:t>
+      </w:r>
+    </w:p>
+    <w:p>
+      <w:pPr>
+        <w:pStyle w:val="ListParagraph"/>
+        <w:numPr>
+          <w:ilvl w:val="0"/>
+          <w:numId w:val="3"/>
+        </w:numPr>
+        <w:spacing w:after="50" w:line="264"/>
+        <w:jc w:val="both"/>
+      </w:pPr>
+      <w:r>
+        <w:rPr>
+          <w:rFonts w:ascii="Cambria" w:cs="Cambria" w:eastAsia="Cambria" w:hAnsi="Cambria"/>
+          <w:b w:val="false"/>
+          <w:bCs w:val="false"/>
+          <w:i w:val="false"/>
+          <w:iCs w:val="false"/>
+          <w:color w:val="000000"/>
+          <w:sz w:val="20"/>
+          <w:szCs w:val="20"/>
+        </w:rPr>
+        <w:t xml:space="preserve">une </w:t>
       </w:r>
       <w:r>
         <w:rPr>
@@ -5578,7 +5020,31 @@
           <w:sz w:val="20"/>
           <w:szCs w:val="20"/>
         </w:rPr>
-        <w:t xml:space="preserve">, où environ 20 % des produits concentrent 70 % des lignes, ce qui donne son sens à la segmentation RFM ; et un </w:t>
+        <w:t xml:space="preserve"> : environ 20 % des produits concentrent 70 % des lignes. C'est ce déséquilibre qui donne son sens à la segmentation RFM ;</w:t>
+      </w:r>
+    </w:p>
+    <w:p>
+      <w:pPr>
+        <w:pStyle w:val="ListParagraph"/>
+        <w:numPr>
+          <w:ilvl w:val="0"/>
+          <w:numId w:val="3"/>
+        </w:numPr>
+        <w:spacing w:after="120" w:line="264"/>
+        <w:jc w:val="both"/>
+      </w:pPr>
+      <w:r>
+        <w:rPr>
+          <w:rFonts w:ascii="Cambria" w:cs="Cambria" w:eastAsia="Cambria" w:hAnsi="Cambria"/>
+          <w:b w:val="false"/>
+          <w:bCs w:val="false"/>
+          <w:i w:val="false"/>
+          <w:iCs w:val="false"/>
+          <w:color w:val="000000"/>
+          <w:sz w:val="20"/>
+          <w:szCs w:val="20"/>
+        </w:rPr>
+        <w:t xml:space="preserve">un </w:t>
       </w:r>
       <w:r>
         <w:rPr>
@@ -5604,7 +5070,7 @@
           <w:sz w:val="20"/>
           <w:szCs w:val="20"/>
         </w:rPr>
-        <w:t xml:space="preserve"> avec un pic en soirée.</w:t>
+        <w:t xml:space="preserve"> avec un pic en soirée, qui rend l'histogramme par heure exploitable.</w:t>
       </w:r>
     </w:p>
     <w:p>
@@ -5843,7 +5309,7 @@
         <w:pStyle w:val="ListParagraph"/>
         <w:numPr>
           <w:ilvl w:val="0"/>
-          <w:numId w:val="2"/>
+          <w:numId w:val="3"/>
         </w:numPr>
         <w:spacing w:after="50" w:line="264"/>
         <w:jc w:val="both"/>
@@ -5880,7 +5346,7 @@
         <w:pStyle w:val="ListParagraph"/>
         <w:numPr>
           <w:ilvl w:val="0"/>
-          <w:numId w:val="2"/>
+          <w:numId w:val="3"/>
         </w:numPr>
         <w:spacing w:after="120" w:line="264"/>
         <w:jc w:val="both"/>
@@ -6548,7 +6014,7 @@
           <w:sz w:val="20"/>
           <w:szCs w:val="20"/>
         </w:rPr>
-        <w:t xml:space="preserve">, un document complet par ligne, et non un unique tableau JSON. La différence est pratique : le fichier se lit en flux sans être chargé en mémoire, il se découpe trivialement puisque l'unité est la ligne, et une interruption ne corrompt que la dernière ligne au lieu d'invalider tout le document. C'est aussi le format que Spark lit nativement en parallèle.</w:t>
+        <w:t xml:space="preserve">, un document complet par ligne, et non un unique tableau JSON. La différence est pratique. Le fichier se lit en flux, sans être chargé en mémoire. Il se découpe facilement, puisque l'unité est la ligne. Et une interruption n'abîme que la dernière ligne au lieu d'invalider tout le fichier. C'est aussi le format que Spark lit nativement en parallèle.</w:t>
       </w:r>
     </w:p>
     <w:p>
@@ -7896,7 +7362,7 @@
           <w:sz w:val="20"/>
           <w:szCs w:val="20"/>
         </w:rPr>
-        <w:t xml:space="preserve">Deux conséquences pratiques gouvernent toute la modélisation : une lecture </w:t>
+        <w:t xml:space="preserve">Deux conséquences gouvernent toute la modélisation. D'abord, une lecture </w:t>
       </w:r>
       <w:r>
         <w:rPr>
@@ -7922,7 +7388,7 @@
           <w:sz w:val="20"/>
           <w:szCs w:val="20"/>
         </w:rPr>
-        <w:t xml:space="preserve"> fournir la clé de partition complète, faute de quoi Cassandra doit interroger tous les nœuds ; et un tri obtenu par la clé de clustering ne coûte rien à l'exécution, puisqu'il est déjà inscrit dans l'ordre physique des lignes.</w:t>
+        <w:t xml:space="preserve"> fournir la clé de partition complète, sinon Cassandra doit interroger tous les nœuds. Ensuite, un tri obtenu par la clé de clustering ne coûte rien à l'exécution : il est déjà inscrit dans l'ordre physique des lignes.</w:t>
       </w:r>
     </w:p>
     <w:p>
@@ -8281,7 +7747,7 @@
           <w:sz w:val="20"/>
           <w:szCs w:val="20"/>
         </w:rPr>
-        <w:t xml:space="preserve"> donnerait 32 partitions qui grossiraient indéfiniment au fil des mois, jusqu'à ce qu'une catégorie populaire dépasse la limite pratique : c'est l'</w:t>
+        <w:t xml:space="preserve"> donnerait 32 partitions qui grossiraient indéfiniment au fil des mois. Au bout d'un moment, une catégorie populaire dépasse la taille raisonnable. C'est l'</w:t>
       </w:r>
       <w:r>
         <w:rPr>
@@ -8307,7 +7773,7 @@
           <w:sz w:val="20"/>
           <w:szCs w:val="20"/>
         </w:rPr>
-        <w:t xml:space="preserve">, le plus fréquent en modélisation Cassandra, et il ne se voit pas sur un jeu de démonstration — il se voit deux ans après la mise en production.</w:t>
+        <w:t xml:space="preserve">. Le piège est qu'il ne se voit pas sur un jeu de démonstration : il se voit deux ans après la mise en production.</w:t>
       </w:r>
     </w:p>
     <w:p>
@@ -8326,33 +7792,7 @@
           <w:sz w:val="20"/>
           <w:szCs w:val="20"/>
         </w:rPr>
-        <w:t xml:space="preserve">Ajouter le mois dans la clé de partition est un </w:t>
-      </w:r>
-      <w:r>
-        <w:rPr>
-          <w:rFonts w:ascii="Cambria" w:cs="Cambria" w:eastAsia="Cambria" w:hAnsi="Cambria"/>
-          <w:b/>
-          <w:bCs/>
-          <w:i w:val="false"/>
-          <w:iCs w:val="false"/>
-          <w:color w:val="000000"/>
-          <w:sz w:val="20"/>
-          <w:szCs w:val="20"/>
-        </w:rPr>
-        <w:t xml:space="preserve">bucketing temporel</w:t>
-      </w:r>
-      <w:r>
-        <w:rPr>
-          <w:rFonts w:ascii="Cambria" w:cs="Cambria" w:eastAsia="Cambria" w:hAnsi="Cambria"/>
-          <w:b w:val="false"/>
-          <w:bCs w:val="false"/>
-          <w:i w:val="false"/>
-          <w:iCs w:val="false"/>
-          <w:color w:val="000000"/>
-          <w:sz w:val="20"/>
-          <w:szCs w:val="20"/>
-        </w:rPr>
-        <w:t xml:space="preserve"> : la partition est bornée par construction puisqu'elle ne contient qu'un mois, et le nombre de partitions croît avec le temps, ce qui est le comportement souhaitable d'un système distribué, la charge se répartissant sur de nouveaux nœuds au lieu de s'accumuler sur les mêmes. Effet secondaire recherché, la requête métier porte justement sur un couple (catégorie, mois) : elle lit une partition et une seule.</w:t>
+        <w:t xml:space="preserve">Ajouter le mois dans la clé règle le problème. Chaque partition ne contient qu'un mois, donc sa taille est bornée par construction. C'est le nombre de partitions qui augmente avec le temps, et non leur taille. Autre avantage, la requête métier porte justement sur un couple (catégorie, mois) : elle lit une partition et une seule.</w:t>
       </w:r>
     </w:p>
     <w:p>
@@ -8894,7 +8334,7 @@
           <w:sz w:val="20"/>
           <w:szCs w:val="20"/>
         </w:rPr>
-        <w:t xml:space="preserve"> C'est un réflexe venu du SQL, et une mauvaise idée ici : un batch Cassandra sert à garantir l'atomicité à l'intérieur d'une partition, ce n'est pas un outil de performance, et il devient plus lent que les écritures individuelles dès qu'il touche plusieurs partitions. J'utilise </w:t>
+        <w:t xml:space="preserve"> C'est un réflexe venu du SQL, et une mauvaise idée ici. Un batch Cassandra sert à garantir l'atomicité dans une partition, ce n'est pas un outil de performance. Dès qu'il touche plusieurs partitions, il devient même plus lent que des écritures séparées. J'utilise </w:t>
       </w:r>
       <w:r>
         <w:rPr>
@@ -10223,7 +9663,7 @@
           <w:sz w:val="20"/>
           <w:szCs w:val="20"/>
         </w:rPr>
-        <w:t xml:space="preserve">Un mot sur la définition des indicateurs mensuels, parce que l'ambiguïté est facile. Dans </w:t>
+        <w:t xml:space="preserve">Un mot sur les indicateurs mensuels, parce que l'ambiguïté est facile. Dans </w:t>
       </w:r>
       <w:r>
         <w:rPr>
@@ -10249,7 +9689,7 @@
           <w:sz w:val="20"/>
           <w:szCs w:val="20"/>
         </w:rPr>
-        <w:t xml:space="preserve">, le chiffre d'affaires porte sur les articles après remise, hors frais de port, pour les trois statuts retenus, tandis que les commandes, articles et clients sont comptés </w:t>
+        <w:t xml:space="preserve">, le chiffre d'affaires ne compte que les trois statuts retenus, sur les articles après remise et hors frais de port. En revanche les commandes, articles et clients sont comptés </w:t>
       </w:r>
       <w:r>
         <w:rPr>
@@ -10275,7 +9715,26 @@
           <w:sz w:val="20"/>
           <w:szCs w:val="20"/>
         </w:rPr>
-        <w:t xml:space="preserve"> : ils décrivent l'activité, pas la recette. Les noms de colonnes ont été choisis en conséquence — </w:t>
+        <w:t xml:space="preserve">. Ces derniers décrivent l'activité, pas la recette.</w:t>
+      </w:r>
+    </w:p>
+    <w:p>
+      <w:pPr>
+        <w:spacing w:after="100" w:line="264"/>
+        <w:jc w:val="both"/>
+      </w:pPr>
+      <w:r>
+        <w:rPr>
+          <w:rFonts w:ascii="Cambria" w:cs="Cambria" w:eastAsia="Cambria" w:hAnsi="Cambria"/>
+          <w:b w:val="false"/>
+          <w:bCs w:val="false"/>
+          <w:i w:val="false"/>
+          <w:iCs w:val="false"/>
+          <w:color w:val="000000"/>
+          <w:sz w:val="20"/>
+          <w:szCs w:val="20"/>
+        </w:rPr>
+        <w:t xml:space="preserve">J'ai nommé les colonnes en conséquence. </w:t>
       </w:r>
       <w:r>
         <w:rPr>
@@ -10327,7 +9786,7 @@
           <w:sz w:val="20"/>
           <w:szCs w:val="20"/>
         </w:rPr>
-        <w:t xml:space="preserve">, puisque le compte inclut aussi les commandes en attente, et </w:t>
+        <w:t xml:space="preserve">, parce que le compte inclut aussi les commandes en attente. Et </w:t>
       </w:r>
       <w:r>
         <w:rPr>
@@ -10379,7 +9838,7 @@
           <w:sz w:val="20"/>
           <w:szCs w:val="20"/>
         </w:rPr>
-        <w:t xml:space="preserve">, puisque le dénominateur compte toutes les commandes du mois.</w:t>
+        <w:t xml:space="preserve">, parce que le dénominateur compte toutes les commandes du mois.</w:t>
       </w:r>
     </w:p>
     <w:p>
@@ -10487,7 +9946,26 @@
           <w:sz w:val="20"/>
           <w:szCs w:val="20"/>
         </w:rPr>
-        <w:t xml:space="preserve">) et non par seuils fixes, ce qui rend la segmentation indépendante de l'échelle des données. Deux détails de mise en œuvre : la </w:t>
+        <w:t xml:space="preserve">) et non par seuils fixes, ce qui rend la segmentation indépendante de l'échelle des données.</w:t>
+      </w:r>
+    </w:p>
+    <w:p>
+      <w:pPr>
+        <w:spacing w:after="100" w:line="264"/>
+        <w:jc w:val="both"/>
+      </w:pPr>
+      <w:r>
+        <w:rPr>
+          <w:rFonts w:ascii="Cambria" w:cs="Cambria" w:eastAsia="Cambria" w:hAnsi="Cambria"/>
+          <w:b w:val="false"/>
+          <w:bCs w:val="false"/>
+          <w:i w:val="false"/>
+          <w:iCs w:val="false"/>
+          <w:color w:val="000000"/>
+          <w:sz w:val="20"/>
+          <w:szCs w:val="20"/>
+        </w:rPr>
+        <w:t xml:space="preserve">Deux détails de mise en œuvre. La </w:t>
       </w:r>
       <w:r>
         <w:rPr>
@@ -10513,7 +9991,7 @@
           <w:sz w:val="20"/>
           <w:szCs w:val="20"/>
         </w:rPr>
-        <w:t xml:space="preserve">, car peu de jours depuis le dernier achat est un bon signe, d'où le </w:t>
+        <w:t xml:space="preserve"> : peu de jours depuis le dernier achat est un bon signe, d'où le </w:t>
       </w:r>
       <w:r>
         <w:rPr>
@@ -10539,7 +10017,7 @@
           <w:sz w:val="20"/>
           <w:szCs w:val="20"/>
         </w:rPr>
-        <w:t xml:space="preserve"> ; et la </w:t>
+        <w:t xml:space="preserve">. Et la </w:t>
       </w:r>
       <w:r>
         <w:rPr>
@@ -10565,7 +10043,7 @@
           <w:sz w:val="20"/>
           <w:szCs w:val="20"/>
         </w:rPr>
-        <w:t xml:space="preserve">, pas la date du jour, sinon tous les clients glisseraient peu à peu vers « endormis » sans que rien n'ait changé.</w:t>
+        <w:t xml:space="preserve">, pas la date du jour. Sinon tous les clients glisseraient peu à peu vers « endormis » sans que rien n'ait changé.</w:t>
       </w:r>
     </w:p>
     <w:p>
@@ -14059,7 +13537,55 @@
           <w:sz w:val="20"/>
           <w:szCs w:val="20"/>
         </w:rPr>
-        <w:t xml:space="preserve">Trois précautions de lecture : le CA net porte sur les articles après remise, hors frais de port ; le compteur de commandes utilise </w:t>
+        <w:t xml:space="preserve">Trois précautions de lecture :</w:t>
+      </w:r>
+    </w:p>
+    <w:p>
+      <w:pPr>
+        <w:pStyle w:val="ListParagraph"/>
+        <w:numPr>
+          <w:ilvl w:val="0"/>
+          <w:numId w:val="3"/>
+        </w:numPr>
+        <w:spacing w:after="50" w:line="264"/>
+        <w:jc w:val="both"/>
+      </w:pPr>
+      <w:r>
+        <w:rPr>
+          <w:rFonts w:ascii="Cambria" w:cs="Cambria" w:eastAsia="Cambria" w:hAnsi="Cambria"/>
+          <w:b w:val="false"/>
+          <w:bCs w:val="false"/>
+          <w:i w:val="false"/>
+          <w:iCs w:val="false"/>
+          <w:color w:val="000000"/>
+          <w:sz w:val="20"/>
+          <w:szCs w:val="20"/>
+        </w:rPr>
+        <w:t xml:space="preserve">le CA net porte sur les articles après remise, hors frais de port ;</w:t>
+      </w:r>
+    </w:p>
+    <w:p>
+      <w:pPr>
+        <w:pStyle w:val="ListParagraph"/>
+        <w:numPr>
+          <w:ilvl w:val="0"/>
+          <w:numId w:val="3"/>
+        </w:numPr>
+        <w:spacing w:after="50" w:line="264"/>
+        <w:jc w:val="both"/>
+      </w:pPr>
+      <w:r>
+        <w:rPr>
+          <w:rFonts w:ascii="Cambria" w:cs="Cambria" w:eastAsia="Cambria" w:hAnsi="Cambria"/>
+          <w:b w:val="false"/>
+          <w:bCs w:val="false"/>
+          <w:i w:val="false"/>
+          <w:iCs w:val="false"/>
+          <w:color w:val="000000"/>
+          <w:sz w:val="20"/>
+          <w:szCs w:val="20"/>
+        </w:rPr>
+        <w:t xml:space="preserve">le compteur de commandes utilise </w:t>
       </w:r>
       <w:r>
         <w:rPr>
@@ -14085,7 +13611,7 @@
           <w:sz w:val="20"/>
           <w:szCs w:val="20"/>
         </w:rPr>
-        <w:t xml:space="preserve">, qui est une </w:t>
+        <w:t xml:space="preserve">, qui donne une </w:t>
       </w:r>
       <w:r>
         <w:rPr>
@@ -14111,7 +13637,31 @@
           <w:sz w:val="20"/>
           <w:szCs w:val="20"/>
         </w:rPr>
-        <w:t xml:space="preserve"> et non un comptage exact ; et le graphique des statuts compte des </w:t>
+        <w:t xml:space="preserve"> et non un comptage exact ;</w:t>
+      </w:r>
+    </w:p>
+    <w:p>
+      <w:pPr>
+        <w:pStyle w:val="ListParagraph"/>
+        <w:numPr>
+          <w:ilvl w:val="0"/>
+          <w:numId w:val="3"/>
+        </w:numPr>
+        <w:spacing w:after="120" w:line="264"/>
+        <w:jc w:val="both"/>
+      </w:pPr>
+      <w:r>
+        <w:rPr>
+          <w:rFonts w:ascii="Cambria" w:cs="Cambria" w:eastAsia="Cambria" w:hAnsi="Cambria"/>
+          <w:b w:val="false"/>
+          <w:bCs w:val="false"/>
+          <w:i w:val="false"/>
+          <w:iCs w:val="false"/>
+          <w:color w:val="000000"/>
+          <w:sz w:val="20"/>
+          <w:szCs w:val="20"/>
+        </w:rPr>
+        <w:t xml:space="preserve">le graphique des statuts compte des </w:t>
       </w:r>
       <w:r>
         <w:rPr>
@@ -14137,7 +13687,7 @@
           <w:sz w:val="20"/>
           <w:szCs w:val="20"/>
         </w:rPr>
-        <w:t xml:space="preserve">, pas des commandes.</w:t>
+        <w:t xml:space="preserve">, pas des commandes distinctes.</w:t>
       </w:r>
     </w:p>
     <w:p>
@@ -15035,7 +14585,7 @@
         <w:pStyle w:val="ListParagraph"/>
         <w:numPr>
           <w:ilvl w:val="0"/>
-          <w:numId w:val="3"/>
+          <w:numId w:val="2"/>
         </w:numPr>
         <w:spacing w:after="50" w:line="264"/>
         <w:jc w:val="both"/>
@@ -15059,7 +14609,7 @@
         <w:pStyle w:val="ListParagraph"/>
         <w:numPr>
           <w:ilvl w:val="0"/>
-          <w:numId w:val="3"/>
+          <w:numId w:val="2"/>
         </w:numPr>
         <w:spacing w:after="50" w:line="264"/>
         <w:jc w:val="both"/>
@@ -15109,7 +14659,7 @@
         <w:pStyle w:val="ListParagraph"/>
         <w:numPr>
           <w:ilvl w:val="0"/>
-          <w:numId w:val="3"/>
+          <w:numId w:val="2"/>
         </w:numPr>
         <w:spacing w:after="50" w:line="264"/>
         <w:jc w:val="both"/>
@@ -15133,7 +14683,7 @@
         <w:pStyle w:val="ListParagraph"/>
         <w:numPr>
           <w:ilvl w:val="0"/>
-          <w:numId w:val="3"/>
+          <w:numId w:val="2"/>
         </w:numPr>
         <w:spacing w:after="50" w:line="264"/>
         <w:jc w:val="both"/>
@@ -15157,7 +14707,7 @@
         <w:pStyle w:val="ListParagraph"/>
         <w:numPr>
           <w:ilvl w:val="0"/>
-          <w:numId w:val="3"/>
+          <w:numId w:val="2"/>
         </w:numPr>
         <w:spacing w:after="50" w:line="264"/>
         <w:jc w:val="both"/>
@@ -15181,7 +14731,7 @@
         <w:pStyle w:val="ListParagraph"/>
         <w:numPr>
           <w:ilvl w:val="0"/>
-          <w:numId w:val="3"/>
+          <w:numId w:val="2"/>
         </w:numPr>
         <w:spacing w:after="50" w:line="264"/>
         <w:jc w:val="both"/>
@@ -15205,7 +14755,7 @@
         <w:pStyle w:val="ListParagraph"/>
         <w:numPr>
           <w:ilvl w:val="0"/>
-          <w:numId w:val="3"/>
+          <w:numId w:val="2"/>
         </w:numPr>
         <w:spacing w:after="120" w:line="264"/>
         <w:jc w:val="both"/>
@@ -15546,7 +15096,7 @@
           <w:sz w:val="20"/>
           <w:szCs w:val="20"/>
         </w:rPr>
-        <w:t xml:space="preserve">Enfin, ces contrôles vérifient des égalités de volumétrie et de montant. Ils ne vérifient pas champ par champ que chaque document est correct, et ils ne valident pas la pertinence des règles métier retenues : ils garantissent que la même règle est appliquée de bout en bout, pas qu'elle soit la bonne.</w:t>
+        <w:t xml:space="preserve">Enfin, ces contrôles vérifient des égalités de volumétrie et de montant. Ils ne regardent pas chaque document champ par champ. Et ils ne disent rien de la pertinence des règles métier : ils garantissent que la même règle est appliquée d'un bout à l'autre, pas qu'elle soit la bonne.</w:t>
       </w:r>
     </w:p>
     <w:p>
@@ -16194,7 +15744,26 @@
           <w:sz w:val="20"/>
           <w:szCs w:val="20"/>
         </w:rPr>
-        <w:t xml:space="preserve">Le pipeline demandé est complet et fonctionne de bout en bout : une base Oracle normalisée en troisième forme normale, une extraction dénormalisée en JSON Lines produite par Oracle lui-même, un modèle Cassandra construit à partir des requêtes plutôt que des entités, un formatage Spark vers Parquet partitionné avec des analyses en Python, et une indexation Elasticsearch exposée dans un tableau de bord Kibana de huit panneaux, le tout dans 16 Go grâce à une exécution strictement séquentielle. Sur l'exécution de référence, les 149 300 lignes de commande se retrouvent identiques aux quatre étapes, l'écart entre commandes générées et documents extraits est intégralement expliqué, et le chiffre d'affaires calculé par Spark est retrouvé au centime par Elasticsearch.</w:t>
+        <w:t xml:space="preserve">Le pipeline demandé est complet et fonctionne de bout en bout. La base Oracle est en troisième forme normale. L'extraction dénormalisée est produite par Oracle lui-même, en JSON Lines. Le modèle Cassandra est construit à partir des requêtes et non des entités. Spark écrit du Parquet partitionné et calcule les analyses en Python. Elasticsearch indexe le tout, et Kibana l'expose dans un tableau de bord de huit panneaux. Le tout tient dans 16 Go, grâce à une exécution strictement séquentielle.</w:t>
+      </w:r>
+    </w:p>
+    <w:p>
+      <w:pPr>
+        <w:spacing w:after="100" w:line="264"/>
+        <w:jc w:val="both"/>
+      </w:pPr>
+      <w:r>
+        <w:rPr>
+          <w:rFonts w:ascii="Cambria" w:cs="Cambria" w:eastAsia="Cambria" w:hAnsi="Cambria"/>
+          <w:b w:val="false"/>
+          <w:bCs w:val="false"/>
+          <w:i w:val="false"/>
+          <w:iCs w:val="false"/>
+          <w:color w:val="000000"/>
+          <w:sz w:val="20"/>
+          <w:szCs w:val="20"/>
+        </w:rPr>
+        <w:t xml:space="preserve">Sur l'exécution de référence, les 149 300 lignes de commande sont identiques aux quatre étapes. L'écart entre commandes générées et documents extraits est intégralement expliqué. Et le chiffre d'affaires calculé par Spark est retrouvé au centime par Elasticsearch.</w:t>
       </w:r>
     </w:p>
     <w:p>
@@ -16798,13 +16367,13 @@
     </w:lvlOverride>
   </w:num>
   <w:num w:numId="2">
-    <w:abstractNumId w:val="2"/>
+    <w:abstractNumId w:val="3"/>
     <w:lvlOverride w:ilvl="0">
       <w:startOverride w:val="1"/>
     </w:lvlOverride>
   </w:num>
   <w:num w:numId="3">
-    <w:abstractNumId w:val="3"/>
+    <w:abstractNumId w:val="2"/>
     <w:lvlOverride w:ilvl="0">
       <w:startOverride w:val="1"/>
     </w:lvlOverride>

</xml_diff>